<commit_message>
Revise worksheet: per-part headers, dashed cut lines, answer key in red
- Each part now has its own Activity Name, Name, Grade & Section, Date
- Dashed lines between columns serve as cut guides
- Answer key (page 2) = same blank layout with answers in red
- Single-step instructions preserved
</commit_message>
<xml_diff>
--- a/kinematics-worksheet-4.docx
+++ b/kinematics-worksheet-4.docx
@@ -2,88 +2,6 @@
 <file path=word/document.xml><?xml version="1.0" encoding="utf-8"?>
 <w:document xmlns:wpc="http://schemas.microsoft.com/office/word/2010/wordprocessingCanvas" xmlns:mo="http://schemas.microsoft.com/office/mac/office/2008/main" xmlns:mc="http://schemas.openxmlformats.org/markup-compatibility/2006" xmlns:mv="urn:schemas-microsoft-com:mac:vml" xmlns:o="urn:schemas-microsoft-com:office:office" xmlns:r="http://schemas.openxmlformats.org/officeDocument/2006/relationships" xmlns:m="http://schemas.openxmlformats.org/officeDocument/2006/math" xmlns:v="urn:schemas-microsoft-com:vml" xmlns:wp14="http://schemas.microsoft.com/office/word/2010/wordprocessingDrawing" xmlns:wp="http://schemas.openxmlformats.org/drawingml/2006/wordprocessingDrawing" xmlns:w10="urn:schemas-microsoft-com:office:word" xmlns:w="http://schemas.openxmlformats.org/wordprocessingml/2006/main" xmlns:w14="http://schemas.microsoft.com/office/word/2010/wordml" xmlns:wpg="http://schemas.microsoft.com/office/word/2010/wordprocessingGroup" xmlns:wpi="http://schemas.microsoft.com/office/word/2010/wordprocessingInk" xmlns:wne="http://schemas.microsoft.com/office/word/2006/wordml" xmlns:wps="http://schemas.microsoft.com/office/word/2010/wordprocessingShape" mc:Ignorable="w14 wp14">
   <w:body>
-    <w:p>
-      <w:pPr>
-        <w:spacing w:before="0" w:after="20"/>
-        <w:jc w:val="center"/>
-      </w:pPr>
-      <w:r>
-        <w:rPr>
-          <w:rFonts w:ascii="Calibri" w:hAnsi="Calibri"/>
-          <w:b/>
-          <w:i w:val="0"/>
-          <w:color w:val="2D2D2D"/>
-          <w:sz w:val="26"/>
-        </w:rPr>
-        <w:t>GUIDED DERIVATION OF KINEMATIC EQUATIONS</w:t>
-      </w:r>
-    </w:p>
-    <w:p>
-      <w:pPr>
-        <w:spacing w:before="0" w:after="80"/>
-        <w:jc w:val="left"/>
-      </w:pPr>
-      <w:r>
-        <w:rPr>
-          <w:rFonts w:ascii="Calibri" w:hAnsi="Calibri"/>
-          <w:b/>
-          <w:i w:val="0"/>
-          <w:color w:val="505050"/>
-          <w:sz w:val="17"/>
-        </w:rPr>
-        <w:t xml:space="preserve">Name: </w:t>
-      </w:r>
-      <w:r>
-        <w:rPr>
-          <w:rFonts w:ascii="Calibri" w:hAnsi="Calibri"/>
-          <w:b w:val="0"/>
-          <w:i w:val="0"/>
-          <w:color w:val="969696"/>
-          <w:sz w:val="17"/>
-        </w:rPr>
-        <w:t xml:space="preserve">________________________________________     </w:t>
-      </w:r>
-      <w:r>
-        <w:rPr>
-          <w:rFonts w:ascii="Calibri" w:hAnsi="Calibri"/>
-          <w:b/>
-          <w:i w:val="0"/>
-          <w:color w:val="505050"/>
-          <w:sz w:val="17"/>
-        </w:rPr>
-        <w:t xml:space="preserve">Grade &amp; Section: </w:t>
-      </w:r>
-      <w:r>
-        <w:rPr>
-          <w:rFonts w:ascii="Calibri" w:hAnsi="Calibri"/>
-          <w:b w:val="0"/>
-          <w:i w:val="0"/>
-          <w:color w:val="969696"/>
-          <w:sz w:val="17"/>
-        </w:rPr>
-        <w:t xml:space="preserve">______________     </w:t>
-      </w:r>
-      <w:r>
-        <w:rPr>
-          <w:rFonts w:ascii="Calibri" w:hAnsi="Calibri"/>
-          <w:b/>
-          <w:i w:val="0"/>
-          <w:color w:val="505050"/>
-          <w:sz w:val="17"/>
-        </w:rPr>
-        <w:t xml:space="preserve">Date: </w:t>
-      </w:r>
-      <w:r>
-        <w:rPr>
-          <w:rFonts w:ascii="Calibri" w:hAnsi="Calibri"/>
-          <w:b w:val="0"/>
-          <w:i w:val="0"/>
-          <w:color w:val="969696"/>
-          <w:sz w:val="17"/>
-        </w:rPr>
-        <w:t>___________</w:t>
-      </w:r>
-    </w:p>
     <w:tbl>
       <w:tblPr>
         <w:tblW w:type="auto" w:w="0"/>
@@ -99,29 +17,29 @@
         </w:tblBorders>
       </w:tblPr>
       <w:tblGrid>
-        <w:gridCol w:w="4392"/>
-        <w:gridCol w:w="4392"/>
-        <w:gridCol w:w="4392"/>
-        <w:gridCol w:w="4392"/>
+        <w:gridCol w:w="4464"/>
+        <w:gridCol w:w="4464"/>
+        <w:gridCol w:w="4464"/>
+        <w:gridCol w:w="4464"/>
       </w:tblGrid>
       <w:tr>
         <w:tc>
           <w:tcPr>
-            <w:tcW w:type="dxa" w:w="4320"/>
+            <w:tcW w:type="dxa" w:w="4464"/>
             <w:vAlign w:val="top"/>
             <w:tcMar>
-              <w:top w:w="40" w:type="dxa"/>
-              <w:bottom w:w="40" w:type="dxa"/>
-              <w:left w:w="80" w:type="dxa"/>
-              <w:right w:w="80" w:type="dxa"/>
+              <w:top w:w="50" w:type="dxa"/>
+              <w:bottom w:w="30" w:type="dxa"/>
+              <w:left w:w="90" w:type="dxa"/>
+              <w:right w:w="90" w:type="dxa"/>
             </w:tcMar>
             <w:tcBorders>
-              <w:right w:val="single" w:sz="4" w:color="BBBBBB"/>
+              <w:right w:val="dashed" w:sz="6" w:color="888888" w:space="0"/>
             </w:tcBorders>
           </w:tcPr>
           <w:p>
             <w:pPr>
-              <w:spacing w:before="0" w:after="40"/>
+              <w:spacing w:before="0" w:after="20"/>
               <w:jc w:val="center"/>
               <w:shd w:val="clear" w:color="auto" w:fill="3D3D3D"/>
             </w:pPr>
@@ -131,32 +49,138 @@
                 <w:b/>
                 <w:i w:val="0"/>
                 <w:color w:val="FFFFFF"/>
-                <w:sz w:val="19"/>
+                <w:sz w:val="17"/>
               </w:rPr>
-              <w:t>PART A</w:t>
+              <w:t xml:space="preserve">  PART A: Deriving Kinematic Equation 1  </w:t>
             </w:r>
           </w:p>
           <w:p>
             <w:pPr>
-              <w:spacing w:before="40" w:after="20"/>
-              <w:jc w:val="center"/>
+              <w:spacing w:before="80" w:after="20"/>
             </w:pPr>
             <w:r>
               <w:rPr>
                 <w:rFonts w:ascii="Calibri" w:hAnsi="Calibri"/>
                 <w:b/>
                 <w:i w:val="0"/>
-                <w:color w:val="323232"/>
-                <w:sz w:val="16"/>
+                <w:color w:val="505050"/>
+                <w:sz w:val="15"/>
               </w:rPr>
-              <w:t>Deriving Kinematic Equation 1</w:t>
+              <w:t xml:space="preserve">Activity: </w:t>
+            </w:r>
+            <w:r>
+              <w:rPr>
+                <w:rFonts w:ascii="Calibri" w:hAnsi="Calibri"/>
+                <w:b w:val="0"/>
+                <w:i w:val="0"/>
+                <w:color w:val="3C3C3C"/>
+                <w:sz w:val="15"/>
+              </w:rPr>
+              <w:t>Guided Derivation of Kinematic Equations</w:t>
+            </w:r>
+          </w:p>
+          <w:p>
+            <w:pPr>
+              <w:spacing w:before="20" w:after="20"/>
+            </w:pPr>
+            <w:r>
+              <w:rPr>
+                <w:rFonts w:ascii="Calibri" w:hAnsi="Calibri"/>
+                <w:b/>
+                <w:i w:val="0"/>
+                <w:color w:val="505050"/>
+                <w:sz w:val="15"/>
+              </w:rPr>
+              <w:t xml:space="preserve">Name: </w:t>
+            </w:r>
+            <w:r>
+              <w:rPr>
+                <w:rFonts w:ascii="Calibri" w:hAnsi="Calibri"/>
+                <w:b w:val="0"/>
+                <w:i w:val="0"/>
+                <w:color w:val="AAAAAA"/>
+                <w:sz w:val="15"/>
+              </w:rPr>
+              <w:t>______________________________________</w:t>
+            </w:r>
+          </w:p>
+          <w:p>
+            <w:pPr>
+              <w:spacing w:before="20" w:after="60"/>
+            </w:pPr>
+            <w:r>
+              <w:rPr>
+                <w:rFonts w:ascii="Calibri" w:hAnsi="Calibri"/>
+                <w:b/>
+                <w:i w:val="0"/>
+                <w:color w:val="505050"/>
+                <w:sz w:val="15"/>
+              </w:rPr>
+              <w:t xml:space="preserve">Grade &amp; Section: </w:t>
+            </w:r>
+            <w:r>
+              <w:rPr>
+                <w:rFonts w:ascii="Calibri" w:hAnsi="Calibri"/>
+                <w:b w:val="0"/>
+                <w:i w:val="0"/>
+                <w:color w:val="AAAAAA"/>
+                <w:sz w:val="15"/>
+              </w:rPr>
+              <w:t xml:space="preserve">_____________  </w:t>
+            </w:r>
+            <w:r>
+              <w:rPr>
+                <w:rFonts w:ascii="Calibri" w:hAnsi="Calibri"/>
+                <w:b/>
+                <w:i w:val="0"/>
+                <w:color w:val="505050"/>
+                <w:sz w:val="15"/>
+              </w:rPr>
+              <w:t xml:space="preserve">Date: </w:t>
+            </w:r>
+            <w:r>
+              <w:rPr>
+                <w:rFonts w:ascii="Calibri" w:hAnsi="Calibri"/>
+                <w:b w:val="0"/>
+                <w:i w:val="0"/>
+                <w:color w:val="AAAAAA"/>
+                <w:sz w:val="15"/>
+              </w:rPr>
+              <w:t>___________</w:t>
+            </w:r>
+          </w:p>
+          <w:p>
+            <w:pPr>
+              <w:spacing w:before="0" w:after="60"/>
+              <w:jc w:val="center"/>
+            </w:pPr>
+            <w:r>
+              <w:rPr>
+                <w:rFonts w:ascii="Calibri" w:hAnsi="Calibri"/>
+                <w:b w:val="0"/>
+                <w:i w:val="0"/>
+                <w:color w:val="BEBEBE"/>
+                <w:sz w:val="12"/>
+              </w:rPr>
+              <w:t>──────────────────────────────────────────</w:t>
             </w:r>
           </w:p>
           <w:p>
             <w:pPr>
               <w:spacing w:before="20" w:after="80"/>
               <w:jc w:val="center"/>
+              <w:shd w:val="clear" w:color="auto" w:fill="F0F0F0"/>
             </w:pPr>
+            <w:r>
+              <w:rPr>
+                <w:rFonts w:ascii="Calibri" w:hAnsi="Calibri"/>
+                <w:b/>
+                <w:i w:val="0"/>
+                <w:color w:val="646464"/>
+                <w:sz w:val="15"/>
+              </w:rPr>
+              <w:t xml:space="preserve"> GOAL:  </w:t>
+            </w:r>
             <w:r>
               <w:rPr>
                 <w:rFonts w:ascii="Calibri" w:hAnsi="Calibri"/>
@@ -165,7 +189,7 @@
                 <w:color w:val="646464"/>
                 <w:sz w:val="15"/>
               </w:rPr>
-              <w:t xml:space="preserve">GOAL:  Derive  </w:t>
+              <w:t xml:space="preserve">Derive  </w:t>
             </w:r>
             <w:r>
               <w:rPr>
@@ -173,9 +197,18 @@
                 <w:b/>
                 <w:i/>
                 <w:color w:val="282828"/>
-                <w:sz w:val="17"/>
+                <w:sz w:val="18"/>
               </w:rPr>
               <w:t>v = v₀ + at</w:t>
+            </w:r>
+            <w:r>
+              <w:rPr>
+                <w:rFonts w:ascii="Calibri" w:hAnsi="Calibri"/>
+                <w:b w:val="0"/>
+                <w:i w:val="0"/>
+                <w:sz w:val="15"/>
+              </w:rPr>
+              <w:t xml:space="preserve"> </w:t>
             </w:r>
           </w:p>
           <w:p>
@@ -205,14 +238,14 @@
           </w:p>
           <w:p>
             <w:pPr>
-              <w:spacing w:before="0" w:after="0"/>
+              <w:spacing w:before="0" w:after="80"/>
             </w:pPr>
             <w:r>
               <w:rPr>
                 <w:rFonts w:ascii="Calibri" w:hAnsi="Calibri"/>
                 <w:b w:val="0"/>
                 <w:i w:val="0"/>
-                <w:sz w:val="32"/>
+                <w:sz w:val="28"/>
               </w:rPr>
             </w:r>
           </w:p>
@@ -243,14 +276,14 @@
           </w:p>
           <w:p>
             <w:pPr>
-              <w:spacing w:before="0" w:after="0"/>
+              <w:spacing w:before="0" w:after="80"/>
             </w:pPr>
             <w:r>
               <w:rPr>
                 <w:rFonts w:ascii="Calibri" w:hAnsi="Calibri"/>
                 <w:b w:val="0"/>
                 <w:i w:val="0"/>
-                <w:sz w:val="32"/>
+                <w:sz w:val="28"/>
               </w:rPr>
             </w:r>
           </w:p>
@@ -281,14 +314,14 @@
           </w:p>
           <w:p>
             <w:pPr>
-              <w:spacing w:before="0" w:after="0"/>
+              <w:spacing w:before="0" w:after="80"/>
             </w:pPr>
             <w:r>
               <w:rPr>
                 <w:rFonts w:ascii="Calibri" w:hAnsi="Calibri"/>
                 <w:b w:val="0"/>
                 <w:i w:val="0"/>
-                <w:sz w:val="32"/>
+                <w:sz w:val="28"/>
               </w:rPr>
             </w:r>
           </w:p>
@@ -319,35 +352,35 @@
           </w:p>
           <w:p>
             <w:pPr>
-              <w:spacing w:before="0" w:after="0"/>
+              <w:spacing w:before="0" w:after="80"/>
             </w:pPr>
             <w:r>
               <w:rPr>
                 <w:rFonts w:ascii="Calibri" w:hAnsi="Calibri"/>
                 <w:b w:val="0"/>
                 <w:i w:val="0"/>
-                <w:sz w:val="32"/>
+                <w:sz w:val="28"/>
               </w:rPr>
             </w:r>
           </w:p>
         </w:tc>
         <w:tc>
           <w:tcPr>
-            <w:tcW w:type="dxa" w:w="4320"/>
+            <w:tcW w:type="dxa" w:w="4464"/>
             <w:vAlign w:val="top"/>
             <w:tcMar>
-              <w:top w:w="40" w:type="dxa"/>
-              <w:bottom w:w="40" w:type="dxa"/>
-              <w:left w:w="80" w:type="dxa"/>
-              <w:right w:w="80" w:type="dxa"/>
+              <w:top w:w="50" w:type="dxa"/>
+              <w:bottom w:w="30" w:type="dxa"/>
+              <w:left w:w="90" w:type="dxa"/>
+              <w:right w:w="90" w:type="dxa"/>
             </w:tcMar>
             <w:tcBorders>
-              <w:right w:val="single" w:sz="4" w:color="BBBBBB"/>
+              <w:right w:val="dashed" w:sz="6" w:color="888888" w:space="0"/>
             </w:tcBorders>
           </w:tcPr>
           <w:p>
             <w:pPr>
-              <w:spacing w:before="0" w:after="40"/>
+              <w:spacing w:before="0" w:after="20"/>
               <w:jc w:val="center"/>
               <w:shd w:val="clear" w:color="auto" w:fill="3D3D3D"/>
             </w:pPr>
@@ -357,32 +390,138 @@
                 <w:b/>
                 <w:i w:val="0"/>
                 <w:color w:val="FFFFFF"/>
-                <w:sz w:val="19"/>
+                <w:sz w:val="17"/>
               </w:rPr>
-              <w:t>PART B</w:t>
+              <w:t xml:space="preserve">  PART B: Deriving Kinematic Equation 4  </w:t>
             </w:r>
           </w:p>
           <w:p>
             <w:pPr>
-              <w:spacing w:before="40" w:after="20"/>
-              <w:jc w:val="center"/>
+              <w:spacing w:before="80" w:after="20"/>
             </w:pPr>
             <w:r>
               <w:rPr>
                 <w:rFonts w:ascii="Calibri" w:hAnsi="Calibri"/>
                 <w:b/>
                 <w:i w:val="0"/>
-                <w:color w:val="323232"/>
-                <w:sz w:val="16"/>
+                <w:color w:val="505050"/>
+                <w:sz w:val="15"/>
               </w:rPr>
-              <w:t>Deriving Kinematic Equation 4</w:t>
+              <w:t xml:space="preserve">Activity: </w:t>
+            </w:r>
+            <w:r>
+              <w:rPr>
+                <w:rFonts w:ascii="Calibri" w:hAnsi="Calibri"/>
+                <w:b w:val="0"/>
+                <w:i w:val="0"/>
+                <w:color w:val="3C3C3C"/>
+                <w:sz w:val="15"/>
+              </w:rPr>
+              <w:t>Guided Derivation of Kinematic Equations</w:t>
+            </w:r>
+          </w:p>
+          <w:p>
+            <w:pPr>
+              <w:spacing w:before="20" w:after="20"/>
+            </w:pPr>
+            <w:r>
+              <w:rPr>
+                <w:rFonts w:ascii="Calibri" w:hAnsi="Calibri"/>
+                <w:b/>
+                <w:i w:val="0"/>
+                <w:color w:val="505050"/>
+                <w:sz w:val="15"/>
+              </w:rPr>
+              <w:t xml:space="preserve">Name: </w:t>
+            </w:r>
+            <w:r>
+              <w:rPr>
+                <w:rFonts w:ascii="Calibri" w:hAnsi="Calibri"/>
+                <w:b w:val="0"/>
+                <w:i w:val="0"/>
+                <w:color w:val="AAAAAA"/>
+                <w:sz w:val="15"/>
+              </w:rPr>
+              <w:t>______________________________________</w:t>
+            </w:r>
+          </w:p>
+          <w:p>
+            <w:pPr>
+              <w:spacing w:before="20" w:after="60"/>
+            </w:pPr>
+            <w:r>
+              <w:rPr>
+                <w:rFonts w:ascii="Calibri" w:hAnsi="Calibri"/>
+                <w:b/>
+                <w:i w:val="0"/>
+                <w:color w:val="505050"/>
+                <w:sz w:val="15"/>
+              </w:rPr>
+              <w:t xml:space="preserve">Grade &amp; Section: </w:t>
+            </w:r>
+            <w:r>
+              <w:rPr>
+                <w:rFonts w:ascii="Calibri" w:hAnsi="Calibri"/>
+                <w:b w:val="0"/>
+                <w:i w:val="0"/>
+                <w:color w:val="AAAAAA"/>
+                <w:sz w:val="15"/>
+              </w:rPr>
+              <w:t xml:space="preserve">_____________  </w:t>
+            </w:r>
+            <w:r>
+              <w:rPr>
+                <w:rFonts w:ascii="Calibri" w:hAnsi="Calibri"/>
+                <w:b/>
+                <w:i w:val="0"/>
+                <w:color w:val="505050"/>
+                <w:sz w:val="15"/>
+              </w:rPr>
+              <w:t xml:space="preserve">Date: </w:t>
+            </w:r>
+            <w:r>
+              <w:rPr>
+                <w:rFonts w:ascii="Calibri" w:hAnsi="Calibri"/>
+                <w:b w:val="0"/>
+                <w:i w:val="0"/>
+                <w:color w:val="AAAAAA"/>
+                <w:sz w:val="15"/>
+              </w:rPr>
+              <w:t>___________</w:t>
+            </w:r>
+          </w:p>
+          <w:p>
+            <w:pPr>
+              <w:spacing w:before="0" w:after="60"/>
+              <w:jc w:val="center"/>
+            </w:pPr>
+            <w:r>
+              <w:rPr>
+                <w:rFonts w:ascii="Calibri" w:hAnsi="Calibri"/>
+                <w:b w:val="0"/>
+                <w:i w:val="0"/>
+                <w:color w:val="BEBEBE"/>
+                <w:sz w:val="12"/>
+              </w:rPr>
+              <w:t>──────────────────────────────────────────</w:t>
             </w:r>
           </w:p>
           <w:p>
             <w:pPr>
               <w:spacing w:before="20" w:after="80"/>
               <w:jc w:val="center"/>
+              <w:shd w:val="clear" w:color="auto" w:fill="F0F0F0"/>
             </w:pPr>
+            <w:r>
+              <w:rPr>
+                <w:rFonts w:ascii="Calibri" w:hAnsi="Calibri"/>
+                <w:b/>
+                <w:i w:val="0"/>
+                <w:color w:val="646464"/>
+                <w:sz w:val="15"/>
+              </w:rPr>
+              <w:t xml:space="preserve"> GOAL:  </w:t>
+            </w:r>
             <w:r>
               <w:rPr>
                 <w:rFonts w:ascii="Calibri" w:hAnsi="Calibri"/>
@@ -391,7 +530,7 @@
                 <w:color w:val="646464"/>
                 <w:sz w:val="15"/>
               </w:rPr>
-              <w:t xml:space="preserve">GOAL:  Derive  </w:t>
+              <w:t xml:space="preserve">Derive  </w:t>
             </w:r>
             <w:r>
               <w:rPr>
@@ -399,9 +538,18 @@
                 <w:b/>
                 <w:i/>
                 <w:color w:val="282828"/>
-                <w:sz w:val="17"/>
+                <w:sz w:val="18"/>
               </w:rPr>
               <w:t>x = x₀ + ½(v₀ + v)t</w:t>
+            </w:r>
+            <w:r>
+              <w:rPr>
+                <w:rFonts w:ascii="Calibri" w:hAnsi="Calibri"/>
+                <w:b w:val="0"/>
+                <w:i w:val="0"/>
+                <w:sz w:val="15"/>
+              </w:rPr>
+              <w:t xml:space="preserve"> </w:t>
             </w:r>
           </w:p>
           <w:p>
@@ -426,19 +574,19 @@
                 <w:color w:val="323232"/>
                 <w:sz w:val="15"/>
               </w:rPr>
-              <w:t>Average velocity is defined as total displacement over total time. Write the definition as a formula.</w:t>
+              <w:t>Average velocity is defined as total displacement over total time. Write the definition as a formula using v̄, Δx, and Δt.</w:t>
             </w:r>
           </w:p>
           <w:p>
             <w:pPr>
-              <w:spacing w:before="0" w:after="0"/>
+              <w:spacing w:before="0" w:after="80"/>
             </w:pPr>
             <w:r>
               <w:rPr>
                 <w:rFonts w:ascii="Calibri" w:hAnsi="Calibri"/>
                 <w:b w:val="0"/>
                 <w:i w:val="0"/>
-                <w:sz w:val="32"/>
+                <w:sz w:val="28"/>
               </w:rPr>
             </w:r>
           </w:p>
@@ -469,14 +617,14 @@
           </w:p>
           <w:p>
             <w:pPr>
-              <w:spacing w:before="0" w:after="0"/>
+              <w:spacing w:before="0" w:after="80"/>
             </w:pPr>
             <w:r>
               <w:rPr>
                 <w:rFonts w:ascii="Calibri" w:hAnsi="Calibri"/>
                 <w:b w:val="0"/>
                 <w:i w:val="0"/>
-                <w:sz w:val="32"/>
+                <w:sz w:val="28"/>
               </w:rPr>
             </w:r>
           </w:p>
@@ -502,19 +650,19 @@
                 <w:color w:val="323232"/>
                 <w:sz w:val="15"/>
               </w:rPr>
-              <w:t>Multiply both sides of your equation by t to clear the denominator.</w:t>
+              <w:t>Multiply both sides of your equation by t to clear the denominator. Write the result.</w:t>
             </w:r>
           </w:p>
           <w:p>
             <w:pPr>
-              <w:spacing w:before="0" w:after="0"/>
+              <w:spacing w:before="0" w:after="80"/>
             </w:pPr>
             <w:r>
               <w:rPr>
                 <w:rFonts w:ascii="Calibri" w:hAnsi="Calibri"/>
                 <w:b w:val="0"/>
                 <w:i w:val="0"/>
-                <w:sz w:val="32"/>
+                <w:sz w:val="28"/>
               </w:rPr>
             </w:r>
           </w:p>
@@ -545,14 +693,14 @@
           </w:p>
           <w:p>
             <w:pPr>
-              <w:spacing w:before="0" w:after="0"/>
+              <w:spacing w:before="0" w:after="80"/>
             </w:pPr>
             <w:r>
               <w:rPr>
                 <w:rFonts w:ascii="Calibri" w:hAnsi="Calibri"/>
                 <w:b w:val="0"/>
                 <w:i w:val="0"/>
-                <w:sz w:val="32"/>
+                <w:sz w:val="28"/>
               </w:rPr>
             </w:r>
           </w:p>
@@ -583,14 +731,14 @@
           </w:p>
           <w:p>
             <w:pPr>
-              <w:spacing w:before="0" w:after="0"/>
+              <w:spacing w:before="0" w:after="80"/>
             </w:pPr>
             <w:r>
               <w:rPr>
                 <w:rFonts w:ascii="Calibri" w:hAnsi="Calibri"/>
                 <w:b w:val="0"/>
                 <w:i w:val="0"/>
-                <w:sz w:val="32"/>
+                <w:sz w:val="28"/>
               </w:rPr>
             </w:r>
           </w:p>
@@ -621,35 +769,35 @@
           </w:p>
           <w:p>
             <w:pPr>
-              <w:spacing w:before="0" w:after="0"/>
+              <w:spacing w:before="0" w:after="80"/>
             </w:pPr>
             <w:r>
               <w:rPr>
                 <w:rFonts w:ascii="Calibri" w:hAnsi="Calibri"/>
                 <w:b w:val="0"/>
                 <w:i w:val="0"/>
-                <w:sz w:val="32"/>
+                <w:sz w:val="28"/>
               </w:rPr>
             </w:r>
           </w:p>
         </w:tc>
         <w:tc>
           <w:tcPr>
-            <w:tcW w:type="dxa" w:w="4320"/>
+            <w:tcW w:type="dxa" w:w="4464"/>
             <w:vAlign w:val="top"/>
             <w:tcMar>
-              <w:top w:w="40" w:type="dxa"/>
-              <w:bottom w:w="40" w:type="dxa"/>
-              <w:left w:w="80" w:type="dxa"/>
-              <w:right w:w="80" w:type="dxa"/>
+              <w:top w:w="50" w:type="dxa"/>
+              <w:bottom w:w="30" w:type="dxa"/>
+              <w:left w:w="90" w:type="dxa"/>
+              <w:right w:w="90" w:type="dxa"/>
             </w:tcMar>
             <w:tcBorders>
-              <w:right w:val="single" w:sz="4" w:color="BBBBBB"/>
+              <w:right w:val="dashed" w:sz="6" w:color="888888" w:space="0"/>
             </w:tcBorders>
           </w:tcPr>
           <w:p>
             <w:pPr>
-              <w:spacing w:before="0" w:after="40"/>
+              <w:spacing w:before="0" w:after="20"/>
               <w:jc w:val="center"/>
               <w:shd w:val="clear" w:color="auto" w:fill="3D3D3D"/>
             </w:pPr>
@@ -659,32 +807,138 @@
                 <w:b/>
                 <w:i w:val="0"/>
                 <w:color w:val="FFFFFF"/>
-                <w:sz w:val="19"/>
+                <w:sz w:val="17"/>
               </w:rPr>
-              <w:t>PART C</w:t>
+              <w:t xml:space="preserve">  PART C: Deriving Kinematic Equation 2  </w:t>
             </w:r>
           </w:p>
           <w:p>
             <w:pPr>
-              <w:spacing w:before="40" w:after="20"/>
-              <w:jc w:val="center"/>
+              <w:spacing w:before="80" w:after="20"/>
             </w:pPr>
             <w:r>
               <w:rPr>
                 <w:rFonts w:ascii="Calibri" w:hAnsi="Calibri"/>
                 <w:b/>
                 <w:i w:val="0"/>
-                <w:color w:val="323232"/>
-                <w:sz w:val="16"/>
+                <w:color w:val="505050"/>
+                <w:sz w:val="15"/>
               </w:rPr>
-              <w:t>Deriving Kinematic Equation 2</w:t>
+              <w:t xml:space="preserve">Activity: </w:t>
+            </w:r>
+            <w:r>
+              <w:rPr>
+                <w:rFonts w:ascii="Calibri" w:hAnsi="Calibri"/>
+                <w:b w:val="0"/>
+                <w:i w:val="0"/>
+                <w:color w:val="3C3C3C"/>
+                <w:sz w:val="15"/>
+              </w:rPr>
+              <w:t>Guided Derivation of Kinematic Equations</w:t>
+            </w:r>
+          </w:p>
+          <w:p>
+            <w:pPr>
+              <w:spacing w:before="20" w:after="20"/>
+            </w:pPr>
+            <w:r>
+              <w:rPr>
+                <w:rFonts w:ascii="Calibri" w:hAnsi="Calibri"/>
+                <w:b/>
+                <w:i w:val="0"/>
+                <w:color w:val="505050"/>
+                <w:sz w:val="15"/>
+              </w:rPr>
+              <w:t xml:space="preserve">Name: </w:t>
+            </w:r>
+            <w:r>
+              <w:rPr>
+                <w:rFonts w:ascii="Calibri" w:hAnsi="Calibri"/>
+                <w:b w:val="0"/>
+                <w:i w:val="0"/>
+                <w:color w:val="AAAAAA"/>
+                <w:sz w:val="15"/>
+              </w:rPr>
+              <w:t>______________________________________</w:t>
+            </w:r>
+          </w:p>
+          <w:p>
+            <w:pPr>
+              <w:spacing w:before="20" w:after="60"/>
+            </w:pPr>
+            <w:r>
+              <w:rPr>
+                <w:rFonts w:ascii="Calibri" w:hAnsi="Calibri"/>
+                <w:b/>
+                <w:i w:val="0"/>
+                <w:color w:val="505050"/>
+                <w:sz w:val="15"/>
+              </w:rPr>
+              <w:t xml:space="preserve">Grade &amp; Section: </w:t>
+            </w:r>
+            <w:r>
+              <w:rPr>
+                <w:rFonts w:ascii="Calibri" w:hAnsi="Calibri"/>
+                <w:b w:val="0"/>
+                <w:i w:val="0"/>
+                <w:color w:val="AAAAAA"/>
+                <w:sz w:val="15"/>
+              </w:rPr>
+              <w:t xml:space="preserve">_____________  </w:t>
+            </w:r>
+            <w:r>
+              <w:rPr>
+                <w:rFonts w:ascii="Calibri" w:hAnsi="Calibri"/>
+                <w:b/>
+                <w:i w:val="0"/>
+                <w:color w:val="505050"/>
+                <w:sz w:val="15"/>
+              </w:rPr>
+              <w:t xml:space="preserve">Date: </w:t>
+            </w:r>
+            <w:r>
+              <w:rPr>
+                <w:rFonts w:ascii="Calibri" w:hAnsi="Calibri"/>
+                <w:b w:val="0"/>
+                <w:i w:val="0"/>
+                <w:color w:val="AAAAAA"/>
+                <w:sz w:val="15"/>
+              </w:rPr>
+              <w:t>___________</w:t>
+            </w:r>
+          </w:p>
+          <w:p>
+            <w:pPr>
+              <w:spacing w:before="0" w:after="60"/>
+              <w:jc w:val="center"/>
+            </w:pPr>
+            <w:r>
+              <w:rPr>
+                <w:rFonts w:ascii="Calibri" w:hAnsi="Calibri"/>
+                <w:b w:val="0"/>
+                <w:i w:val="0"/>
+                <w:color w:val="BEBEBE"/>
+                <w:sz w:val="12"/>
+              </w:rPr>
+              <w:t>──────────────────────────────────────────</w:t>
             </w:r>
           </w:p>
           <w:p>
             <w:pPr>
               <w:spacing w:before="20" w:after="80"/>
               <w:jc w:val="center"/>
+              <w:shd w:val="clear" w:color="auto" w:fill="F0F0F0"/>
             </w:pPr>
+            <w:r>
+              <w:rPr>
+                <w:rFonts w:ascii="Calibri" w:hAnsi="Calibri"/>
+                <w:b/>
+                <w:i w:val="0"/>
+                <w:color w:val="646464"/>
+                <w:sz w:val="15"/>
+              </w:rPr>
+              <w:t xml:space="preserve"> GOAL:  </w:t>
+            </w:r>
             <w:r>
               <w:rPr>
                 <w:rFonts w:ascii="Calibri" w:hAnsi="Calibri"/>
@@ -693,7 +947,7 @@
                 <w:color w:val="646464"/>
                 <w:sz w:val="15"/>
               </w:rPr>
-              <w:t xml:space="preserve">GOAL:  Derive  </w:t>
+              <w:t xml:space="preserve">Derive  </w:t>
             </w:r>
             <w:r>
               <w:rPr>
@@ -701,9 +955,18 @@
                 <w:b/>
                 <w:i/>
                 <w:color w:val="282828"/>
-                <w:sz w:val="17"/>
+                <w:sz w:val="18"/>
               </w:rPr>
               <w:t>x = x₀ + v₀t + ½at²</w:t>
+            </w:r>
+            <w:r>
+              <w:rPr>
+                <w:rFonts w:ascii="Calibri" w:hAnsi="Calibri"/>
+                <w:b w:val="0"/>
+                <w:i w:val="0"/>
+                <w:sz w:val="15"/>
+              </w:rPr>
+              <w:t xml:space="preserve"> </w:t>
             </w:r>
           </w:p>
           <w:p>
@@ -733,14 +996,14 @@
           </w:p>
           <w:p>
             <w:pPr>
-              <w:spacing w:before="0" w:after="0"/>
+              <w:spacing w:before="0" w:after="80"/>
             </w:pPr>
             <w:r>
               <w:rPr>
                 <w:rFonts w:ascii="Calibri" w:hAnsi="Calibri"/>
                 <w:b w:val="0"/>
                 <w:i w:val="0"/>
-                <w:sz w:val="32"/>
+                <w:sz w:val="28"/>
               </w:rPr>
             </w:r>
           </w:p>
@@ -771,14 +1034,14 @@
           </w:p>
           <w:p>
             <w:pPr>
-              <w:spacing w:before="0" w:after="0"/>
+              <w:spacing w:before="0" w:after="80"/>
             </w:pPr>
             <w:r>
               <w:rPr>
                 <w:rFonts w:ascii="Calibri" w:hAnsi="Calibri"/>
                 <w:b w:val="0"/>
                 <w:i w:val="0"/>
-                <w:sz w:val="32"/>
+                <w:sz w:val="28"/>
               </w:rPr>
             </w:r>
           </w:p>
@@ -809,14 +1072,14 @@
           </w:p>
           <w:p>
             <w:pPr>
-              <w:spacing w:before="0" w:after="0"/>
+              <w:spacing w:before="0" w:after="80"/>
             </w:pPr>
             <w:r>
               <w:rPr>
                 <w:rFonts w:ascii="Calibri" w:hAnsi="Calibri"/>
                 <w:b w:val="0"/>
                 <w:i w:val="0"/>
-                <w:sz w:val="32"/>
+                <w:sz w:val="28"/>
               </w:rPr>
             </w:r>
           </w:p>
@@ -847,14 +1110,14 @@
           </w:p>
           <w:p>
             <w:pPr>
-              <w:spacing w:before="0" w:after="0"/>
+              <w:spacing w:before="0" w:after="80"/>
             </w:pPr>
             <w:r>
               <w:rPr>
                 <w:rFonts w:ascii="Calibri" w:hAnsi="Calibri"/>
                 <w:b w:val="0"/>
                 <w:i w:val="0"/>
-                <w:sz w:val="32"/>
+                <w:sz w:val="28"/>
               </w:rPr>
             </w:r>
           </w:p>
@@ -885,14 +1148,14 @@
           </w:p>
           <w:p>
             <w:pPr>
-              <w:spacing w:before="0" w:after="0"/>
+              <w:spacing w:before="0" w:after="80"/>
             </w:pPr>
             <w:r>
               <w:rPr>
                 <w:rFonts w:ascii="Calibri" w:hAnsi="Calibri"/>
                 <w:b w:val="0"/>
                 <w:i w:val="0"/>
-                <w:sz w:val="32"/>
+                <w:sz w:val="28"/>
               </w:rPr>
             </w:r>
           </w:p>
@@ -923,32 +1186,32 @@
           </w:p>
           <w:p>
             <w:pPr>
-              <w:spacing w:before="0" w:after="0"/>
+              <w:spacing w:before="0" w:after="80"/>
             </w:pPr>
             <w:r>
               <w:rPr>
                 <w:rFonts w:ascii="Calibri" w:hAnsi="Calibri"/>
                 <w:b w:val="0"/>
                 <w:i w:val="0"/>
-                <w:sz w:val="32"/>
+                <w:sz w:val="28"/>
               </w:rPr>
             </w:r>
           </w:p>
         </w:tc>
         <w:tc>
           <w:tcPr>
-            <w:tcW w:type="dxa" w:w="4320"/>
+            <w:tcW w:type="dxa" w:w="4464"/>
             <w:vAlign w:val="top"/>
             <w:tcMar>
-              <w:top w:w="40" w:type="dxa"/>
-              <w:bottom w:w="40" w:type="dxa"/>
-              <w:left w:w="80" w:type="dxa"/>
-              <w:right w:w="80" w:type="dxa"/>
+              <w:top w:w="50" w:type="dxa"/>
+              <w:bottom w:w="30" w:type="dxa"/>
+              <w:left w:w="90" w:type="dxa"/>
+              <w:right w:w="90" w:type="dxa"/>
             </w:tcMar>
           </w:tcPr>
           <w:p>
             <w:pPr>
-              <w:spacing w:before="0" w:after="40"/>
+              <w:spacing w:before="0" w:after="20"/>
               <w:jc w:val="center"/>
               <w:shd w:val="clear" w:color="auto" w:fill="3D3D3D"/>
             </w:pPr>
@@ -958,32 +1221,138 @@
                 <w:b/>
                 <w:i w:val="0"/>
                 <w:color w:val="FFFFFF"/>
-                <w:sz w:val="19"/>
+                <w:sz w:val="17"/>
               </w:rPr>
-              <w:t>PART D</w:t>
+              <w:t xml:space="preserve">  PART D: Deriving Kinematic Equation 3  </w:t>
             </w:r>
           </w:p>
           <w:p>
             <w:pPr>
-              <w:spacing w:before="40" w:after="20"/>
-              <w:jc w:val="center"/>
+              <w:spacing w:before="80" w:after="20"/>
             </w:pPr>
             <w:r>
               <w:rPr>
                 <w:rFonts w:ascii="Calibri" w:hAnsi="Calibri"/>
                 <w:b/>
                 <w:i w:val="0"/>
-                <w:color w:val="323232"/>
-                <w:sz w:val="16"/>
+                <w:color w:val="505050"/>
+                <w:sz w:val="15"/>
               </w:rPr>
-              <w:t>Deriving Kinematic Equation 3</w:t>
+              <w:t xml:space="preserve">Activity: </w:t>
+            </w:r>
+            <w:r>
+              <w:rPr>
+                <w:rFonts w:ascii="Calibri" w:hAnsi="Calibri"/>
+                <w:b w:val="0"/>
+                <w:i w:val="0"/>
+                <w:color w:val="3C3C3C"/>
+                <w:sz w:val="15"/>
+              </w:rPr>
+              <w:t>Guided Derivation of Kinematic Equations</w:t>
+            </w:r>
+          </w:p>
+          <w:p>
+            <w:pPr>
+              <w:spacing w:before="20" w:after="20"/>
+            </w:pPr>
+            <w:r>
+              <w:rPr>
+                <w:rFonts w:ascii="Calibri" w:hAnsi="Calibri"/>
+                <w:b/>
+                <w:i w:val="0"/>
+                <w:color w:val="505050"/>
+                <w:sz w:val="15"/>
+              </w:rPr>
+              <w:t xml:space="preserve">Name: </w:t>
+            </w:r>
+            <w:r>
+              <w:rPr>
+                <w:rFonts w:ascii="Calibri" w:hAnsi="Calibri"/>
+                <w:b w:val="0"/>
+                <w:i w:val="0"/>
+                <w:color w:val="AAAAAA"/>
+                <w:sz w:val="15"/>
+              </w:rPr>
+              <w:t>______________________________________</w:t>
+            </w:r>
+          </w:p>
+          <w:p>
+            <w:pPr>
+              <w:spacing w:before="20" w:after="60"/>
+            </w:pPr>
+            <w:r>
+              <w:rPr>
+                <w:rFonts w:ascii="Calibri" w:hAnsi="Calibri"/>
+                <w:b/>
+                <w:i w:val="0"/>
+                <w:color w:val="505050"/>
+                <w:sz w:val="15"/>
+              </w:rPr>
+              <w:t xml:space="preserve">Grade &amp; Section: </w:t>
+            </w:r>
+            <w:r>
+              <w:rPr>
+                <w:rFonts w:ascii="Calibri" w:hAnsi="Calibri"/>
+                <w:b w:val="0"/>
+                <w:i w:val="0"/>
+                <w:color w:val="AAAAAA"/>
+                <w:sz w:val="15"/>
+              </w:rPr>
+              <w:t xml:space="preserve">_____________  </w:t>
+            </w:r>
+            <w:r>
+              <w:rPr>
+                <w:rFonts w:ascii="Calibri" w:hAnsi="Calibri"/>
+                <w:b/>
+                <w:i w:val="0"/>
+                <w:color w:val="505050"/>
+                <w:sz w:val="15"/>
+              </w:rPr>
+              <w:t xml:space="preserve">Date: </w:t>
+            </w:r>
+            <w:r>
+              <w:rPr>
+                <w:rFonts w:ascii="Calibri" w:hAnsi="Calibri"/>
+                <w:b w:val="0"/>
+                <w:i w:val="0"/>
+                <w:color w:val="AAAAAA"/>
+                <w:sz w:val="15"/>
+              </w:rPr>
+              <w:t>___________</w:t>
+            </w:r>
+          </w:p>
+          <w:p>
+            <w:pPr>
+              <w:spacing w:before="0" w:after="60"/>
+              <w:jc w:val="center"/>
+            </w:pPr>
+            <w:r>
+              <w:rPr>
+                <w:rFonts w:ascii="Calibri" w:hAnsi="Calibri"/>
+                <w:b w:val="0"/>
+                <w:i w:val="0"/>
+                <w:color w:val="BEBEBE"/>
+                <w:sz w:val="12"/>
+              </w:rPr>
+              <w:t>──────────────────────────────────────────</w:t>
             </w:r>
           </w:p>
           <w:p>
             <w:pPr>
               <w:spacing w:before="20" w:after="80"/>
               <w:jc w:val="center"/>
+              <w:shd w:val="clear" w:color="auto" w:fill="F0F0F0"/>
             </w:pPr>
+            <w:r>
+              <w:rPr>
+                <w:rFonts w:ascii="Calibri" w:hAnsi="Calibri"/>
+                <w:b/>
+                <w:i w:val="0"/>
+                <w:color w:val="646464"/>
+                <w:sz w:val="15"/>
+              </w:rPr>
+              <w:t xml:space="preserve"> GOAL:  </w:t>
+            </w:r>
             <w:r>
               <w:rPr>
                 <w:rFonts w:ascii="Calibri" w:hAnsi="Calibri"/>
@@ -992,7 +1361,7 @@
                 <w:color w:val="646464"/>
                 <w:sz w:val="15"/>
               </w:rPr>
-              <w:t xml:space="preserve">GOAL:  Derive  </w:t>
+              <w:t xml:space="preserve">Derive  </w:t>
             </w:r>
             <w:r>
               <w:rPr>
@@ -1000,9 +1369,18 @@
                 <w:b/>
                 <w:i/>
                 <w:color w:val="282828"/>
-                <w:sz w:val="17"/>
+                <w:sz w:val="18"/>
               </w:rPr>
               <w:t>v² = v₀² + 2a(x − x₀)</w:t>
+            </w:r>
+            <w:r>
+              <w:rPr>
+                <w:rFonts w:ascii="Calibri" w:hAnsi="Calibri"/>
+                <w:b w:val="0"/>
+                <w:i w:val="0"/>
+                <w:sz w:val="15"/>
+              </w:rPr>
+              <w:t xml:space="preserve"> </w:t>
             </w:r>
           </w:p>
           <w:p>
@@ -1032,14 +1410,14 @@
           </w:p>
           <w:p>
             <w:pPr>
-              <w:spacing w:before="0" w:after="0"/>
+              <w:spacing w:before="0" w:after="80"/>
             </w:pPr>
             <w:r>
               <w:rPr>
                 <w:rFonts w:ascii="Calibri" w:hAnsi="Calibri"/>
                 <w:b w:val="0"/>
                 <w:i w:val="0"/>
-                <w:sz w:val="32"/>
+                <w:sz w:val="28"/>
               </w:rPr>
             </w:r>
           </w:p>
@@ -1065,19 +1443,19 @@
                 <w:color w:val="323232"/>
                 <w:sz w:val="15"/>
               </w:rPr>
-              <w:t>Divide both sides by a to isolate t. Write t = ...</w:t>
+              <w:t>Divide both sides of your equation by a to isolate t. Write t = ...</w:t>
             </w:r>
           </w:p>
           <w:p>
             <w:pPr>
-              <w:spacing w:before="0" w:after="0"/>
+              <w:spacing w:before="0" w:after="80"/>
             </w:pPr>
             <w:r>
               <w:rPr>
                 <w:rFonts w:ascii="Calibri" w:hAnsi="Calibri"/>
                 <w:b w:val="0"/>
                 <w:i w:val="0"/>
-                <w:sz w:val="32"/>
+                <w:sz w:val="28"/>
               </w:rPr>
             </w:r>
           </w:p>
@@ -1108,14 +1486,14 @@
           </w:p>
           <w:p>
             <w:pPr>
-              <w:spacing w:before="0" w:after="0"/>
+              <w:spacing w:before="0" w:after="80"/>
             </w:pPr>
             <w:r>
               <w:rPr>
                 <w:rFonts w:ascii="Calibri" w:hAnsi="Calibri"/>
                 <w:b w:val="0"/>
                 <w:i w:val="0"/>
-                <w:sz w:val="32"/>
+                <w:sz w:val="28"/>
               </w:rPr>
             </w:r>
           </w:p>
@@ -1146,14 +1524,14 @@
           </w:p>
           <w:p>
             <w:pPr>
-              <w:spacing w:before="0" w:after="0"/>
+              <w:spacing w:before="0" w:after="80"/>
             </w:pPr>
             <w:r>
               <w:rPr>
                 <w:rFonts w:ascii="Calibri" w:hAnsi="Calibri"/>
                 <w:b w:val="0"/>
                 <w:i w:val="0"/>
-                <w:sz w:val="32"/>
+                <w:sz w:val="28"/>
               </w:rPr>
             </w:r>
           </w:p>
@@ -1184,14 +1562,14 @@
           </w:p>
           <w:p>
             <w:pPr>
-              <w:spacing w:before="0" w:after="0"/>
+              <w:spacing w:before="0" w:after="80"/>
             </w:pPr>
             <w:r>
               <w:rPr>
                 <w:rFonts w:ascii="Calibri" w:hAnsi="Calibri"/>
                 <w:b w:val="0"/>
                 <w:i w:val="0"/>
-                <w:sz w:val="32"/>
+                <w:sz w:val="28"/>
               </w:rPr>
             </w:r>
           </w:p>
@@ -1222,14 +1600,14 @@
           </w:p>
           <w:p>
             <w:pPr>
-              <w:spacing w:before="0" w:after="0"/>
+              <w:spacing w:before="0" w:after="80"/>
             </w:pPr>
             <w:r>
               <w:rPr>
                 <w:rFonts w:ascii="Calibri" w:hAnsi="Calibri"/>
                 <w:b w:val="0"/>
                 <w:i w:val="0"/>
-                <w:sz w:val="32"/>
+                <w:sz w:val="28"/>
               </w:rPr>
             </w:r>
           </w:p>
@@ -1260,14 +1638,14 @@
           </w:p>
           <w:p>
             <w:pPr>
-              <w:spacing w:before="0" w:after="0"/>
+              <w:spacing w:before="0" w:after="80"/>
             </w:pPr>
             <w:r>
               <w:rPr>
                 <w:rFonts w:ascii="Calibri" w:hAnsi="Calibri"/>
                 <w:b w:val="0"/>
                 <w:i w:val="0"/>
-                <w:sz w:val="32"/>
+                <w:sz w:val="28"/>
               </w:rPr>
             </w:r>
           </w:p>
@@ -1281,7 +1659,7 @@
     </w:p>
     <w:p>
       <w:pPr>
-        <w:spacing w:before="0" w:after="120"/>
+        <w:spacing w:before="0" w:after="40"/>
         <w:jc w:val="center"/>
       </w:pPr>
       <w:r>
@@ -1289,8 +1667,8 @@
           <w:rFonts w:ascii="Calibri" w:hAnsi="Calibri"/>
           <w:b/>
           <w:i w:val="0"/>
-          <w:color w:val="2D2D2D"/>
-          <w:sz w:val="28"/>
+          <w:color w:val="960000"/>
+          <w:sz w:val="20"/>
         </w:rPr>
         <w:t>TEACHER’S ANSWER KEY</w:t>
       </w:r>
@@ -1310,47 +1688,180 @@
         </w:tblBorders>
       </w:tblPr>
       <w:tblGrid>
-        <w:gridCol w:w="4392"/>
-        <w:gridCol w:w="4392"/>
-        <w:gridCol w:w="4392"/>
-        <w:gridCol w:w="4392"/>
+        <w:gridCol w:w="4464"/>
+        <w:gridCol w:w="4464"/>
+        <w:gridCol w:w="4464"/>
+        <w:gridCol w:w="4464"/>
       </w:tblGrid>
       <w:tr>
         <w:tc>
           <w:tcPr>
-            <w:tcW w:type="dxa" w:w="4320"/>
+            <w:tcW w:type="dxa" w:w="4464"/>
             <w:vAlign w:val="top"/>
             <w:tcMar>
-              <w:top w:w="40" w:type="dxa"/>
-              <w:bottom w:w="40" w:type="dxa"/>
-              <w:left w:w="80" w:type="dxa"/>
-              <w:right w:w="80" w:type="dxa"/>
+              <w:top w:w="50" w:type="dxa"/>
+              <w:bottom w:w="30" w:type="dxa"/>
+              <w:left w:w="90" w:type="dxa"/>
+              <w:right w:w="90" w:type="dxa"/>
             </w:tcMar>
             <w:tcBorders>
-              <w:right w:val="single" w:sz="4" w:color="BBBBBB"/>
+              <w:right w:val="dashed" w:sz="6" w:color="888888" w:space="0"/>
             </w:tcBorders>
           </w:tcPr>
           <w:p>
             <w:pPr>
-              <w:spacing w:before="0" w:after="40"/>
+              <w:spacing w:before="0" w:after="20"/>
               <w:jc w:val="center"/>
+              <w:shd w:val="clear" w:color="auto" w:fill="3D3D3D"/>
             </w:pPr>
             <w:r>
               <w:rPr>
                 <w:rFonts w:ascii="Calibri" w:hAnsi="Calibri"/>
                 <w:b/>
                 <w:i w:val="0"/>
-                <w:color w:val="323232"/>
-                <w:sz w:val="18"/>
+                <w:color w:val="FFFFFF"/>
+                <w:sz w:val="17"/>
               </w:rPr>
-              <w:t>PART A: Kinematic Equation 1</w:t>
+              <w:t xml:space="preserve">  PART A: Deriving Kinematic Equation 1  </w:t>
+            </w:r>
+          </w:p>
+          <w:p>
+            <w:pPr>
+              <w:spacing w:before="80" w:after="20"/>
+            </w:pPr>
+            <w:r>
+              <w:rPr>
+                <w:rFonts w:ascii="Calibri" w:hAnsi="Calibri"/>
+                <w:b/>
+                <w:i w:val="0"/>
+                <w:color w:val="505050"/>
+                <w:sz w:val="15"/>
+              </w:rPr>
+              <w:t xml:space="preserve">Activity: </w:t>
+            </w:r>
+            <w:r>
+              <w:rPr>
+                <w:rFonts w:ascii="Calibri" w:hAnsi="Calibri"/>
+                <w:b w:val="0"/>
+                <w:i w:val="0"/>
+                <w:color w:val="3C3C3C"/>
+                <w:sz w:val="15"/>
+              </w:rPr>
+              <w:t>Guided Derivation of Kinematic Equations</w:t>
+            </w:r>
+          </w:p>
+          <w:p>
+            <w:pPr>
+              <w:spacing w:before="20" w:after="20"/>
+            </w:pPr>
+            <w:r>
+              <w:rPr>
+                <w:rFonts w:ascii="Calibri" w:hAnsi="Calibri"/>
+                <w:b/>
+                <w:i w:val="0"/>
+                <w:color w:val="505050"/>
+                <w:sz w:val="15"/>
+              </w:rPr>
+              <w:t xml:space="preserve">Name: </w:t>
+            </w:r>
+            <w:r>
+              <w:rPr>
+                <w:rFonts w:ascii="Calibri" w:hAnsi="Calibri"/>
+                <w:b w:val="0"/>
+                <w:i w:val="0"/>
+                <w:color w:val="AAAAAA"/>
+                <w:sz w:val="15"/>
+              </w:rPr>
+              <w:t>______________________________________</w:t>
+            </w:r>
+          </w:p>
+          <w:p>
+            <w:pPr>
+              <w:spacing w:before="20" w:after="60"/>
+            </w:pPr>
+            <w:r>
+              <w:rPr>
+                <w:rFonts w:ascii="Calibri" w:hAnsi="Calibri"/>
+                <w:b/>
+                <w:i w:val="0"/>
+                <w:color w:val="505050"/>
+                <w:sz w:val="15"/>
+              </w:rPr>
+              <w:t xml:space="preserve">Grade &amp; Section: </w:t>
+            </w:r>
+            <w:r>
+              <w:rPr>
+                <w:rFonts w:ascii="Calibri" w:hAnsi="Calibri"/>
+                <w:b w:val="0"/>
+                <w:i w:val="0"/>
+                <w:color w:val="AAAAAA"/>
+                <w:sz w:val="15"/>
+              </w:rPr>
+              <w:t xml:space="preserve">_____________  </w:t>
+            </w:r>
+            <w:r>
+              <w:rPr>
+                <w:rFonts w:ascii="Calibri" w:hAnsi="Calibri"/>
+                <w:b/>
+                <w:i w:val="0"/>
+                <w:color w:val="505050"/>
+                <w:sz w:val="15"/>
+              </w:rPr>
+              <w:t xml:space="preserve">Date: </w:t>
+            </w:r>
+            <w:r>
+              <w:rPr>
+                <w:rFonts w:ascii="Calibri" w:hAnsi="Calibri"/>
+                <w:b w:val="0"/>
+                <w:i w:val="0"/>
+                <w:color w:val="AAAAAA"/>
+                <w:sz w:val="15"/>
+              </w:rPr>
+              <w:t>___________</w:t>
+            </w:r>
+          </w:p>
+          <w:p>
+            <w:pPr>
+              <w:spacing w:before="0" w:after="60"/>
+              <w:jc w:val="center"/>
+            </w:pPr>
+            <w:r>
+              <w:rPr>
+                <w:rFonts w:ascii="Calibri" w:hAnsi="Calibri"/>
+                <w:b w:val="0"/>
+                <w:i w:val="0"/>
+                <w:color w:val="BEBEBE"/>
+                <w:sz w:val="12"/>
+              </w:rPr>
+              <w:t>──────────────────────────────────────────</w:t>
             </w:r>
           </w:p>
           <w:p>
             <w:pPr>
               <w:spacing w:before="20" w:after="80"/>
               <w:jc w:val="center"/>
+              <w:shd w:val="clear" w:color="auto" w:fill="F0F0F0"/>
             </w:pPr>
+            <w:r>
+              <w:rPr>
+                <w:rFonts w:ascii="Calibri" w:hAnsi="Calibri"/>
+                <w:b/>
+                <w:i w:val="0"/>
+                <w:color w:val="646464"/>
+                <w:sz w:val="15"/>
+              </w:rPr>
+              <w:t xml:space="preserve"> GOAL:  </w:t>
+            </w:r>
+            <w:r>
+              <w:rPr>
+                <w:rFonts w:ascii="Calibri" w:hAnsi="Calibri"/>
+                <w:b w:val="0"/>
+                <w:i w:val="0"/>
+                <w:color w:val="646464"/>
+                <w:sz w:val="15"/>
+              </w:rPr>
+              <w:t xml:space="preserve">Derive  </w:t>
+            </w:r>
             <w:r>
               <w:rPr>
                 <w:rFonts w:ascii="Calibri" w:hAnsi="Calibri"/>
@@ -1361,18 +1872,27 @@
               </w:rPr>
               <w:t>v = v₀ + at</w:t>
             </w:r>
+            <w:r>
+              <w:rPr>
+                <w:rFonts w:ascii="Calibri" w:hAnsi="Calibri"/>
+                <w:b w:val="0"/>
+                <w:i w:val="0"/>
+                <w:sz w:val="15"/>
+              </w:rPr>
+              <w:t xml:space="preserve"> </w:t>
+            </w:r>
           </w:p>
           <w:p>
             <w:pPr>
-              <w:spacing w:before="40" w:after="40"/>
+              <w:spacing w:before="40" w:after="20"/>
             </w:pPr>
             <w:r>
               <w:rPr>
                 <w:rFonts w:ascii="Calibri" w:hAnsi="Calibri"/>
                 <w:b/>
                 <w:i w:val="0"/>
-                <w:color w:val="505050"/>
-                <w:sz w:val="16"/>
+                <w:color w:val="3C3C3C"/>
+                <w:sz w:val="15"/>
               </w:rPr>
               <w:t xml:space="preserve">1. </w:t>
             </w:r>
@@ -1380,8 +1900,32 @@
               <w:rPr>
                 <w:rFonts w:ascii="Calibri" w:hAnsi="Calibri"/>
                 <w:b w:val="0"/>
+                <w:i w:val="0"/>
+                <w:color w:val="323232"/>
+                <w:sz w:val="15"/>
+              </w:rPr>
+              <w:t>Acceleration is defined as the rate of change of velocity over time. Write the defining formula for acceleration using delta notation.</w:t>
+            </w:r>
+          </w:p>
+          <w:p>
+            <w:pPr>
+              <w:spacing w:before="20" w:after="40"/>
+            </w:pPr>
+            <w:r>
+              <w:rPr>
+                <w:rFonts w:ascii="Calibri" w:hAnsi="Calibri"/>
+                <w:b w:val="0"/>
+                <w:i w:val="0"/>
+                <w:sz w:val="18"/>
+              </w:rPr>
+              <w:t xml:space="preserve">    </w:t>
+            </w:r>
+            <w:r>
+              <w:rPr>
+                <w:rFonts w:ascii="Calibri" w:hAnsi="Calibri"/>
+                <w:b/>
                 <w:i/>
-                <w:color w:val="282828"/>
+                <w:color w:val="C80000"/>
                 <w:sz w:val="17"/>
               </w:rPr>
               <w:t>a = Δv / Δt</w:t>
@@ -1389,15 +1933,15 @@
           </w:p>
           <w:p>
             <w:pPr>
-              <w:spacing w:before="40" w:after="40"/>
+              <w:spacing w:before="40" w:after="20"/>
             </w:pPr>
             <w:r>
               <w:rPr>
                 <w:rFonts w:ascii="Calibri" w:hAnsi="Calibri"/>
                 <w:b/>
                 <w:i w:val="0"/>
-                <w:color w:val="505050"/>
-                <w:sz w:val="16"/>
+                <w:color w:val="3C3C3C"/>
+                <w:sz w:val="15"/>
               </w:rPr>
               <w:t xml:space="preserve">2. </w:t>
             </w:r>
@@ -1405,8 +1949,32 @@
               <w:rPr>
                 <w:rFonts w:ascii="Calibri" w:hAnsi="Calibri"/>
                 <w:b w:val="0"/>
+                <w:i w:val="0"/>
+                <w:color w:val="323232"/>
+                <w:sz w:val="15"/>
+              </w:rPr>
+              <w:t>The change in velocity is Δv = v − v₀, and if timing starts at t = 0, then Δt = t. Substitute these into the definition you wrote above.</w:t>
+            </w:r>
+          </w:p>
+          <w:p>
+            <w:pPr>
+              <w:spacing w:before="20" w:after="40"/>
+            </w:pPr>
+            <w:r>
+              <w:rPr>
+                <w:rFonts w:ascii="Calibri" w:hAnsi="Calibri"/>
+                <w:b w:val="0"/>
+                <w:i w:val="0"/>
+                <w:sz w:val="18"/>
+              </w:rPr>
+              <w:t xml:space="preserve">    </w:t>
+            </w:r>
+            <w:r>
+              <w:rPr>
+                <w:rFonts w:ascii="Calibri" w:hAnsi="Calibri"/>
+                <w:b/>
                 <w:i/>
-                <w:color w:val="282828"/>
+                <w:color w:val="C80000"/>
                 <w:sz w:val="17"/>
               </w:rPr>
               <w:t>a = (v − v₀) / t</w:t>
@@ -1414,15 +1982,15 @@
           </w:p>
           <w:p>
             <w:pPr>
-              <w:spacing w:before="40" w:after="40"/>
+              <w:spacing w:before="40" w:after="20"/>
             </w:pPr>
             <w:r>
               <w:rPr>
                 <w:rFonts w:ascii="Calibri" w:hAnsi="Calibri"/>
                 <w:b/>
                 <w:i w:val="0"/>
-                <w:color w:val="505050"/>
-                <w:sz w:val="16"/>
+                <w:color w:val="3C3C3C"/>
+                <w:sz w:val="15"/>
               </w:rPr>
               <w:t xml:space="preserve">3. </w:t>
             </w:r>
@@ -1430,8 +1998,32 @@
               <w:rPr>
                 <w:rFonts w:ascii="Calibri" w:hAnsi="Calibri"/>
                 <w:b w:val="0"/>
+                <w:i w:val="0"/>
+                <w:color w:val="323232"/>
+                <w:sz w:val="15"/>
+              </w:rPr>
+              <w:t>Multiply both sides of your equation by t to eliminate the fraction. Write the result.</w:t>
+            </w:r>
+          </w:p>
+          <w:p>
+            <w:pPr>
+              <w:spacing w:before="20" w:after="40"/>
+            </w:pPr>
+            <w:r>
+              <w:rPr>
+                <w:rFonts w:ascii="Calibri" w:hAnsi="Calibri"/>
+                <w:b w:val="0"/>
+                <w:i w:val="0"/>
+                <w:sz w:val="18"/>
+              </w:rPr>
+              <w:t xml:space="preserve">    </w:t>
+            </w:r>
+            <w:r>
+              <w:rPr>
+                <w:rFonts w:ascii="Calibri" w:hAnsi="Calibri"/>
+                <w:b/>
                 <w:i/>
-                <w:color w:val="282828"/>
+                <w:color w:val="C80000"/>
                 <w:sz w:val="17"/>
               </w:rPr>
               <w:t>at = v − v₀</w:t>
@@ -1439,15 +2031,15 @@
           </w:p>
           <w:p>
             <w:pPr>
-              <w:spacing w:before="40" w:after="40"/>
+              <w:spacing w:before="40" w:after="20"/>
             </w:pPr>
             <w:r>
               <w:rPr>
                 <w:rFonts w:ascii="Calibri" w:hAnsi="Calibri"/>
                 <w:b/>
                 <w:i w:val="0"/>
-                <w:color w:val="505050"/>
-                <w:sz w:val="16"/>
+                <w:color w:val="3C3C3C"/>
+                <w:sz w:val="15"/>
               </w:rPr>
               <w:t xml:space="preserve">4. </w:t>
             </w:r>
@@ -1455,8 +2047,32 @@
               <w:rPr>
                 <w:rFonts w:ascii="Calibri" w:hAnsi="Calibri"/>
                 <w:b w:val="0"/>
+                <w:i w:val="0"/>
+                <w:color w:val="323232"/>
+                <w:sz w:val="15"/>
+              </w:rPr>
+              <w:t>Add v₀ to both sides of your equation to isolate v. Write the final equation.</w:t>
+            </w:r>
+          </w:p>
+          <w:p>
+            <w:pPr>
+              <w:spacing w:before="20" w:after="40"/>
+            </w:pPr>
+            <w:r>
+              <w:rPr>
+                <w:rFonts w:ascii="Calibri" w:hAnsi="Calibri"/>
+                <w:b w:val="0"/>
+                <w:i w:val="0"/>
+                <w:sz w:val="18"/>
+              </w:rPr>
+              <w:t xml:space="preserve">    </w:t>
+            </w:r>
+            <w:r>
+              <w:rPr>
+                <w:rFonts w:ascii="Calibri" w:hAnsi="Calibri"/>
+                <w:b/>
                 <w:i/>
-                <w:color w:val="282828"/>
+                <w:color w:val="C80000"/>
                 <w:sz w:val="17"/>
               </w:rPr>
               <w:t>v = v₀ + at</w:t>
@@ -1465,39 +2081,172 @@
         </w:tc>
         <w:tc>
           <w:tcPr>
-            <w:tcW w:type="dxa" w:w="4320"/>
+            <w:tcW w:type="dxa" w:w="4464"/>
             <w:vAlign w:val="top"/>
             <w:tcMar>
-              <w:top w:w="40" w:type="dxa"/>
-              <w:bottom w:w="40" w:type="dxa"/>
-              <w:left w:w="80" w:type="dxa"/>
-              <w:right w:w="80" w:type="dxa"/>
+              <w:top w:w="50" w:type="dxa"/>
+              <w:bottom w:w="30" w:type="dxa"/>
+              <w:left w:w="90" w:type="dxa"/>
+              <w:right w:w="90" w:type="dxa"/>
             </w:tcMar>
             <w:tcBorders>
-              <w:right w:val="single" w:sz="4" w:color="BBBBBB"/>
+              <w:right w:val="dashed" w:sz="6" w:color="888888" w:space="0"/>
             </w:tcBorders>
           </w:tcPr>
           <w:p>
             <w:pPr>
-              <w:spacing w:before="0" w:after="40"/>
+              <w:spacing w:before="0" w:after="20"/>
               <w:jc w:val="center"/>
+              <w:shd w:val="clear" w:color="auto" w:fill="3D3D3D"/>
             </w:pPr>
             <w:r>
               <w:rPr>
                 <w:rFonts w:ascii="Calibri" w:hAnsi="Calibri"/>
                 <w:b/>
                 <w:i w:val="0"/>
-                <w:color w:val="323232"/>
-                <w:sz w:val="18"/>
+                <w:color w:val="FFFFFF"/>
+                <w:sz w:val="17"/>
               </w:rPr>
-              <w:t>PART B: Kinematic Equation 4</w:t>
+              <w:t xml:space="preserve">  PART B: Deriving Kinematic Equation 4  </w:t>
+            </w:r>
+          </w:p>
+          <w:p>
+            <w:pPr>
+              <w:spacing w:before="80" w:after="20"/>
+            </w:pPr>
+            <w:r>
+              <w:rPr>
+                <w:rFonts w:ascii="Calibri" w:hAnsi="Calibri"/>
+                <w:b/>
+                <w:i w:val="0"/>
+                <w:color w:val="505050"/>
+                <w:sz w:val="15"/>
+              </w:rPr>
+              <w:t xml:space="preserve">Activity: </w:t>
+            </w:r>
+            <w:r>
+              <w:rPr>
+                <w:rFonts w:ascii="Calibri" w:hAnsi="Calibri"/>
+                <w:b w:val="0"/>
+                <w:i w:val="0"/>
+                <w:color w:val="3C3C3C"/>
+                <w:sz w:val="15"/>
+              </w:rPr>
+              <w:t>Guided Derivation of Kinematic Equations</w:t>
+            </w:r>
+          </w:p>
+          <w:p>
+            <w:pPr>
+              <w:spacing w:before="20" w:after="20"/>
+            </w:pPr>
+            <w:r>
+              <w:rPr>
+                <w:rFonts w:ascii="Calibri" w:hAnsi="Calibri"/>
+                <w:b/>
+                <w:i w:val="0"/>
+                <w:color w:val="505050"/>
+                <w:sz w:val="15"/>
+              </w:rPr>
+              <w:t xml:space="preserve">Name: </w:t>
+            </w:r>
+            <w:r>
+              <w:rPr>
+                <w:rFonts w:ascii="Calibri" w:hAnsi="Calibri"/>
+                <w:b w:val="0"/>
+                <w:i w:val="0"/>
+                <w:color w:val="AAAAAA"/>
+                <w:sz w:val="15"/>
+              </w:rPr>
+              <w:t>______________________________________</w:t>
+            </w:r>
+          </w:p>
+          <w:p>
+            <w:pPr>
+              <w:spacing w:before="20" w:after="60"/>
+            </w:pPr>
+            <w:r>
+              <w:rPr>
+                <w:rFonts w:ascii="Calibri" w:hAnsi="Calibri"/>
+                <w:b/>
+                <w:i w:val="0"/>
+                <w:color w:val="505050"/>
+                <w:sz w:val="15"/>
+              </w:rPr>
+              <w:t xml:space="preserve">Grade &amp; Section: </w:t>
+            </w:r>
+            <w:r>
+              <w:rPr>
+                <w:rFonts w:ascii="Calibri" w:hAnsi="Calibri"/>
+                <w:b w:val="0"/>
+                <w:i w:val="0"/>
+                <w:color w:val="AAAAAA"/>
+                <w:sz w:val="15"/>
+              </w:rPr>
+              <w:t xml:space="preserve">_____________  </w:t>
+            </w:r>
+            <w:r>
+              <w:rPr>
+                <w:rFonts w:ascii="Calibri" w:hAnsi="Calibri"/>
+                <w:b/>
+                <w:i w:val="0"/>
+                <w:color w:val="505050"/>
+                <w:sz w:val="15"/>
+              </w:rPr>
+              <w:t xml:space="preserve">Date: </w:t>
+            </w:r>
+            <w:r>
+              <w:rPr>
+                <w:rFonts w:ascii="Calibri" w:hAnsi="Calibri"/>
+                <w:b w:val="0"/>
+                <w:i w:val="0"/>
+                <w:color w:val="AAAAAA"/>
+                <w:sz w:val="15"/>
+              </w:rPr>
+              <w:t>___________</w:t>
+            </w:r>
+          </w:p>
+          <w:p>
+            <w:pPr>
+              <w:spacing w:before="0" w:after="60"/>
+              <w:jc w:val="center"/>
+            </w:pPr>
+            <w:r>
+              <w:rPr>
+                <w:rFonts w:ascii="Calibri" w:hAnsi="Calibri"/>
+                <w:b w:val="0"/>
+                <w:i w:val="0"/>
+                <w:color w:val="BEBEBE"/>
+                <w:sz w:val="12"/>
+              </w:rPr>
+              <w:t>──────────────────────────────────────────</w:t>
             </w:r>
           </w:p>
           <w:p>
             <w:pPr>
               <w:spacing w:before="20" w:after="80"/>
               <w:jc w:val="center"/>
+              <w:shd w:val="clear" w:color="auto" w:fill="F0F0F0"/>
             </w:pPr>
+            <w:r>
+              <w:rPr>
+                <w:rFonts w:ascii="Calibri" w:hAnsi="Calibri"/>
+                <w:b/>
+                <w:i w:val="0"/>
+                <w:color w:val="646464"/>
+                <w:sz w:val="15"/>
+              </w:rPr>
+              <w:t xml:space="preserve"> GOAL:  </w:t>
+            </w:r>
+            <w:r>
+              <w:rPr>
+                <w:rFonts w:ascii="Calibri" w:hAnsi="Calibri"/>
+                <w:b w:val="0"/>
+                <w:i w:val="0"/>
+                <w:color w:val="646464"/>
+                <w:sz w:val="15"/>
+              </w:rPr>
+              <w:t xml:space="preserve">Derive  </w:t>
+            </w:r>
             <w:r>
               <w:rPr>
                 <w:rFonts w:ascii="Calibri" w:hAnsi="Calibri"/>
@@ -1508,18 +2257,27 @@
               </w:rPr>
               <w:t>x = x₀ + ½(v₀ + v)t</w:t>
             </w:r>
+            <w:r>
+              <w:rPr>
+                <w:rFonts w:ascii="Calibri" w:hAnsi="Calibri"/>
+                <w:b w:val="0"/>
+                <w:i w:val="0"/>
+                <w:sz w:val="15"/>
+              </w:rPr>
+              <w:t xml:space="preserve"> </w:t>
+            </w:r>
           </w:p>
           <w:p>
             <w:pPr>
-              <w:spacing w:before="40" w:after="40"/>
+              <w:spacing w:before="40" w:after="20"/>
             </w:pPr>
             <w:r>
               <w:rPr>
                 <w:rFonts w:ascii="Calibri" w:hAnsi="Calibri"/>
                 <w:b/>
                 <w:i w:val="0"/>
-                <w:color w:val="505050"/>
-                <w:sz w:val="16"/>
+                <w:color w:val="3C3C3C"/>
+                <w:sz w:val="15"/>
               </w:rPr>
               <w:t xml:space="preserve">1. </w:t>
             </w:r>
@@ -1527,8 +2285,32 @@
               <w:rPr>
                 <w:rFonts w:ascii="Calibri" w:hAnsi="Calibri"/>
                 <w:b w:val="0"/>
+                <w:i w:val="0"/>
+                <w:color w:val="323232"/>
+                <w:sz w:val="15"/>
+              </w:rPr>
+              <w:t>Average velocity is defined as total displacement over total time. Write the definition as a formula using v̄, Δx, and Δt.</w:t>
+            </w:r>
+          </w:p>
+          <w:p>
+            <w:pPr>
+              <w:spacing w:before="20" w:after="40"/>
+            </w:pPr>
+            <w:r>
+              <w:rPr>
+                <w:rFonts w:ascii="Calibri" w:hAnsi="Calibri"/>
+                <w:b w:val="0"/>
+                <w:i w:val="0"/>
+                <w:sz w:val="18"/>
+              </w:rPr>
+              <w:t xml:space="preserve">    </w:t>
+            </w:r>
+            <w:r>
+              <w:rPr>
+                <w:rFonts w:ascii="Calibri" w:hAnsi="Calibri"/>
+                <w:b/>
                 <w:i/>
-                <w:color w:val="282828"/>
+                <w:color w:val="C80000"/>
                 <w:sz w:val="17"/>
               </w:rPr>
               <w:t>v̄ = Δx / Δt</w:t>
@@ -1536,15 +2318,15 @@
           </w:p>
           <w:p>
             <w:pPr>
-              <w:spacing w:before="40" w:after="40"/>
+              <w:spacing w:before="40" w:after="20"/>
             </w:pPr>
             <w:r>
               <w:rPr>
                 <w:rFonts w:ascii="Calibri" w:hAnsi="Calibri"/>
                 <w:b/>
                 <w:i w:val="0"/>
-                <w:color w:val="505050"/>
-                <w:sz w:val="16"/>
+                <w:color w:val="3C3C3C"/>
+                <w:sz w:val="15"/>
               </w:rPr>
               <w:t xml:space="preserve">2. </w:t>
             </w:r>
@@ -1552,8 +2334,32 @@
               <w:rPr>
                 <w:rFonts w:ascii="Calibri" w:hAnsi="Calibri"/>
                 <w:b w:val="0"/>
+                <w:i w:val="0"/>
+                <w:color w:val="323232"/>
+                <w:sz w:val="15"/>
+              </w:rPr>
+              <w:t>Displacement is Δx = x − x₀ and Δt = t. Substitute these into the formula you wrote above.</w:t>
+            </w:r>
+          </w:p>
+          <w:p>
+            <w:pPr>
+              <w:spacing w:before="20" w:after="40"/>
+            </w:pPr>
+            <w:r>
+              <w:rPr>
+                <w:rFonts w:ascii="Calibri" w:hAnsi="Calibri"/>
+                <w:b w:val="0"/>
+                <w:i w:val="0"/>
+                <w:sz w:val="18"/>
+              </w:rPr>
+              <w:t xml:space="preserve">    </w:t>
+            </w:r>
+            <w:r>
+              <w:rPr>
+                <w:rFonts w:ascii="Calibri" w:hAnsi="Calibri"/>
+                <w:b/>
                 <w:i/>
-                <w:color w:val="282828"/>
+                <w:color w:val="C80000"/>
                 <w:sz w:val="17"/>
               </w:rPr>
               <w:t>v̄ = (x − x₀) / t</w:t>
@@ -1561,15 +2367,15 @@
           </w:p>
           <w:p>
             <w:pPr>
-              <w:spacing w:before="40" w:after="40"/>
+              <w:spacing w:before="40" w:after="20"/>
             </w:pPr>
             <w:r>
               <w:rPr>
                 <w:rFonts w:ascii="Calibri" w:hAnsi="Calibri"/>
                 <w:b/>
                 <w:i w:val="0"/>
-                <w:color w:val="505050"/>
-                <w:sz w:val="16"/>
+                <w:color w:val="3C3C3C"/>
+                <w:sz w:val="15"/>
               </w:rPr>
               <w:t xml:space="preserve">3. </w:t>
             </w:r>
@@ -1577,8 +2383,32 @@
               <w:rPr>
                 <w:rFonts w:ascii="Calibri" w:hAnsi="Calibri"/>
                 <w:b w:val="0"/>
+                <w:i w:val="0"/>
+                <w:color w:val="323232"/>
+                <w:sz w:val="15"/>
+              </w:rPr>
+              <w:t>Multiply both sides of your equation by t to clear the denominator. Write the result.</w:t>
+            </w:r>
+          </w:p>
+          <w:p>
+            <w:pPr>
+              <w:spacing w:before="20" w:after="40"/>
+            </w:pPr>
+            <w:r>
+              <w:rPr>
+                <w:rFonts w:ascii="Calibri" w:hAnsi="Calibri"/>
+                <w:b w:val="0"/>
+                <w:i w:val="0"/>
+                <w:sz w:val="18"/>
+              </w:rPr>
+              <w:t xml:space="preserve">    </w:t>
+            </w:r>
+            <w:r>
+              <w:rPr>
+                <w:rFonts w:ascii="Calibri" w:hAnsi="Calibri"/>
+                <w:b/>
                 <w:i/>
-                <w:color w:val="282828"/>
+                <w:color w:val="C80000"/>
                 <w:sz w:val="17"/>
               </w:rPr>
               <w:t>v̄ · t = x − x₀</w:t>
@@ -1586,15 +2416,15 @@
           </w:p>
           <w:p>
             <w:pPr>
-              <w:spacing w:before="40" w:after="40"/>
+              <w:spacing w:before="40" w:after="20"/>
             </w:pPr>
             <w:r>
               <w:rPr>
                 <w:rFonts w:ascii="Calibri" w:hAnsi="Calibri"/>
                 <w:b/>
                 <w:i w:val="0"/>
-                <w:color w:val="505050"/>
-                <w:sz w:val="16"/>
+                <w:color w:val="3C3C3C"/>
+                <w:sz w:val="15"/>
               </w:rPr>
               <w:t xml:space="preserve">4. </w:t>
             </w:r>
@@ -1602,8 +2432,32 @@
               <w:rPr>
                 <w:rFonts w:ascii="Calibri" w:hAnsi="Calibri"/>
                 <w:b w:val="0"/>
+                <w:i w:val="0"/>
+                <w:color w:val="323232"/>
+                <w:sz w:val="15"/>
+              </w:rPr>
+              <w:t>Add x₀ to both sides to isolate x on one side. Write the result.</w:t>
+            </w:r>
+          </w:p>
+          <w:p>
+            <w:pPr>
+              <w:spacing w:before="20" w:after="40"/>
+            </w:pPr>
+            <w:r>
+              <w:rPr>
+                <w:rFonts w:ascii="Calibri" w:hAnsi="Calibri"/>
+                <w:b w:val="0"/>
+                <w:i w:val="0"/>
+                <w:sz w:val="18"/>
+              </w:rPr>
+              <w:t xml:space="preserve">    </w:t>
+            </w:r>
+            <w:r>
+              <w:rPr>
+                <w:rFonts w:ascii="Calibri" w:hAnsi="Calibri"/>
+                <w:b/>
                 <w:i/>
-                <w:color w:val="282828"/>
+                <w:color w:val="C80000"/>
                 <w:sz w:val="17"/>
               </w:rPr>
               <w:t>x = x₀ + v̄ · t</w:t>
@@ -1611,15 +2465,15 @@
           </w:p>
           <w:p>
             <w:pPr>
-              <w:spacing w:before="40" w:after="40"/>
+              <w:spacing w:before="40" w:after="20"/>
             </w:pPr>
             <w:r>
               <w:rPr>
                 <w:rFonts w:ascii="Calibri" w:hAnsi="Calibri"/>
                 <w:b/>
                 <w:i w:val="0"/>
-                <w:color w:val="505050"/>
-                <w:sz w:val="16"/>
+                <w:color w:val="3C3C3C"/>
+                <w:sz w:val="15"/>
               </w:rPr>
               <w:t xml:space="preserve">5. </w:t>
             </w:r>
@@ -1627,8 +2481,32 @@
               <w:rPr>
                 <w:rFonts w:ascii="Calibri" w:hAnsi="Calibri"/>
                 <w:b w:val="0"/>
+                <w:i w:val="0"/>
+                <w:color w:val="323232"/>
+                <w:sz w:val="15"/>
+              </w:rPr>
+              <w:t>Under constant acceleration, velocity changes linearly. The average of a linearly changing quantity equals the mean of its start and end values. Express v̄ as the mean of v₀ and v.</w:t>
+            </w:r>
+          </w:p>
+          <w:p>
+            <w:pPr>
+              <w:spacing w:before="20" w:after="40"/>
+            </w:pPr>
+            <w:r>
+              <w:rPr>
+                <w:rFonts w:ascii="Calibri" w:hAnsi="Calibri"/>
+                <w:b w:val="0"/>
+                <w:i w:val="0"/>
+                <w:sz w:val="18"/>
+              </w:rPr>
+              <w:t xml:space="preserve">    </w:t>
+            </w:r>
+            <w:r>
+              <w:rPr>
+                <w:rFonts w:ascii="Calibri" w:hAnsi="Calibri"/>
+                <w:b/>
                 <w:i/>
-                <w:color w:val="282828"/>
+                <w:color w:val="C80000"/>
                 <w:sz w:val="17"/>
               </w:rPr>
               <w:t>v̄ = (v₀ + v) / 2</w:t>
@@ -1636,15 +2514,15 @@
           </w:p>
           <w:p>
             <w:pPr>
-              <w:spacing w:before="40" w:after="40"/>
+              <w:spacing w:before="40" w:after="20"/>
             </w:pPr>
             <w:r>
               <w:rPr>
                 <w:rFonts w:ascii="Calibri" w:hAnsi="Calibri"/>
                 <w:b/>
                 <w:i w:val="0"/>
-                <w:color w:val="505050"/>
-                <w:sz w:val="16"/>
+                <w:color w:val="3C3C3C"/>
+                <w:sz w:val="15"/>
               </w:rPr>
               <w:t xml:space="preserve">6. </w:t>
             </w:r>
@@ -1652,8 +2530,32 @@
               <w:rPr>
                 <w:rFonts w:ascii="Calibri" w:hAnsi="Calibri"/>
                 <w:b w:val="0"/>
+                <w:i w:val="0"/>
+                <w:color w:val="323232"/>
+                <w:sz w:val="15"/>
+              </w:rPr>
+              <w:t>In your equation from Step 4, replace v̄ with the expression you found in Step 5. Write the final equation.</w:t>
+            </w:r>
+          </w:p>
+          <w:p>
+            <w:pPr>
+              <w:spacing w:before="20" w:after="40"/>
+            </w:pPr>
+            <w:r>
+              <w:rPr>
+                <w:rFonts w:ascii="Calibri" w:hAnsi="Calibri"/>
+                <w:b w:val="0"/>
+                <w:i w:val="0"/>
+                <w:sz w:val="18"/>
+              </w:rPr>
+              <w:t xml:space="preserve">    </w:t>
+            </w:r>
+            <w:r>
+              <w:rPr>
+                <w:rFonts w:ascii="Calibri" w:hAnsi="Calibri"/>
+                <w:b/>
                 <w:i/>
-                <w:color w:val="282828"/>
+                <w:color w:val="C80000"/>
                 <w:sz w:val="17"/>
               </w:rPr>
               <w:t>x = x₀ + ½(v₀ + v)t</w:t>
@@ -1662,39 +2564,172 @@
         </w:tc>
         <w:tc>
           <w:tcPr>
-            <w:tcW w:type="dxa" w:w="4320"/>
+            <w:tcW w:type="dxa" w:w="4464"/>
             <w:vAlign w:val="top"/>
             <w:tcMar>
-              <w:top w:w="40" w:type="dxa"/>
-              <w:bottom w:w="40" w:type="dxa"/>
-              <w:left w:w="80" w:type="dxa"/>
-              <w:right w:w="80" w:type="dxa"/>
+              <w:top w:w="50" w:type="dxa"/>
+              <w:bottom w:w="30" w:type="dxa"/>
+              <w:left w:w="90" w:type="dxa"/>
+              <w:right w:w="90" w:type="dxa"/>
             </w:tcMar>
             <w:tcBorders>
-              <w:right w:val="single" w:sz="4" w:color="BBBBBB"/>
+              <w:right w:val="dashed" w:sz="6" w:color="888888" w:space="0"/>
             </w:tcBorders>
           </w:tcPr>
           <w:p>
             <w:pPr>
-              <w:spacing w:before="0" w:after="40"/>
+              <w:spacing w:before="0" w:after="20"/>
               <w:jc w:val="center"/>
+              <w:shd w:val="clear" w:color="auto" w:fill="3D3D3D"/>
             </w:pPr>
             <w:r>
               <w:rPr>
                 <w:rFonts w:ascii="Calibri" w:hAnsi="Calibri"/>
                 <w:b/>
                 <w:i w:val="0"/>
-                <w:color w:val="323232"/>
-                <w:sz w:val="18"/>
+                <w:color w:val="FFFFFF"/>
+                <w:sz w:val="17"/>
               </w:rPr>
-              <w:t>PART C: Kinematic Equation 2</w:t>
+              <w:t xml:space="preserve">  PART C: Deriving Kinematic Equation 2  </w:t>
+            </w:r>
+          </w:p>
+          <w:p>
+            <w:pPr>
+              <w:spacing w:before="80" w:after="20"/>
+            </w:pPr>
+            <w:r>
+              <w:rPr>
+                <w:rFonts w:ascii="Calibri" w:hAnsi="Calibri"/>
+                <w:b/>
+                <w:i w:val="0"/>
+                <w:color w:val="505050"/>
+                <w:sz w:val="15"/>
+              </w:rPr>
+              <w:t xml:space="preserve">Activity: </w:t>
+            </w:r>
+            <w:r>
+              <w:rPr>
+                <w:rFonts w:ascii="Calibri" w:hAnsi="Calibri"/>
+                <w:b w:val="0"/>
+                <w:i w:val="0"/>
+                <w:color w:val="3C3C3C"/>
+                <w:sz w:val="15"/>
+              </w:rPr>
+              <w:t>Guided Derivation of Kinematic Equations</w:t>
+            </w:r>
+          </w:p>
+          <w:p>
+            <w:pPr>
+              <w:spacing w:before="20" w:after="20"/>
+            </w:pPr>
+            <w:r>
+              <w:rPr>
+                <w:rFonts w:ascii="Calibri" w:hAnsi="Calibri"/>
+                <w:b/>
+                <w:i w:val="0"/>
+                <w:color w:val="505050"/>
+                <w:sz w:val="15"/>
+              </w:rPr>
+              <w:t xml:space="preserve">Name: </w:t>
+            </w:r>
+            <w:r>
+              <w:rPr>
+                <w:rFonts w:ascii="Calibri" w:hAnsi="Calibri"/>
+                <w:b w:val="0"/>
+                <w:i w:val="0"/>
+                <w:color w:val="AAAAAA"/>
+                <w:sz w:val="15"/>
+              </w:rPr>
+              <w:t>______________________________________</w:t>
+            </w:r>
+          </w:p>
+          <w:p>
+            <w:pPr>
+              <w:spacing w:before="20" w:after="60"/>
+            </w:pPr>
+            <w:r>
+              <w:rPr>
+                <w:rFonts w:ascii="Calibri" w:hAnsi="Calibri"/>
+                <w:b/>
+                <w:i w:val="0"/>
+                <w:color w:val="505050"/>
+                <w:sz w:val="15"/>
+              </w:rPr>
+              <w:t xml:space="preserve">Grade &amp; Section: </w:t>
+            </w:r>
+            <w:r>
+              <w:rPr>
+                <w:rFonts w:ascii="Calibri" w:hAnsi="Calibri"/>
+                <w:b w:val="0"/>
+                <w:i w:val="0"/>
+                <w:color w:val="AAAAAA"/>
+                <w:sz w:val="15"/>
+              </w:rPr>
+              <w:t xml:space="preserve">_____________  </w:t>
+            </w:r>
+            <w:r>
+              <w:rPr>
+                <w:rFonts w:ascii="Calibri" w:hAnsi="Calibri"/>
+                <w:b/>
+                <w:i w:val="0"/>
+                <w:color w:val="505050"/>
+                <w:sz w:val="15"/>
+              </w:rPr>
+              <w:t xml:space="preserve">Date: </w:t>
+            </w:r>
+            <w:r>
+              <w:rPr>
+                <w:rFonts w:ascii="Calibri" w:hAnsi="Calibri"/>
+                <w:b w:val="0"/>
+                <w:i w:val="0"/>
+                <w:color w:val="AAAAAA"/>
+                <w:sz w:val="15"/>
+              </w:rPr>
+              <w:t>___________</w:t>
+            </w:r>
+          </w:p>
+          <w:p>
+            <w:pPr>
+              <w:spacing w:before="0" w:after="60"/>
+              <w:jc w:val="center"/>
+            </w:pPr>
+            <w:r>
+              <w:rPr>
+                <w:rFonts w:ascii="Calibri" w:hAnsi="Calibri"/>
+                <w:b w:val="0"/>
+                <w:i w:val="0"/>
+                <w:color w:val="BEBEBE"/>
+                <w:sz w:val="12"/>
+              </w:rPr>
+              <w:t>──────────────────────────────────────────</w:t>
             </w:r>
           </w:p>
           <w:p>
             <w:pPr>
               <w:spacing w:before="20" w:after="80"/>
               <w:jc w:val="center"/>
+              <w:shd w:val="clear" w:color="auto" w:fill="F0F0F0"/>
             </w:pPr>
+            <w:r>
+              <w:rPr>
+                <w:rFonts w:ascii="Calibri" w:hAnsi="Calibri"/>
+                <w:b/>
+                <w:i w:val="0"/>
+                <w:color w:val="646464"/>
+                <w:sz w:val="15"/>
+              </w:rPr>
+              <w:t xml:space="preserve"> GOAL:  </w:t>
+            </w:r>
+            <w:r>
+              <w:rPr>
+                <w:rFonts w:ascii="Calibri" w:hAnsi="Calibri"/>
+                <w:b w:val="0"/>
+                <w:i w:val="0"/>
+                <w:color w:val="646464"/>
+                <w:sz w:val="15"/>
+              </w:rPr>
+              <w:t xml:space="preserve">Derive  </w:t>
+            </w:r>
             <w:r>
               <w:rPr>
                 <w:rFonts w:ascii="Calibri" w:hAnsi="Calibri"/>
@@ -1705,18 +2740,27 @@
               </w:rPr>
               <w:t>x = x₀ + v₀t + ½at²</w:t>
             </w:r>
+            <w:r>
+              <w:rPr>
+                <w:rFonts w:ascii="Calibri" w:hAnsi="Calibri"/>
+                <w:b w:val="0"/>
+                <w:i w:val="0"/>
+                <w:sz w:val="15"/>
+              </w:rPr>
+              <w:t xml:space="preserve"> </w:t>
+            </w:r>
           </w:p>
           <w:p>
             <w:pPr>
-              <w:spacing w:before="40" w:after="40"/>
+              <w:spacing w:before="40" w:after="20"/>
             </w:pPr>
             <w:r>
               <w:rPr>
                 <w:rFonts w:ascii="Calibri" w:hAnsi="Calibri"/>
                 <w:b/>
                 <w:i w:val="0"/>
-                <w:color w:val="505050"/>
-                <w:sz w:val="16"/>
+                <w:color w:val="3C3C3C"/>
+                <w:sz w:val="15"/>
               </w:rPr>
               <w:t xml:space="preserve">1. </w:t>
             </w:r>
@@ -1724,8 +2768,32 @@
               <w:rPr>
                 <w:rFonts w:ascii="Calibri" w:hAnsi="Calibri"/>
                 <w:b w:val="0"/>
+                <w:i w:val="0"/>
+                <w:color w:val="323232"/>
+                <w:sz w:val="15"/>
+              </w:rPr>
+              <w:t>Write down Equation 1: v = v₀ + at.</w:t>
+            </w:r>
+          </w:p>
+          <w:p>
+            <w:pPr>
+              <w:spacing w:before="20" w:after="40"/>
+            </w:pPr>
+            <w:r>
+              <w:rPr>
+                <w:rFonts w:ascii="Calibri" w:hAnsi="Calibri"/>
+                <w:b w:val="0"/>
+                <w:i w:val="0"/>
+                <w:sz w:val="18"/>
+              </w:rPr>
+              <w:t xml:space="preserve">    </w:t>
+            </w:r>
+            <w:r>
+              <w:rPr>
+                <w:rFonts w:ascii="Calibri" w:hAnsi="Calibri"/>
+                <w:b/>
                 <w:i/>
-                <w:color w:val="282828"/>
+                <w:color w:val="C80000"/>
                 <w:sz w:val="17"/>
               </w:rPr>
               <w:t>v = v₀ + at</w:t>
@@ -1733,15 +2801,15 @@
           </w:p>
           <w:p>
             <w:pPr>
-              <w:spacing w:before="40" w:after="40"/>
+              <w:spacing w:before="40" w:after="20"/>
             </w:pPr>
             <w:r>
               <w:rPr>
                 <w:rFonts w:ascii="Calibri" w:hAnsi="Calibri"/>
                 <w:b/>
                 <w:i w:val="0"/>
-                <w:color w:val="505050"/>
-                <w:sz w:val="16"/>
+                <w:color w:val="3C3C3C"/>
+                <w:sz w:val="15"/>
               </w:rPr>
               <w:t xml:space="preserve">2. </w:t>
             </w:r>
@@ -1749,8 +2817,32 @@
               <w:rPr>
                 <w:rFonts w:ascii="Calibri" w:hAnsi="Calibri"/>
                 <w:b w:val="0"/>
+                <w:i w:val="0"/>
+                <w:color w:val="323232"/>
+                <w:sz w:val="15"/>
+              </w:rPr>
+              <w:t>Write down Equation 4: x = x₀ + ½(v₀ + v)t.</w:t>
+            </w:r>
+          </w:p>
+          <w:p>
+            <w:pPr>
+              <w:spacing w:before="20" w:after="40"/>
+            </w:pPr>
+            <w:r>
+              <w:rPr>
+                <w:rFonts w:ascii="Calibri" w:hAnsi="Calibri"/>
+                <w:b w:val="0"/>
+                <w:i w:val="0"/>
+                <w:sz w:val="18"/>
+              </w:rPr>
+              <w:t xml:space="preserve">    </w:t>
+            </w:r>
+            <w:r>
+              <w:rPr>
+                <w:rFonts w:ascii="Calibri" w:hAnsi="Calibri"/>
+                <w:b/>
                 <w:i/>
-                <w:color w:val="282828"/>
+                <w:color w:val="C80000"/>
                 <w:sz w:val="17"/>
               </w:rPr>
               <w:t>x = x₀ + ½(v₀ + v)t</w:t>
@@ -1758,15 +2850,15 @@
           </w:p>
           <w:p>
             <w:pPr>
-              <w:spacing w:before="40" w:after="40"/>
+              <w:spacing w:before="40" w:after="20"/>
             </w:pPr>
             <w:r>
               <w:rPr>
                 <w:rFonts w:ascii="Calibri" w:hAnsi="Calibri"/>
                 <w:b/>
                 <w:i w:val="0"/>
-                <w:color w:val="505050"/>
-                <w:sz w:val="16"/>
+                <w:color w:val="3C3C3C"/>
+                <w:sz w:val="15"/>
               </w:rPr>
               <w:t xml:space="preserve">3. </w:t>
             </w:r>
@@ -1774,24 +2866,48 @@
               <w:rPr>
                 <w:rFonts w:ascii="Calibri" w:hAnsi="Calibri"/>
                 <w:b w:val="0"/>
-                <w:i/>
-                <w:color w:val="282828"/>
-                <w:sz w:val="17"/>
+                <w:i w:val="0"/>
+                <w:color w:val="323232"/>
+                <w:sz w:val="15"/>
               </w:rPr>
-              <w:t>x = x₀ + ½(v₀ + v₀ + at)t</w:t>
+              <w:t>In Equation 4, replace v with the right-hand side of Equation 1. Write the full substitution without simplifying.</w:t>
             </w:r>
           </w:p>
           <w:p>
             <w:pPr>
-              <w:spacing w:before="40" w:after="40"/>
+              <w:spacing w:before="20" w:after="40"/>
+            </w:pPr>
+            <w:r>
+              <w:rPr>
+                <w:rFonts w:ascii="Calibri" w:hAnsi="Calibri"/>
+                <w:b w:val="0"/>
+                <w:i w:val="0"/>
+                <w:sz w:val="18"/>
+              </w:rPr>
+              <w:t xml:space="preserve">    </w:t>
+            </w:r>
+            <w:r>
+              <w:rPr>
+                <w:rFonts w:ascii="Calibri" w:hAnsi="Calibri"/>
+                <w:b/>
+                <w:i/>
+                <w:color w:val="C80000"/>
+                <w:sz w:val="17"/>
+              </w:rPr>
+              <w:t>x = x₀ + ½(v₀ + v₀ + at)·t</w:t>
+            </w:r>
+          </w:p>
+          <w:p>
+            <w:pPr>
+              <w:spacing w:before="40" w:after="20"/>
             </w:pPr>
             <w:r>
               <w:rPr>
                 <w:rFonts w:ascii="Calibri" w:hAnsi="Calibri"/>
                 <w:b/>
                 <w:i w:val="0"/>
-                <w:color w:val="505050"/>
-                <w:sz w:val="16"/>
+                <w:color w:val="3C3C3C"/>
+                <w:sz w:val="15"/>
               </w:rPr>
               <w:t xml:space="preserve">4. </w:t>
             </w:r>
@@ -1799,24 +2915,48 @@
               <w:rPr>
                 <w:rFonts w:ascii="Calibri" w:hAnsi="Calibri"/>
                 <w:b w:val="0"/>
-                <w:i/>
-                <w:color w:val="282828"/>
-                <w:sz w:val="17"/>
+                <w:i w:val="0"/>
+                <w:color w:val="323232"/>
+                <w:sz w:val="15"/>
               </w:rPr>
-              <w:t>x = x₀ + ½(2v₀ + at)t</w:t>
+              <w:t>Inside the brackets, combine the like terms v₀ + v₀ into a single term. Write the simplified expression.</w:t>
             </w:r>
           </w:p>
           <w:p>
             <w:pPr>
-              <w:spacing w:before="40" w:after="40"/>
+              <w:spacing w:before="20" w:after="40"/>
+            </w:pPr>
+            <w:r>
+              <w:rPr>
+                <w:rFonts w:ascii="Calibri" w:hAnsi="Calibri"/>
+                <w:b w:val="0"/>
+                <w:i w:val="0"/>
+                <w:sz w:val="18"/>
+              </w:rPr>
+              <w:t xml:space="preserve">    </w:t>
+            </w:r>
+            <w:r>
+              <w:rPr>
+                <w:rFonts w:ascii="Calibri" w:hAnsi="Calibri"/>
+                <w:b/>
+                <w:i/>
+                <w:color w:val="C80000"/>
+                <w:sz w:val="17"/>
+              </w:rPr>
+              <w:t>x = x₀ + ½(2v₀ + at)·t</w:t>
+            </w:r>
+          </w:p>
+          <w:p>
+            <w:pPr>
+              <w:spacing w:before="40" w:after="20"/>
             </w:pPr>
             <w:r>
               <w:rPr>
                 <w:rFonts w:ascii="Calibri" w:hAnsi="Calibri"/>
                 <w:b/>
                 <w:i w:val="0"/>
-                <w:color w:val="505050"/>
-                <w:sz w:val="16"/>
+                <w:color w:val="3C3C3C"/>
+                <w:sz w:val="15"/>
               </w:rPr>
               <w:t xml:space="preserve">5. </w:t>
             </w:r>
@@ -1824,8 +2964,32 @@
               <w:rPr>
                 <w:rFonts w:ascii="Calibri" w:hAnsi="Calibri"/>
                 <w:b w:val="0"/>
+                <w:i w:val="0"/>
+                <w:color w:val="323232"/>
+                <w:sz w:val="15"/>
+              </w:rPr>
+              <w:t>Distribute t into the bracket. Write the result.</w:t>
+            </w:r>
+          </w:p>
+          <w:p>
+            <w:pPr>
+              <w:spacing w:before="20" w:after="40"/>
+            </w:pPr>
+            <w:r>
+              <w:rPr>
+                <w:rFonts w:ascii="Calibri" w:hAnsi="Calibri"/>
+                <w:b w:val="0"/>
+                <w:i w:val="0"/>
+                <w:sz w:val="18"/>
+              </w:rPr>
+              <w:t xml:space="preserve">    </w:t>
+            </w:r>
+            <w:r>
+              <w:rPr>
+                <w:rFonts w:ascii="Calibri" w:hAnsi="Calibri"/>
+                <w:b/>
                 <w:i/>
-                <w:color w:val="282828"/>
+                <w:color w:val="C80000"/>
                 <w:sz w:val="17"/>
               </w:rPr>
               <w:t>x = x₀ + ½(2v₀t + at²)</w:t>
@@ -1833,15 +2997,15 @@
           </w:p>
           <w:p>
             <w:pPr>
-              <w:spacing w:before="40" w:after="40"/>
+              <w:spacing w:before="40" w:after="20"/>
             </w:pPr>
             <w:r>
               <w:rPr>
                 <w:rFonts w:ascii="Calibri" w:hAnsi="Calibri"/>
                 <w:b/>
                 <w:i w:val="0"/>
-                <w:color w:val="505050"/>
-                <w:sz w:val="16"/>
+                <w:color w:val="3C3C3C"/>
+                <w:sz w:val="15"/>
               </w:rPr>
               <w:t xml:space="preserve">6. </w:t>
             </w:r>
@@ -1849,8 +3013,32 @@
               <w:rPr>
                 <w:rFonts w:ascii="Calibri" w:hAnsi="Calibri"/>
                 <w:b w:val="0"/>
+                <w:i w:val="0"/>
+                <w:color w:val="323232"/>
+                <w:sz w:val="15"/>
+              </w:rPr>
+              <w:t>Distribute ½ to each term. Simplify the coefficients and write the final equation.</w:t>
+            </w:r>
+          </w:p>
+          <w:p>
+            <w:pPr>
+              <w:spacing w:before="20" w:after="40"/>
+            </w:pPr>
+            <w:r>
+              <w:rPr>
+                <w:rFonts w:ascii="Calibri" w:hAnsi="Calibri"/>
+                <w:b w:val="0"/>
+                <w:i w:val="0"/>
+                <w:sz w:val="18"/>
+              </w:rPr>
+              <w:t xml:space="preserve">    </w:t>
+            </w:r>
+            <w:r>
+              <w:rPr>
+                <w:rFonts w:ascii="Calibri" w:hAnsi="Calibri"/>
+                <w:b/>
                 <w:i/>
-                <w:color w:val="282828"/>
+                <w:color w:val="C80000"/>
                 <w:sz w:val="17"/>
               </w:rPr>
               <w:t>x = x₀ + v₀t + ½at²</w:t>
@@ -1859,36 +3047,169 @@
         </w:tc>
         <w:tc>
           <w:tcPr>
-            <w:tcW w:type="dxa" w:w="4320"/>
+            <w:tcW w:type="dxa" w:w="4464"/>
             <w:vAlign w:val="top"/>
             <w:tcMar>
-              <w:top w:w="40" w:type="dxa"/>
-              <w:bottom w:w="40" w:type="dxa"/>
-              <w:left w:w="80" w:type="dxa"/>
-              <w:right w:w="80" w:type="dxa"/>
+              <w:top w:w="50" w:type="dxa"/>
+              <w:bottom w:w="30" w:type="dxa"/>
+              <w:left w:w="90" w:type="dxa"/>
+              <w:right w:w="90" w:type="dxa"/>
             </w:tcMar>
           </w:tcPr>
           <w:p>
             <w:pPr>
-              <w:spacing w:before="0" w:after="40"/>
+              <w:spacing w:before="0" w:after="20"/>
               <w:jc w:val="center"/>
+              <w:shd w:val="clear" w:color="auto" w:fill="3D3D3D"/>
             </w:pPr>
             <w:r>
               <w:rPr>
                 <w:rFonts w:ascii="Calibri" w:hAnsi="Calibri"/>
                 <w:b/>
                 <w:i w:val="0"/>
-                <w:color w:val="323232"/>
-                <w:sz w:val="18"/>
+                <w:color w:val="FFFFFF"/>
+                <w:sz w:val="17"/>
               </w:rPr>
-              <w:t>PART D: Kinematic Equation 3</w:t>
+              <w:t xml:space="preserve">  PART D: Deriving Kinematic Equation 3  </w:t>
+            </w:r>
+          </w:p>
+          <w:p>
+            <w:pPr>
+              <w:spacing w:before="80" w:after="20"/>
+            </w:pPr>
+            <w:r>
+              <w:rPr>
+                <w:rFonts w:ascii="Calibri" w:hAnsi="Calibri"/>
+                <w:b/>
+                <w:i w:val="0"/>
+                <w:color w:val="505050"/>
+                <w:sz w:val="15"/>
+              </w:rPr>
+              <w:t xml:space="preserve">Activity: </w:t>
+            </w:r>
+            <w:r>
+              <w:rPr>
+                <w:rFonts w:ascii="Calibri" w:hAnsi="Calibri"/>
+                <w:b w:val="0"/>
+                <w:i w:val="0"/>
+                <w:color w:val="3C3C3C"/>
+                <w:sz w:val="15"/>
+              </w:rPr>
+              <w:t>Guided Derivation of Kinematic Equations</w:t>
+            </w:r>
+          </w:p>
+          <w:p>
+            <w:pPr>
+              <w:spacing w:before="20" w:after="20"/>
+            </w:pPr>
+            <w:r>
+              <w:rPr>
+                <w:rFonts w:ascii="Calibri" w:hAnsi="Calibri"/>
+                <w:b/>
+                <w:i w:val="0"/>
+                <w:color w:val="505050"/>
+                <w:sz w:val="15"/>
+              </w:rPr>
+              <w:t xml:space="preserve">Name: </w:t>
+            </w:r>
+            <w:r>
+              <w:rPr>
+                <w:rFonts w:ascii="Calibri" w:hAnsi="Calibri"/>
+                <w:b w:val="0"/>
+                <w:i w:val="0"/>
+                <w:color w:val="AAAAAA"/>
+                <w:sz w:val="15"/>
+              </w:rPr>
+              <w:t>______________________________________</w:t>
+            </w:r>
+          </w:p>
+          <w:p>
+            <w:pPr>
+              <w:spacing w:before="20" w:after="60"/>
+            </w:pPr>
+            <w:r>
+              <w:rPr>
+                <w:rFonts w:ascii="Calibri" w:hAnsi="Calibri"/>
+                <w:b/>
+                <w:i w:val="0"/>
+                <w:color w:val="505050"/>
+                <w:sz w:val="15"/>
+              </w:rPr>
+              <w:t xml:space="preserve">Grade &amp; Section: </w:t>
+            </w:r>
+            <w:r>
+              <w:rPr>
+                <w:rFonts w:ascii="Calibri" w:hAnsi="Calibri"/>
+                <w:b w:val="0"/>
+                <w:i w:val="0"/>
+                <w:color w:val="AAAAAA"/>
+                <w:sz w:val="15"/>
+              </w:rPr>
+              <w:t xml:space="preserve">_____________  </w:t>
+            </w:r>
+            <w:r>
+              <w:rPr>
+                <w:rFonts w:ascii="Calibri" w:hAnsi="Calibri"/>
+                <w:b/>
+                <w:i w:val="0"/>
+                <w:color w:val="505050"/>
+                <w:sz w:val="15"/>
+              </w:rPr>
+              <w:t xml:space="preserve">Date: </w:t>
+            </w:r>
+            <w:r>
+              <w:rPr>
+                <w:rFonts w:ascii="Calibri" w:hAnsi="Calibri"/>
+                <w:b w:val="0"/>
+                <w:i w:val="0"/>
+                <w:color w:val="AAAAAA"/>
+                <w:sz w:val="15"/>
+              </w:rPr>
+              <w:t>___________</w:t>
+            </w:r>
+          </w:p>
+          <w:p>
+            <w:pPr>
+              <w:spacing w:before="0" w:after="60"/>
+              <w:jc w:val="center"/>
+            </w:pPr>
+            <w:r>
+              <w:rPr>
+                <w:rFonts w:ascii="Calibri" w:hAnsi="Calibri"/>
+                <w:b w:val="0"/>
+                <w:i w:val="0"/>
+                <w:color w:val="BEBEBE"/>
+                <w:sz w:val="12"/>
+              </w:rPr>
+              <w:t>──────────────────────────────────────────</w:t>
             </w:r>
           </w:p>
           <w:p>
             <w:pPr>
               <w:spacing w:before="20" w:after="80"/>
               <w:jc w:val="center"/>
+              <w:shd w:val="clear" w:color="auto" w:fill="F0F0F0"/>
             </w:pPr>
+            <w:r>
+              <w:rPr>
+                <w:rFonts w:ascii="Calibri" w:hAnsi="Calibri"/>
+                <w:b/>
+                <w:i w:val="0"/>
+                <w:color w:val="646464"/>
+                <w:sz w:val="15"/>
+              </w:rPr>
+              <w:t xml:space="preserve"> GOAL:  </w:t>
+            </w:r>
+            <w:r>
+              <w:rPr>
+                <w:rFonts w:ascii="Calibri" w:hAnsi="Calibri"/>
+                <w:b w:val="0"/>
+                <w:i w:val="0"/>
+                <w:color w:val="646464"/>
+                <w:sz w:val="15"/>
+              </w:rPr>
+              <w:t xml:space="preserve">Derive  </w:t>
+            </w:r>
             <w:r>
               <w:rPr>
                 <w:rFonts w:ascii="Calibri" w:hAnsi="Calibri"/>
@@ -1899,18 +3220,27 @@
               </w:rPr>
               <w:t>v² = v₀² + 2a(x − x₀)</w:t>
             </w:r>
+            <w:r>
+              <w:rPr>
+                <w:rFonts w:ascii="Calibri" w:hAnsi="Calibri"/>
+                <w:b w:val="0"/>
+                <w:i w:val="0"/>
+                <w:sz w:val="15"/>
+              </w:rPr>
+              <w:t xml:space="preserve"> </w:t>
+            </w:r>
           </w:p>
           <w:p>
             <w:pPr>
-              <w:spacing w:before="40" w:after="40"/>
+              <w:spacing w:before="40" w:after="20"/>
             </w:pPr>
             <w:r>
               <w:rPr>
                 <w:rFonts w:ascii="Calibri" w:hAnsi="Calibri"/>
                 <w:b/>
                 <w:i w:val="0"/>
-                <w:color w:val="505050"/>
-                <w:sz w:val="16"/>
+                <w:color w:val="3C3C3C"/>
+                <w:sz w:val="15"/>
               </w:rPr>
               <w:t xml:space="preserve">1. </w:t>
             </w:r>
@@ -1918,8 +3248,32 @@
               <w:rPr>
                 <w:rFonts w:ascii="Calibri" w:hAnsi="Calibri"/>
                 <w:b w:val="0"/>
+                <w:i w:val="0"/>
+                <w:color w:val="323232"/>
+                <w:sz w:val="15"/>
+              </w:rPr>
+              <w:t>Start with Equation 1: v = v₀ + at. Subtract v₀ from both sides. Write the result.</w:t>
+            </w:r>
+          </w:p>
+          <w:p>
+            <w:pPr>
+              <w:spacing w:before="20" w:after="40"/>
+            </w:pPr>
+            <w:r>
+              <w:rPr>
+                <w:rFonts w:ascii="Calibri" w:hAnsi="Calibri"/>
+                <w:b w:val="0"/>
+                <w:i w:val="0"/>
+                <w:sz w:val="18"/>
+              </w:rPr>
+              <w:t xml:space="preserve">    </w:t>
+            </w:r>
+            <w:r>
+              <w:rPr>
+                <w:rFonts w:ascii="Calibri" w:hAnsi="Calibri"/>
+                <w:b/>
                 <w:i/>
-                <w:color w:val="282828"/>
+                <w:color w:val="C80000"/>
                 <w:sz w:val="17"/>
               </w:rPr>
               <w:t>v − v₀ = at</w:t>
@@ -1927,15 +3281,15 @@
           </w:p>
           <w:p>
             <w:pPr>
-              <w:spacing w:before="40" w:after="40"/>
+              <w:spacing w:before="40" w:after="20"/>
             </w:pPr>
             <w:r>
               <w:rPr>
                 <w:rFonts w:ascii="Calibri" w:hAnsi="Calibri"/>
                 <w:b/>
                 <w:i w:val="0"/>
-                <w:color w:val="505050"/>
-                <w:sz w:val="16"/>
+                <w:color w:val="3C3C3C"/>
+                <w:sz w:val="15"/>
               </w:rPr>
               <w:t xml:space="preserve">2. </w:t>
             </w:r>
@@ -1943,8 +3297,32 @@
               <w:rPr>
                 <w:rFonts w:ascii="Calibri" w:hAnsi="Calibri"/>
                 <w:b w:val="0"/>
+                <w:i w:val="0"/>
+                <w:color w:val="323232"/>
+                <w:sz w:val="15"/>
+              </w:rPr>
+              <w:t>Divide both sides of your equation by a to isolate t. Write t = ...</w:t>
+            </w:r>
+          </w:p>
+          <w:p>
+            <w:pPr>
+              <w:spacing w:before="20" w:after="40"/>
+            </w:pPr>
+            <w:r>
+              <w:rPr>
+                <w:rFonts w:ascii="Calibri" w:hAnsi="Calibri"/>
+                <w:b w:val="0"/>
+                <w:i w:val="0"/>
+                <w:sz w:val="18"/>
+              </w:rPr>
+              <w:t xml:space="preserve">    </w:t>
+            </w:r>
+            <w:r>
+              <w:rPr>
+                <w:rFonts w:ascii="Calibri" w:hAnsi="Calibri"/>
+                <w:b/>
                 <w:i/>
-                <w:color w:val="282828"/>
+                <w:color w:val="C80000"/>
                 <w:sz w:val="17"/>
               </w:rPr>
               <w:t>t = (v − v₀) / a</w:t>
@@ -1952,15 +3330,15 @@
           </w:p>
           <w:p>
             <w:pPr>
-              <w:spacing w:before="40" w:after="40"/>
+              <w:spacing w:before="40" w:after="20"/>
             </w:pPr>
             <w:r>
               <w:rPr>
                 <w:rFonts w:ascii="Calibri" w:hAnsi="Calibri"/>
                 <w:b/>
                 <w:i w:val="0"/>
-                <w:color w:val="505050"/>
-                <w:sz w:val="16"/>
+                <w:color w:val="3C3C3C"/>
+                <w:sz w:val="15"/>
               </w:rPr>
               <w:t xml:space="preserve">3. </w:t>
             </w:r>
@@ -1968,8 +3346,32 @@
               <w:rPr>
                 <w:rFonts w:ascii="Calibri" w:hAnsi="Calibri"/>
                 <w:b w:val="0"/>
+                <w:i w:val="0"/>
+                <w:color w:val="323232"/>
+                <w:sz w:val="15"/>
+              </w:rPr>
+              <w:t>Write the displacement equation from Equation 4: x − x₀ = ½(v₀ + v)·t.</w:t>
+            </w:r>
+          </w:p>
+          <w:p>
+            <w:pPr>
+              <w:spacing w:before="20" w:after="40"/>
+            </w:pPr>
+            <w:r>
+              <w:rPr>
+                <w:rFonts w:ascii="Calibri" w:hAnsi="Calibri"/>
+                <w:b w:val="0"/>
+                <w:i w:val="0"/>
+                <w:sz w:val="18"/>
+              </w:rPr>
+              <w:t xml:space="preserve">    </w:t>
+            </w:r>
+            <w:r>
+              <w:rPr>
+                <w:rFonts w:ascii="Calibri" w:hAnsi="Calibri"/>
+                <w:b/>
                 <w:i/>
-                <w:color w:val="282828"/>
+                <w:color w:val="C80000"/>
                 <w:sz w:val="17"/>
               </w:rPr>
               <w:t>x − x₀ = ½(v₀ + v)·t</w:t>
@@ -1977,15 +3379,15 @@
           </w:p>
           <w:p>
             <w:pPr>
-              <w:spacing w:before="40" w:after="40"/>
+              <w:spacing w:before="40" w:after="20"/>
             </w:pPr>
             <w:r>
               <w:rPr>
                 <w:rFonts w:ascii="Calibri" w:hAnsi="Calibri"/>
                 <w:b/>
                 <w:i w:val="0"/>
-                <w:color w:val="505050"/>
-                <w:sz w:val="16"/>
+                <w:color w:val="3C3C3C"/>
+                <w:sz w:val="15"/>
               </w:rPr>
               <w:t xml:space="preserve">4. </w:t>
             </w:r>
@@ -1993,8 +3395,32 @@
               <w:rPr>
                 <w:rFonts w:ascii="Calibri" w:hAnsi="Calibri"/>
                 <w:b w:val="0"/>
+                <w:i w:val="0"/>
+                <w:color w:val="323232"/>
+                <w:sz w:val="15"/>
+              </w:rPr>
+              <w:t>Replace t with the expression you found in Step 2. Write the full substitution.</w:t>
+            </w:r>
+          </w:p>
+          <w:p>
+            <w:pPr>
+              <w:spacing w:before="20" w:after="40"/>
+            </w:pPr>
+            <w:r>
+              <w:rPr>
+                <w:rFonts w:ascii="Calibri" w:hAnsi="Calibri"/>
+                <w:b w:val="0"/>
+                <w:i w:val="0"/>
+                <w:sz w:val="18"/>
+              </w:rPr>
+              <w:t xml:space="preserve">    </w:t>
+            </w:r>
+            <w:r>
+              <w:rPr>
+                <w:rFonts w:ascii="Calibri" w:hAnsi="Calibri"/>
+                <w:b/>
                 <w:i/>
-                <w:color w:val="282828"/>
+                <w:color w:val="C80000"/>
                 <w:sz w:val="17"/>
               </w:rPr>
               <w:t>x − x₀ = ½(v₀ + v)(v − v₀) / a</w:t>
@@ -2002,15 +3428,15 @@
           </w:p>
           <w:p>
             <w:pPr>
-              <w:spacing w:before="40" w:after="40"/>
+              <w:spacing w:before="40" w:after="20"/>
             </w:pPr>
             <w:r>
               <w:rPr>
                 <w:rFonts w:ascii="Calibri" w:hAnsi="Calibri"/>
                 <w:b/>
                 <w:i w:val="0"/>
-                <w:color w:val="505050"/>
-                <w:sz w:val="16"/>
+                <w:color w:val="3C3C3C"/>
+                <w:sz w:val="15"/>
               </w:rPr>
               <w:t xml:space="preserve">5. </w:t>
             </w:r>
@@ -2018,8 +3444,32 @@
               <w:rPr>
                 <w:rFonts w:ascii="Calibri" w:hAnsi="Calibri"/>
                 <w:b w:val="0"/>
+                <w:i w:val="0"/>
+                <w:color w:val="323232"/>
+                <w:sz w:val="15"/>
+              </w:rPr>
+              <w:t>Multiply the two factors in the numerator using the difference-of-squares identity: (v₀ + v)(v − v₀) = v² − v₀². Simplify.</w:t>
+            </w:r>
+          </w:p>
+          <w:p>
+            <w:pPr>
+              <w:spacing w:before="20" w:after="40"/>
+            </w:pPr>
+            <w:r>
+              <w:rPr>
+                <w:rFonts w:ascii="Calibri" w:hAnsi="Calibri"/>
+                <w:b w:val="0"/>
+                <w:i w:val="0"/>
+                <w:sz w:val="18"/>
+              </w:rPr>
+              <w:t xml:space="preserve">    </w:t>
+            </w:r>
+            <w:r>
+              <w:rPr>
+                <w:rFonts w:ascii="Calibri" w:hAnsi="Calibri"/>
+                <w:b/>
                 <w:i/>
-                <w:color w:val="282828"/>
+                <w:color w:val="C80000"/>
                 <w:sz w:val="17"/>
               </w:rPr>
               <w:t>x − x₀ = (v² − v₀²) / 2a</w:t>
@@ -2027,15 +3477,15 @@
           </w:p>
           <w:p>
             <w:pPr>
-              <w:spacing w:before="40" w:after="40"/>
+              <w:spacing w:before="40" w:after="20"/>
             </w:pPr>
             <w:r>
               <w:rPr>
                 <w:rFonts w:ascii="Calibri" w:hAnsi="Calibri"/>
                 <w:b/>
                 <w:i w:val="0"/>
-                <w:color w:val="505050"/>
-                <w:sz w:val="16"/>
+                <w:color w:val="3C3C3C"/>
+                <w:sz w:val="15"/>
               </w:rPr>
               <w:t xml:space="preserve">6. </w:t>
             </w:r>
@@ -2043,8 +3493,32 @@
               <w:rPr>
                 <w:rFonts w:ascii="Calibri" w:hAnsi="Calibri"/>
                 <w:b w:val="0"/>
+                <w:i w:val="0"/>
+                <w:color w:val="323232"/>
+                <w:sz w:val="15"/>
+              </w:rPr>
+              <w:t>Multiply both sides by 2a to clear the denominator. Write the result.</w:t>
+            </w:r>
+          </w:p>
+          <w:p>
+            <w:pPr>
+              <w:spacing w:before="20" w:after="40"/>
+            </w:pPr>
+            <w:r>
+              <w:rPr>
+                <w:rFonts w:ascii="Calibri" w:hAnsi="Calibri"/>
+                <w:b w:val="0"/>
+                <w:i w:val="0"/>
+                <w:sz w:val="18"/>
+              </w:rPr>
+              <w:t xml:space="preserve">    </w:t>
+            </w:r>
+            <w:r>
+              <w:rPr>
+                <w:rFonts w:ascii="Calibri" w:hAnsi="Calibri"/>
+                <w:b/>
                 <w:i/>
-                <w:color w:val="282828"/>
+                <w:color w:val="C80000"/>
                 <w:sz w:val="17"/>
               </w:rPr>
               <w:t>2a(x − x₀) = v² − v₀²</w:t>
@@ -2052,15 +3526,15 @@
           </w:p>
           <w:p>
             <w:pPr>
-              <w:spacing w:before="40" w:after="40"/>
+              <w:spacing w:before="40" w:after="20"/>
             </w:pPr>
             <w:r>
               <w:rPr>
                 <w:rFonts w:ascii="Calibri" w:hAnsi="Calibri"/>
                 <w:b/>
                 <w:i w:val="0"/>
-                <w:color w:val="505050"/>
-                <w:sz w:val="16"/>
+                <w:color w:val="3C3C3C"/>
+                <w:sz w:val="15"/>
               </w:rPr>
               <w:t xml:space="preserve">7. </w:t>
             </w:r>
@@ -2068,8 +3542,32 @@
               <w:rPr>
                 <w:rFonts w:ascii="Calibri" w:hAnsi="Calibri"/>
                 <w:b w:val="0"/>
+                <w:i w:val="0"/>
+                <w:color w:val="323232"/>
+                <w:sz w:val="15"/>
+              </w:rPr>
+              <w:t>Add v₀² to both sides to isolate v². Write the final equation.</w:t>
+            </w:r>
+          </w:p>
+          <w:p>
+            <w:pPr>
+              <w:spacing w:before="20" w:after="40"/>
+            </w:pPr>
+            <w:r>
+              <w:rPr>
+                <w:rFonts w:ascii="Calibri" w:hAnsi="Calibri"/>
+                <w:b w:val="0"/>
+                <w:i w:val="0"/>
+                <w:sz w:val="18"/>
+              </w:rPr>
+              <w:t xml:space="preserve">    </w:t>
+            </w:r>
+            <w:r>
+              <w:rPr>
+                <w:rFonts w:ascii="Calibri" w:hAnsi="Calibri"/>
+                <w:b/>
                 <w:i/>
-                <w:color w:val="282828"/>
+                <w:color w:val="C80000"/>
                 <w:sz w:val="17"/>
               </w:rPr>
               <w:t>v² = v₀² + 2a(x − x₀)</w:t>
@@ -2080,7 +3578,7 @@
     </w:tbl>
     <w:sectPr>
       <w:pgSz w:w="18720" w:h="12240" w:orient="landscape"/>
-      <w:pgMar w:top="504" w:right="576" w:bottom="504" w:left="576" w:header="720" w:footer="720" w:gutter="0"/>
+      <w:pgMar w:top="432" w:right="432" w:bottom="432" w:left="432" w:header="720" w:footer="720" w:gutter="0"/>
       <w:cols w:space="720"/>
       <w:docGrid w:linePitch="360"/>
     </w:sectPr>

</xml_diff>

<commit_message>
Fix worksheet layout per feedback
- Reorder header: Activity/Name/Grade&Section/Date now appear ABOVE Part title
- Dashed cut lines now run the full page height (fixed exact row height)
- Answer writing space is dynamically maximized and balanced per part
  based on step count and estimated instruction text height
- Removed dark banner shading; only light-gray (E7E7E7) used for Part title bar
- Answer key mirrors identical layout with red answers
</commit_message>
<xml_diff>
--- a/kinematics-worksheet-4.docx
+++ b/kinematics-worksheet-4.docx
@@ -15,6 +15,7 @@
           <w:insideH w:val="nil"/>
           <w:insideV w:val="nil"/>
         </w:tblBorders>
+        <w:tblLayout w:type="fixed"/>
       </w:tblPr>
       <w:tblGrid>
         <w:gridCol w:w="4464"/>
@@ -23,47 +24,33 @@
         <w:gridCol w:w="4464"/>
       </w:tblGrid>
       <w:tr>
+        <w:trPr>
+          <w:trHeight w:val="11304" w:hRule="exact"/>
+        </w:trPr>
         <w:tc>
           <w:tcPr>
             <w:tcW w:type="dxa" w:w="4464"/>
             <w:vAlign w:val="top"/>
             <w:tcMar>
-              <w:top w:w="50" w:type="dxa"/>
-              <w:bottom w:w="30" w:type="dxa"/>
-              <w:left w:w="90" w:type="dxa"/>
-              <w:right w:w="90" w:type="dxa"/>
+              <w:top w:w="45" w:type="dxa"/>
+              <w:bottom w:w="20" w:type="dxa"/>
+              <w:left w:w="75" w:type="dxa"/>
+              <w:right w:w="75" w:type="dxa"/>
             </w:tcMar>
             <w:tcBorders>
-              <w:right w:val="dashed" w:sz="6" w:color="888888" w:space="0"/>
+              <w:right w:val="dashed" w:sz="6" w:color="999999" w:space="0"/>
             </w:tcBorders>
           </w:tcPr>
           <w:p>
             <w:pPr>
               <w:spacing w:before="0" w:after="20"/>
-              <w:jc w:val="center"/>
-              <w:shd w:val="clear" w:color="auto" w:fill="3D3D3D"/>
             </w:pPr>
             <w:r>
               <w:rPr>
                 <w:rFonts w:ascii="Calibri" w:hAnsi="Calibri"/>
                 <w:b/>
                 <w:i w:val="0"/>
-                <w:color w:val="FFFFFF"/>
-                <w:sz w:val="17"/>
-              </w:rPr>
-              <w:t xml:space="preserve">  PART A: Deriving Kinematic Equation 1  </w:t>
-            </w:r>
-          </w:p>
-          <w:p>
-            <w:pPr>
-              <w:spacing w:before="80" w:after="20"/>
-            </w:pPr>
-            <w:r>
-              <w:rPr>
-                <w:rFonts w:ascii="Calibri" w:hAnsi="Calibri"/>
-                <w:b/>
-                <w:i w:val="0"/>
-                <w:color w:val="505050"/>
+                <w:color w:val="555555"/>
                 <w:sz w:val="15"/>
               </w:rPr>
               <w:t xml:space="preserve">Activity: </w:t>
@@ -88,7 +75,7 @@
                 <w:rFonts w:ascii="Calibri" w:hAnsi="Calibri"/>
                 <w:b/>
                 <w:i w:val="0"/>
-                <w:color w:val="505050"/>
+                <w:color w:val="555555"/>
                 <w:sz w:val="15"/>
               </w:rPr>
               <w:t xml:space="preserve">Name: </w:t>
@@ -98,7 +85,7 @@
                 <w:rFonts w:ascii="Calibri" w:hAnsi="Calibri"/>
                 <w:b w:val="0"/>
                 <w:i w:val="0"/>
-                <w:color w:val="AAAAAA"/>
+                <w:color w:val="A5A5A5"/>
                 <w:sz w:val="15"/>
               </w:rPr>
               <w:t>______________________________________</w:t>
@@ -106,14 +93,14 @@
           </w:p>
           <w:p>
             <w:pPr>
-              <w:spacing w:before="20" w:after="60"/>
+              <w:spacing w:before="20" w:after="80"/>
             </w:pPr>
             <w:r>
               <w:rPr>
                 <w:rFonts w:ascii="Calibri" w:hAnsi="Calibri"/>
                 <w:b/>
                 <w:i w:val="0"/>
-                <w:color w:val="505050"/>
+                <w:color w:val="555555"/>
                 <w:sz w:val="15"/>
               </w:rPr>
               <w:t xml:space="preserve">Grade &amp; Section: </w:t>
@@ -123,17 +110,17 @@
                 <w:rFonts w:ascii="Calibri" w:hAnsi="Calibri"/>
                 <w:b w:val="0"/>
                 <w:i w:val="0"/>
-                <w:color w:val="AAAAAA"/>
+                <w:color w:val="A5A5A5"/>
                 <w:sz w:val="15"/>
               </w:rPr>
-              <w:t xml:space="preserve">_____________  </w:t>
+              <w:t xml:space="preserve">_____________   </w:t>
             </w:r>
             <w:r>
               <w:rPr>
                 <w:rFonts w:ascii="Calibri" w:hAnsi="Calibri"/>
                 <w:b/>
                 <w:i w:val="0"/>
-                <w:color w:val="505050"/>
+                <w:color w:val="555555"/>
                 <w:sz w:val="15"/>
               </w:rPr>
               <w:t xml:space="preserve">Date: </w:t>
@@ -143,7 +130,7 @@
                 <w:rFonts w:ascii="Calibri" w:hAnsi="Calibri"/>
                 <w:b w:val="0"/>
                 <w:i w:val="0"/>
-                <w:color w:val="AAAAAA"/>
+                <w:color w:val="A5A5A5"/>
                 <w:sz w:val="15"/>
               </w:rPr>
               <w:t>___________</w:t>
@@ -151,45 +138,46 @@
           </w:p>
           <w:p>
             <w:pPr>
-              <w:spacing w:before="0" w:after="60"/>
-              <w:jc w:val="center"/>
+              <w:spacing w:before="40" w:after="60"/>
+              <w:shd w:val="clear" w:color="auto" w:fill="E7E7E7"/>
+            </w:pPr>
+            <w:r>
+              <w:rPr>
+                <w:rFonts w:ascii="Calibri" w:hAnsi="Calibri"/>
+                <w:b/>
+                <w:i w:val="0"/>
+                <w:color w:val="282828"/>
+                <w:sz w:val="19"/>
+              </w:rPr>
+              <w:t xml:space="preserve"> PART A:  </w:t>
+            </w:r>
+            <w:r>
+              <w:rPr>
+                <w:rFonts w:ascii="Calibri" w:hAnsi="Calibri"/>
+                <w:b/>
+                <w:i w:val="0"/>
+                <w:color w:val="282828"/>
+                <w:sz w:val="19"/>
+              </w:rPr>
+              <w:t xml:space="preserve">Deriving Kinematic Equation 1 </w:t>
+            </w:r>
+          </w:p>
+          <w:p>
+            <w:pPr>
+              <w:spacing w:before="0" w:after="120"/>
+              <w:pBdr>
+                <w:bottom w:val="single" w:sz="4" w:space="2" w:color="CFCFCF"/>
+              </w:pBdr>
             </w:pPr>
             <w:r>
               <w:rPr>
                 <w:rFonts w:ascii="Calibri" w:hAnsi="Calibri"/>
                 <w:b w:val="0"/>
                 <w:i w:val="0"/>
-                <w:color w:val="BEBEBE"/>
-                <w:sz w:val="12"/>
-              </w:rPr>
-              <w:t>──────────────────────────────────────────</w:t>
-            </w:r>
-          </w:p>
-          <w:p>
-            <w:pPr>
-              <w:spacing w:before="20" w:after="80"/>
-              <w:jc w:val="center"/>
-              <w:shd w:val="clear" w:color="auto" w:fill="F0F0F0"/>
-            </w:pPr>
-            <w:r>
-              <w:rPr>
-                <w:rFonts w:ascii="Calibri" w:hAnsi="Calibri"/>
-                <w:b/>
-                <w:i w:val="0"/>
-                <w:color w:val="646464"/>
+                <w:color w:val="555555"/>
                 <w:sz w:val="15"/>
               </w:rPr>
-              <w:t xml:space="preserve"> GOAL:  </w:t>
-            </w:r>
-            <w:r>
-              <w:rPr>
-                <w:rFonts w:ascii="Calibri" w:hAnsi="Calibri"/>
-                <w:b w:val="0"/>
-                <w:i w:val="0"/>
-                <w:color w:val="646464"/>
-                <w:sz w:val="15"/>
-              </w:rPr>
-              <w:t xml:space="preserve">Derive  </w:t>
+              <w:t xml:space="preserve">Goal: Derive  </w:t>
             </w:r>
             <w:r>
               <w:rPr>
@@ -201,19 +189,10 @@
               </w:rPr>
               <w:t>v = v₀ + at</w:t>
             </w:r>
-            <w:r>
-              <w:rPr>
-                <w:rFonts w:ascii="Calibri" w:hAnsi="Calibri"/>
-                <w:b w:val="0"/>
-                <w:i w:val="0"/>
-                <w:sz w:val="15"/>
-              </w:rPr>
-              <w:t xml:space="preserve"> </w:t>
-            </w:r>
           </w:p>
           <w:p>
             <w:pPr>
-              <w:spacing w:before="40" w:after="20"/>
+              <w:spacing w:before="60" w:after="40"/>
             </w:pPr>
             <w:r>
               <w:rPr>
@@ -223,7 +202,7 @@
                 <w:color w:val="3C3C3C"/>
                 <w:sz w:val="15"/>
               </w:rPr>
-              <w:t xml:space="preserve">1. </w:t>
+              <w:t xml:space="preserve">1.  </w:t>
             </w:r>
             <w:r>
               <w:rPr>
@@ -238,20 +217,20 @@
           </w:p>
           <w:p>
             <w:pPr>
-              <w:spacing w:before="0" w:after="80"/>
+              <w:spacing w:before="0" w:after="1861"/>
             </w:pPr>
             <w:r>
               <w:rPr>
                 <w:rFonts w:ascii="Calibri" w:hAnsi="Calibri"/>
                 <w:b w:val="0"/>
                 <w:i w:val="0"/>
-                <w:sz w:val="28"/>
+                <w:sz w:val="2"/>
               </w:rPr>
             </w:r>
           </w:p>
           <w:p>
             <w:pPr>
-              <w:spacing w:before="40" w:after="20"/>
+              <w:spacing w:before="60" w:after="40"/>
             </w:pPr>
             <w:r>
               <w:rPr>
@@ -261,7 +240,7 @@
                 <w:color w:val="3C3C3C"/>
                 <w:sz w:val="15"/>
               </w:rPr>
-              <w:t xml:space="preserve">2. </w:t>
+              <w:t xml:space="preserve">2.  </w:t>
             </w:r>
             <w:r>
               <w:rPr>
@@ -276,20 +255,20 @@
           </w:p>
           <w:p>
             <w:pPr>
-              <w:spacing w:before="0" w:after="80"/>
+              <w:spacing w:before="0" w:after="1861"/>
             </w:pPr>
             <w:r>
               <w:rPr>
                 <w:rFonts w:ascii="Calibri" w:hAnsi="Calibri"/>
                 <w:b w:val="0"/>
                 <w:i w:val="0"/>
-                <w:sz w:val="28"/>
+                <w:sz w:val="2"/>
               </w:rPr>
             </w:r>
           </w:p>
           <w:p>
             <w:pPr>
-              <w:spacing w:before="40" w:after="20"/>
+              <w:spacing w:before="60" w:after="40"/>
             </w:pPr>
             <w:r>
               <w:rPr>
@@ -299,7 +278,7 @@
                 <w:color w:val="3C3C3C"/>
                 <w:sz w:val="15"/>
               </w:rPr>
-              <w:t xml:space="preserve">3. </w:t>
+              <w:t xml:space="preserve">3.  </w:t>
             </w:r>
             <w:r>
               <w:rPr>
@@ -314,20 +293,20 @@
           </w:p>
           <w:p>
             <w:pPr>
-              <w:spacing w:before="0" w:after="80"/>
+              <w:spacing w:before="0" w:after="1861"/>
             </w:pPr>
             <w:r>
               <w:rPr>
                 <w:rFonts w:ascii="Calibri" w:hAnsi="Calibri"/>
                 <w:b w:val="0"/>
                 <w:i w:val="0"/>
-                <w:sz w:val="28"/>
+                <w:sz w:val="2"/>
               </w:rPr>
             </w:r>
           </w:p>
           <w:p>
             <w:pPr>
-              <w:spacing w:before="40" w:after="20"/>
+              <w:spacing w:before="60" w:after="40"/>
             </w:pPr>
             <w:r>
               <w:rPr>
@@ -337,7 +316,7 @@
                 <w:color w:val="3C3C3C"/>
                 <w:sz w:val="15"/>
               </w:rPr>
-              <w:t xml:space="preserve">4. </w:t>
+              <w:t xml:space="preserve">4.  </w:t>
             </w:r>
             <w:r>
               <w:rPr>
@@ -352,14 +331,14 @@
           </w:p>
           <w:p>
             <w:pPr>
-              <w:spacing w:before="0" w:after="80"/>
+              <w:spacing w:before="0" w:after="1861"/>
             </w:pPr>
             <w:r>
               <w:rPr>
                 <w:rFonts w:ascii="Calibri" w:hAnsi="Calibri"/>
                 <w:b w:val="0"/>
                 <w:i w:val="0"/>
-                <w:sz w:val="28"/>
+                <w:sz w:val="2"/>
               </w:rPr>
             </w:r>
           </w:p>
@@ -369,42 +348,25 @@
             <w:tcW w:type="dxa" w:w="4464"/>
             <w:vAlign w:val="top"/>
             <w:tcMar>
-              <w:top w:w="50" w:type="dxa"/>
-              <w:bottom w:w="30" w:type="dxa"/>
-              <w:left w:w="90" w:type="dxa"/>
-              <w:right w:w="90" w:type="dxa"/>
+              <w:top w:w="45" w:type="dxa"/>
+              <w:bottom w:w="20" w:type="dxa"/>
+              <w:left w:w="75" w:type="dxa"/>
+              <w:right w:w="75" w:type="dxa"/>
             </w:tcMar>
             <w:tcBorders>
-              <w:right w:val="dashed" w:sz="6" w:color="888888" w:space="0"/>
+              <w:right w:val="dashed" w:sz="6" w:color="999999" w:space="0"/>
             </w:tcBorders>
           </w:tcPr>
           <w:p>
             <w:pPr>
               <w:spacing w:before="0" w:after="20"/>
-              <w:jc w:val="center"/>
-              <w:shd w:val="clear" w:color="auto" w:fill="3D3D3D"/>
             </w:pPr>
             <w:r>
               <w:rPr>
                 <w:rFonts w:ascii="Calibri" w:hAnsi="Calibri"/>
                 <w:b/>
                 <w:i w:val="0"/>
-                <w:color w:val="FFFFFF"/>
-                <w:sz w:val="17"/>
-              </w:rPr>
-              <w:t xml:space="preserve">  PART B: Deriving Kinematic Equation 4  </w:t>
-            </w:r>
-          </w:p>
-          <w:p>
-            <w:pPr>
-              <w:spacing w:before="80" w:after="20"/>
-            </w:pPr>
-            <w:r>
-              <w:rPr>
-                <w:rFonts w:ascii="Calibri" w:hAnsi="Calibri"/>
-                <w:b/>
-                <w:i w:val="0"/>
-                <w:color w:val="505050"/>
+                <w:color w:val="555555"/>
                 <w:sz w:val="15"/>
               </w:rPr>
               <w:t xml:space="preserve">Activity: </w:t>
@@ -429,7 +391,7 @@
                 <w:rFonts w:ascii="Calibri" w:hAnsi="Calibri"/>
                 <w:b/>
                 <w:i w:val="0"/>
-                <w:color w:val="505050"/>
+                <w:color w:val="555555"/>
                 <w:sz w:val="15"/>
               </w:rPr>
               <w:t xml:space="preserve">Name: </w:t>
@@ -439,7 +401,7 @@
                 <w:rFonts w:ascii="Calibri" w:hAnsi="Calibri"/>
                 <w:b w:val="0"/>
                 <w:i w:val="0"/>
-                <w:color w:val="AAAAAA"/>
+                <w:color w:val="A5A5A5"/>
                 <w:sz w:val="15"/>
               </w:rPr>
               <w:t>______________________________________</w:t>
@@ -447,14 +409,14 @@
           </w:p>
           <w:p>
             <w:pPr>
-              <w:spacing w:before="20" w:after="60"/>
+              <w:spacing w:before="20" w:after="80"/>
             </w:pPr>
             <w:r>
               <w:rPr>
                 <w:rFonts w:ascii="Calibri" w:hAnsi="Calibri"/>
                 <w:b/>
                 <w:i w:val="0"/>
-                <w:color w:val="505050"/>
+                <w:color w:val="555555"/>
                 <w:sz w:val="15"/>
               </w:rPr>
               <w:t xml:space="preserve">Grade &amp; Section: </w:t>
@@ -464,17 +426,17 @@
                 <w:rFonts w:ascii="Calibri" w:hAnsi="Calibri"/>
                 <w:b w:val="0"/>
                 <w:i w:val="0"/>
-                <w:color w:val="AAAAAA"/>
+                <w:color w:val="A5A5A5"/>
                 <w:sz w:val="15"/>
               </w:rPr>
-              <w:t xml:space="preserve">_____________  </w:t>
+              <w:t xml:space="preserve">_____________   </w:t>
             </w:r>
             <w:r>
               <w:rPr>
                 <w:rFonts w:ascii="Calibri" w:hAnsi="Calibri"/>
                 <w:b/>
                 <w:i w:val="0"/>
-                <w:color w:val="505050"/>
+                <w:color w:val="555555"/>
                 <w:sz w:val="15"/>
               </w:rPr>
               <w:t xml:space="preserve">Date: </w:t>
@@ -484,7 +446,7 @@
                 <w:rFonts w:ascii="Calibri" w:hAnsi="Calibri"/>
                 <w:b w:val="0"/>
                 <w:i w:val="0"/>
-                <w:color w:val="AAAAAA"/>
+                <w:color w:val="A5A5A5"/>
                 <w:sz w:val="15"/>
               </w:rPr>
               <w:t>___________</w:t>
@@ -492,45 +454,46 @@
           </w:p>
           <w:p>
             <w:pPr>
-              <w:spacing w:before="0" w:after="60"/>
-              <w:jc w:val="center"/>
+              <w:spacing w:before="40" w:after="60"/>
+              <w:shd w:val="clear" w:color="auto" w:fill="E7E7E7"/>
+            </w:pPr>
+            <w:r>
+              <w:rPr>
+                <w:rFonts w:ascii="Calibri" w:hAnsi="Calibri"/>
+                <w:b/>
+                <w:i w:val="0"/>
+                <w:color w:val="282828"/>
+                <w:sz w:val="19"/>
+              </w:rPr>
+              <w:t xml:space="preserve"> PART B:  </w:t>
+            </w:r>
+            <w:r>
+              <w:rPr>
+                <w:rFonts w:ascii="Calibri" w:hAnsi="Calibri"/>
+                <w:b/>
+                <w:i w:val="0"/>
+                <w:color w:val="282828"/>
+                <w:sz w:val="19"/>
+              </w:rPr>
+              <w:t xml:space="preserve">Deriving Kinematic Equation 4 </w:t>
+            </w:r>
+          </w:p>
+          <w:p>
+            <w:pPr>
+              <w:spacing w:before="0" w:after="120"/>
+              <w:pBdr>
+                <w:bottom w:val="single" w:sz="4" w:space="2" w:color="CFCFCF"/>
+              </w:pBdr>
             </w:pPr>
             <w:r>
               <w:rPr>
                 <w:rFonts w:ascii="Calibri" w:hAnsi="Calibri"/>
                 <w:b w:val="0"/>
                 <w:i w:val="0"/>
-                <w:color w:val="BEBEBE"/>
-                <w:sz w:val="12"/>
-              </w:rPr>
-              <w:t>──────────────────────────────────────────</w:t>
-            </w:r>
-          </w:p>
-          <w:p>
-            <w:pPr>
-              <w:spacing w:before="20" w:after="80"/>
-              <w:jc w:val="center"/>
-              <w:shd w:val="clear" w:color="auto" w:fill="F0F0F0"/>
-            </w:pPr>
-            <w:r>
-              <w:rPr>
-                <w:rFonts w:ascii="Calibri" w:hAnsi="Calibri"/>
-                <w:b/>
-                <w:i w:val="0"/>
-                <w:color w:val="646464"/>
+                <w:color w:val="555555"/>
                 <w:sz w:val="15"/>
               </w:rPr>
-              <w:t xml:space="preserve"> GOAL:  </w:t>
-            </w:r>
-            <w:r>
-              <w:rPr>
-                <w:rFonts w:ascii="Calibri" w:hAnsi="Calibri"/>
-                <w:b w:val="0"/>
-                <w:i w:val="0"/>
-                <w:color w:val="646464"/>
-                <w:sz w:val="15"/>
-              </w:rPr>
-              <w:t xml:space="preserve">Derive  </w:t>
+              <w:t xml:space="preserve">Goal: Derive  </w:t>
             </w:r>
             <w:r>
               <w:rPr>
@@ -542,19 +505,10 @@
               </w:rPr>
               <w:t>x = x₀ + ½(v₀ + v)t</w:t>
             </w:r>
-            <w:r>
-              <w:rPr>
-                <w:rFonts w:ascii="Calibri" w:hAnsi="Calibri"/>
-                <w:b w:val="0"/>
-                <w:i w:val="0"/>
-                <w:sz w:val="15"/>
-              </w:rPr>
-              <w:t xml:space="preserve"> </w:t>
-            </w:r>
           </w:p>
           <w:p>
             <w:pPr>
-              <w:spacing w:before="40" w:after="20"/>
+              <w:spacing w:before="60" w:after="40"/>
             </w:pPr>
             <w:r>
               <w:rPr>
@@ -564,7 +518,7 @@
                 <w:color w:val="3C3C3C"/>
                 <w:sz w:val="15"/>
               </w:rPr>
-              <w:t xml:space="preserve">1. </w:t>
+              <w:t xml:space="preserve">1.  </w:t>
             </w:r>
             <w:r>
               <w:rPr>
@@ -579,20 +533,20 @@
           </w:p>
           <w:p>
             <w:pPr>
-              <w:spacing w:before="0" w:after="80"/>
+              <w:spacing w:before="0" w:after="1017"/>
             </w:pPr>
             <w:r>
               <w:rPr>
                 <w:rFonts w:ascii="Calibri" w:hAnsi="Calibri"/>
                 <w:b w:val="0"/>
                 <w:i w:val="0"/>
-                <w:sz w:val="28"/>
+                <w:sz w:val="2"/>
               </w:rPr>
             </w:r>
           </w:p>
           <w:p>
             <w:pPr>
-              <w:spacing w:before="40" w:after="20"/>
+              <w:spacing w:before="60" w:after="40"/>
             </w:pPr>
             <w:r>
               <w:rPr>
@@ -602,7 +556,7 @@
                 <w:color w:val="3C3C3C"/>
                 <w:sz w:val="15"/>
               </w:rPr>
-              <w:t xml:space="preserve">2. </w:t>
+              <w:t xml:space="preserve">2.  </w:t>
             </w:r>
             <w:r>
               <w:rPr>
@@ -617,20 +571,20 @@
           </w:p>
           <w:p>
             <w:pPr>
-              <w:spacing w:before="0" w:after="80"/>
+              <w:spacing w:before="0" w:after="1017"/>
             </w:pPr>
             <w:r>
               <w:rPr>
                 <w:rFonts w:ascii="Calibri" w:hAnsi="Calibri"/>
                 <w:b w:val="0"/>
                 <w:i w:val="0"/>
-                <w:sz w:val="28"/>
+                <w:sz w:val="2"/>
               </w:rPr>
             </w:r>
           </w:p>
           <w:p>
             <w:pPr>
-              <w:spacing w:before="40" w:after="20"/>
+              <w:spacing w:before="60" w:after="40"/>
             </w:pPr>
             <w:r>
               <w:rPr>
@@ -640,7 +594,7 @@
                 <w:color w:val="3C3C3C"/>
                 <w:sz w:val="15"/>
               </w:rPr>
-              <w:t xml:space="preserve">3. </w:t>
+              <w:t xml:space="preserve">3.  </w:t>
             </w:r>
             <w:r>
               <w:rPr>
@@ -655,20 +609,20 @@
           </w:p>
           <w:p>
             <w:pPr>
-              <w:spacing w:before="0" w:after="80"/>
+              <w:spacing w:before="0" w:after="1017"/>
             </w:pPr>
             <w:r>
               <w:rPr>
                 <w:rFonts w:ascii="Calibri" w:hAnsi="Calibri"/>
                 <w:b w:val="0"/>
                 <w:i w:val="0"/>
-                <w:sz w:val="28"/>
+                <w:sz w:val="2"/>
               </w:rPr>
             </w:r>
           </w:p>
           <w:p>
             <w:pPr>
-              <w:spacing w:before="40" w:after="20"/>
+              <w:spacing w:before="60" w:after="40"/>
             </w:pPr>
             <w:r>
               <w:rPr>
@@ -678,7 +632,7 @@
                 <w:color w:val="3C3C3C"/>
                 <w:sz w:val="15"/>
               </w:rPr>
-              <w:t xml:space="preserve">4. </w:t>
+              <w:t xml:space="preserve">4.  </w:t>
             </w:r>
             <w:r>
               <w:rPr>
@@ -693,20 +647,20 @@
           </w:p>
           <w:p>
             <w:pPr>
-              <w:spacing w:before="0" w:after="80"/>
+              <w:spacing w:before="0" w:after="1017"/>
             </w:pPr>
             <w:r>
               <w:rPr>
                 <w:rFonts w:ascii="Calibri" w:hAnsi="Calibri"/>
                 <w:b w:val="0"/>
                 <w:i w:val="0"/>
-                <w:sz w:val="28"/>
+                <w:sz w:val="2"/>
               </w:rPr>
             </w:r>
           </w:p>
           <w:p>
             <w:pPr>
-              <w:spacing w:before="40" w:after="20"/>
+              <w:spacing w:before="60" w:after="40"/>
             </w:pPr>
             <w:r>
               <w:rPr>
@@ -716,7 +670,7 @@
                 <w:color w:val="3C3C3C"/>
                 <w:sz w:val="15"/>
               </w:rPr>
-              <w:t xml:space="preserve">5. </w:t>
+              <w:t xml:space="preserve">5.  </w:t>
             </w:r>
             <w:r>
               <w:rPr>
@@ -731,20 +685,20 @@
           </w:p>
           <w:p>
             <w:pPr>
-              <w:spacing w:before="0" w:after="80"/>
+              <w:spacing w:before="0" w:after="1017"/>
             </w:pPr>
             <w:r>
               <w:rPr>
                 <w:rFonts w:ascii="Calibri" w:hAnsi="Calibri"/>
                 <w:b w:val="0"/>
                 <w:i w:val="0"/>
-                <w:sz w:val="28"/>
+                <w:sz w:val="2"/>
               </w:rPr>
             </w:r>
           </w:p>
           <w:p>
             <w:pPr>
-              <w:spacing w:before="40" w:after="20"/>
+              <w:spacing w:before="60" w:after="40"/>
             </w:pPr>
             <w:r>
               <w:rPr>
@@ -754,7 +708,7 @@
                 <w:color w:val="3C3C3C"/>
                 <w:sz w:val="15"/>
               </w:rPr>
-              <w:t xml:space="preserve">6. </w:t>
+              <w:t xml:space="preserve">6.  </w:t>
             </w:r>
             <w:r>
               <w:rPr>
@@ -769,14 +723,14 @@
           </w:p>
           <w:p>
             <w:pPr>
-              <w:spacing w:before="0" w:after="80"/>
+              <w:spacing w:before="0" w:after="1017"/>
             </w:pPr>
             <w:r>
               <w:rPr>
                 <w:rFonts w:ascii="Calibri" w:hAnsi="Calibri"/>
                 <w:b w:val="0"/>
                 <w:i w:val="0"/>
-                <w:sz w:val="28"/>
+                <w:sz w:val="2"/>
               </w:rPr>
             </w:r>
           </w:p>
@@ -786,42 +740,25 @@
             <w:tcW w:type="dxa" w:w="4464"/>
             <w:vAlign w:val="top"/>
             <w:tcMar>
-              <w:top w:w="50" w:type="dxa"/>
-              <w:bottom w:w="30" w:type="dxa"/>
-              <w:left w:w="90" w:type="dxa"/>
-              <w:right w:w="90" w:type="dxa"/>
+              <w:top w:w="45" w:type="dxa"/>
+              <w:bottom w:w="20" w:type="dxa"/>
+              <w:left w:w="75" w:type="dxa"/>
+              <w:right w:w="75" w:type="dxa"/>
             </w:tcMar>
             <w:tcBorders>
-              <w:right w:val="dashed" w:sz="6" w:color="888888" w:space="0"/>
+              <w:right w:val="dashed" w:sz="6" w:color="999999" w:space="0"/>
             </w:tcBorders>
           </w:tcPr>
           <w:p>
             <w:pPr>
               <w:spacing w:before="0" w:after="20"/>
-              <w:jc w:val="center"/>
-              <w:shd w:val="clear" w:color="auto" w:fill="3D3D3D"/>
             </w:pPr>
             <w:r>
               <w:rPr>
                 <w:rFonts w:ascii="Calibri" w:hAnsi="Calibri"/>
                 <w:b/>
                 <w:i w:val="0"/>
-                <w:color w:val="FFFFFF"/>
-                <w:sz w:val="17"/>
-              </w:rPr>
-              <w:t xml:space="preserve">  PART C: Deriving Kinematic Equation 2  </w:t>
-            </w:r>
-          </w:p>
-          <w:p>
-            <w:pPr>
-              <w:spacing w:before="80" w:after="20"/>
-            </w:pPr>
-            <w:r>
-              <w:rPr>
-                <w:rFonts w:ascii="Calibri" w:hAnsi="Calibri"/>
-                <w:b/>
-                <w:i w:val="0"/>
-                <w:color w:val="505050"/>
+                <w:color w:val="555555"/>
                 <w:sz w:val="15"/>
               </w:rPr>
               <w:t xml:space="preserve">Activity: </w:t>
@@ -846,7 +783,7 @@
                 <w:rFonts w:ascii="Calibri" w:hAnsi="Calibri"/>
                 <w:b/>
                 <w:i w:val="0"/>
-                <w:color w:val="505050"/>
+                <w:color w:val="555555"/>
                 <w:sz w:val="15"/>
               </w:rPr>
               <w:t xml:space="preserve">Name: </w:t>
@@ -856,7 +793,7 @@
                 <w:rFonts w:ascii="Calibri" w:hAnsi="Calibri"/>
                 <w:b w:val="0"/>
                 <w:i w:val="0"/>
-                <w:color w:val="AAAAAA"/>
+                <w:color w:val="A5A5A5"/>
                 <w:sz w:val="15"/>
               </w:rPr>
               <w:t>______________________________________</w:t>
@@ -864,14 +801,14 @@
           </w:p>
           <w:p>
             <w:pPr>
-              <w:spacing w:before="20" w:after="60"/>
+              <w:spacing w:before="20" w:after="80"/>
             </w:pPr>
             <w:r>
               <w:rPr>
                 <w:rFonts w:ascii="Calibri" w:hAnsi="Calibri"/>
                 <w:b/>
                 <w:i w:val="0"/>
-                <w:color w:val="505050"/>
+                <w:color w:val="555555"/>
                 <w:sz w:val="15"/>
               </w:rPr>
               <w:t xml:space="preserve">Grade &amp; Section: </w:t>
@@ -881,17 +818,17 @@
                 <w:rFonts w:ascii="Calibri" w:hAnsi="Calibri"/>
                 <w:b w:val="0"/>
                 <w:i w:val="0"/>
-                <w:color w:val="AAAAAA"/>
+                <w:color w:val="A5A5A5"/>
                 <w:sz w:val="15"/>
               </w:rPr>
-              <w:t xml:space="preserve">_____________  </w:t>
+              <w:t xml:space="preserve">_____________   </w:t>
             </w:r>
             <w:r>
               <w:rPr>
                 <w:rFonts w:ascii="Calibri" w:hAnsi="Calibri"/>
                 <w:b/>
                 <w:i w:val="0"/>
-                <w:color w:val="505050"/>
+                <w:color w:val="555555"/>
                 <w:sz w:val="15"/>
               </w:rPr>
               <w:t xml:space="preserve">Date: </w:t>
@@ -901,7 +838,7 @@
                 <w:rFonts w:ascii="Calibri" w:hAnsi="Calibri"/>
                 <w:b w:val="0"/>
                 <w:i w:val="0"/>
-                <w:color w:val="AAAAAA"/>
+                <w:color w:val="A5A5A5"/>
                 <w:sz w:val="15"/>
               </w:rPr>
               <w:t>___________</w:t>
@@ -909,45 +846,46 @@
           </w:p>
           <w:p>
             <w:pPr>
-              <w:spacing w:before="0" w:after="60"/>
-              <w:jc w:val="center"/>
+              <w:spacing w:before="40" w:after="60"/>
+              <w:shd w:val="clear" w:color="auto" w:fill="E7E7E7"/>
+            </w:pPr>
+            <w:r>
+              <w:rPr>
+                <w:rFonts w:ascii="Calibri" w:hAnsi="Calibri"/>
+                <w:b/>
+                <w:i w:val="0"/>
+                <w:color w:val="282828"/>
+                <w:sz w:val="19"/>
+              </w:rPr>
+              <w:t xml:space="preserve"> PART C:  </w:t>
+            </w:r>
+            <w:r>
+              <w:rPr>
+                <w:rFonts w:ascii="Calibri" w:hAnsi="Calibri"/>
+                <w:b/>
+                <w:i w:val="0"/>
+                <w:color w:val="282828"/>
+                <w:sz w:val="19"/>
+              </w:rPr>
+              <w:t xml:space="preserve">Deriving Kinematic Equation 2 </w:t>
+            </w:r>
+          </w:p>
+          <w:p>
+            <w:pPr>
+              <w:spacing w:before="0" w:after="120"/>
+              <w:pBdr>
+                <w:bottom w:val="single" w:sz="4" w:space="2" w:color="CFCFCF"/>
+              </w:pBdr>
             </w:pPr>
             <w:r>
               <w:rPr>
                 <w:rFonts w:ascii="Calibri" w:hAnsi="Calibri"/>
                 <w:b w:val="0"/>
                 <w:i w:val="0"/>
-                <w:color w:val="BEBEBE"/>
-                <w:sz w:val="12"/>
-              </w:rPr>
-              <w:t>──────────────────────────────────────────</w:t>
-            </w:r>
-          </w:p>
-          <w:p>
-            <w:pPr>
-              <w:spacing w:before="20" w:after="80"/>
-              <w:jc w:val="center"/>
-              <w:shd w:val="clear" w:color="auto" w:fill="F0F0F0"/>
-            </w:pPr>
-            <w:r>
-              <w:rPr>
-                <w:rFonts w:ascii="Calibri" w:hAnsi="Calibri"/>
-                <w:b/>
-                <w:i w:val="0"/>
-                <w:color w:val="646464"/>
+                <w:color w:val="555555"/>
                 <w:sz w:val="15"/>
               </w:rPr>
-              <w:t xml:space="preserve"> GOAL:  </w:t>
-            </w:r>
-            <w:r>
-              <w:rPr>
-                <w:rFonts w:ascii="Calibri" w:hAnsi="Calibri"/>
-                <w:b w:val="0"/>
-                <w:i w:val="0"/>
-                <w:color w:val="646464"/>
-                <w:sz w:val="15"/>
-              </w:rPr>
-              <w:t xml:space="preserve">Derive  </w:t>
+              <w:t xml:space="preserve">Goal: Derive  </w:t>
             </w:r>
             <w:r>
               <w:rPr>
@@ -959,19 +897,10 @@
               </w:rPr>
               <w:t>x = x₀ + v₀t + ½at²</w:t>
             </w:r>
-            <w:r>
-              <w:rPr>
-                <w:rFonts w:ascii="Calibri" w:hAnsi="Calibri"/>
-                <w:b w:val="0"/>
-                <w:i w:val="0"/>
-                <w:sz w:val="15"/>
-              </w:rPr>
-              <w:t xml:space="preserve"> </w:t>
-            </w:r>
           </w:p>
           <w:p>
             <w:pPr>
-              <w:spacing w:before="40" w:after="20"/>
+              <w:spacing w:before="60" w:after="40"/>
             </w:pPr>
             <w:r>
               <w:rPr>
@@ -981,7 +910,7 @@
                 <w:color w:val="3C3C3C"/>
                 <w:sz w:val="15"/>
               </w:rPr>
-              <w:t xml:space="preserve">1. </w:t>
+              <w:t xml:space="preserve">1.  </w:t>
             </w:r>
             <w:r>
               <w:rPr>
@@ -996,20 +925,20 @@
           </w:p>
           <w:p>
             <w:pPr>
-              <w:spacing w:before="0" w:after="80"/>
+              <w:spacing w:before="0" w:after="1176"/>
             </w:pPr>
             <w:r>
               <w:rPr>
                 <w:rFonts w:ascii="Calibri" w:hAnsi="Calibri"/>
                 <w:b w:val="0"/>
                 <w:i w:val="0"/>
-                <w:sz w:val="28"/>
+                <w:sz w:val="2"/>
               </w:rPr>
             </w:r>
           </w:p>
           <w:p>
             <w:pPr>
-              <w:spacing w:before="40" w:after="20"/>
+              <w:spacing w:before="60" w:after="40"/>
             </w:pPr>
             <w:r>
               <w:rPr>
@@ -1019,7 +948,7 @@
                 <w:color w:val="3C3C3C"/>
                 <w:sz w:val="15"/>
               </w:rPr>
-              <w:t xml:space="preserve">2. </w:t>
+              <w:t xml:space="preserve">2.  </w:t>
             </w:r>
             <w:r>
               <w:rPr>
@@ -1034,20 +963,20 @@
           </w:p>
           <w:p>
             <w:pPr>
-              <w:spacing w:before="0" w:after="80"/>
+              <w:spacing w:before="0" w:after="1176"/>
             </w:pPr>
             <w:r>
               <w:rPr>
                 <w:rFonts w:ascii="Calibri" w:hAnsi="Calibri"/>
                 <w:b w:val="0"/>
                 <w:i w:val="0"/>
-                <w:sz w:val="28"/>
+                <w:sz w:val="2"/>
               </w:rPr>
             </w:r>
           </w:p>
           <w:p>
             <w:pPr>
-              <w:spacing w:before="40" w:after="20"/>
+              <w:spacing w:before="60" w:after="40"/>
             </w:pPr>
             <w:r>
               <w:rPr>
@@ -1057,7 +986,7 @@
                 <w:color w:val="3C3C3C"/>
                 <w:sz w:val="15"/>
               </w:rPr>
-              <w:t xml:space="preserve">3. </w:t>
+              <w:t xml:space="preserve">3.  </w:t>
             </w:r>
             <w:r>
               <w:rPr>
@@ -1072,20 +1001,20 @@
           </w:p>
           <w:p>
             <w:pPr>
-              <w:spacing w:before="0" w:after="80"/>
+              <w:spacing w:before="0" w:after="1176"/>
             </w:pPr>
             <w:r>
               <w:rPr>
                 <w:rFonts w:ascii="Calibri" w:hAnsi="Calibri"/>
                 <w:b w:val="0"/>
                 <w:i w:val="0"/>
-                <w:sz w:val="28"/>
+                <w:sz w:val="2"/>
               </w:rPr>
             </w:r>
           </w:p>
           <w:p>
             <w:pPr>
-              <w:spacing w:before="40" w:after="20"/>
+              <w:spacing w:before="60" w:after="40"/>
             </w:pPr>
             <w:r>
               <w:rPr>
@@ -1095,7 +1024,7 @@
                 <w:color w:val="3C3C3C"/>
                 <w:sz w:val="15"/>
               </w:rPr>
-              <w:t xml:space="preserve">4. </w:t>
+              <w:t xml:space="preserve">4.  </w:t>
             </w:r>
             <w:r>
               <w:rPr>
@@ -1110,20 +1039,20 @@
           </w:p>
           <w:p>
             <w:pPr>
-              <w:spacing w:before="0" w:after="80"/>
+              <w:spacing w:before="0" w:after="1176"/>
             </w:pPr>
             <w:r>
               <w:rPr>
                 <w:rFonts w:ascii="Calibri" w:hAnsi="Calibri"/>
                 <w:b w:val="0"/>
                 <w:i w:val="0"/>
-                <w:sz w:val="28"/>
+                <w:sz w:val="2"/>
               </w:rPr>
             </w:r>
           </w:p>
           <w:p>
             <w:pPr>
-              <w:spacing w:before="40" w:after="20"/>
+              <w:spacing w:before="60" w:after="40"/>
             </w:pPr>
             <w:r>
               <w:rPr>
@@ -1133,7 +1062,7 @@
                 <w:color w:val="3C3C3C"/>
                 <w:sz w:val="15"/>
               </w:rPr>
-              <w:t xml:space="preserve">5. </w:t>
+              <w:t xml:space="preserve">5.  </w:t>
             </w:r>
             <w:r>
               <w:rPr>
@@ -1148,20 +1077,20 @@
           </w:p>
           <w:p>
             <w:pPr>
-              <w:spacing w:before="0" w:after="80"/>
+              <w:spacing w:before="0" w:after="1176"/>
             </w:pPr>
             <w:r>
               <w:rPr>
                 <w:rFonts w:ascii="Calibri" w:hAnsi="Calibri"/>
                 <w:b w:val="0"/>
                 <w:i w:val="0"/>
-                <w:sz w:val="28"/>
+                <w:sz w:val="2"/>
               </w:rPr>
             </w:r>
           </w:p>
           <w:p>
             <w:pPr>
-              <w:spacing w:before="40" w:after="20"/>
+              <w:spacing w:before="60" w:after="40"/>
             </w:pPr>
             <w:r>
               <w:rPr>
@@ -1171,7 +1100,7 @@
                 <w:color w:val="3C3C3C"/>
                 <w:sz w:val="15"/>
               </w:rPr>
-              <w:t xml:space="preserve">6. </w:t>
+              <w:t xml:space="preserve">6.  </w:t>
             </w:r>
             <w:r>
               <w:rPr>
@@ -1186,14 +1115,14 @@
           </w:p>
           <w:p>
             <w:pPr>
-              <w:spacing w:before="0" w:after="80"/>
+              <w:spacing w:before="0" w:after="1176"/>
             </w:pPr>
             <w:r>
               <w:rPr>
                 <w:rFonts w:ascii="Calibri" w:hAnsi="Calibri"/>
                 <w:b w:val="0"/>
                 <w:i w:val="0"/>
-                <w:sz w:val="28"/>
+                <w:sz w:val="2"/>
               </w:rPr>
             </w:r>
           </w:p>
@@ -1203,39 +1132,22 @@
             <w:tcW w:type="dxa" w:w="4464"/>
             <w:vAlign w:val="top"/>
             <w:tcMar>
-              <w:top w:w="50" w:type="dxa"/>
-              <w:bottom w:w="30" w:type="dxa"/>
-              <w:left w:w="90" w:type="dxa"/>
-              <w:right w:w="90" w:type="dxa"/>
+              <w:top w:w="45" w:type="dxa"/>
+              <w:bottom w:w="20" w:type="dxa"/>
+              <w:left w:w="75" w:type="dxa"/>
+              <w:right w:w="75" w:type="dxa"/>
             </w:tcMar>
           </w:tcPr>
           <w:p>
             <w:pPr>
               <w:spacing w:before="0" w:after="20"/>
-              <w:jc w:val="center"/>
-              <w:shd w:val="clear" w:color="auto" w:fill="3D3D3D"/>
             </w:pPr>
             <w:r>
               <w:rPr>
                 <w:rFonts w:ascii="Calibri" w:hAnsi="Calibri"/>
                 <w:b/>
                 <w:i w:val="0"/>
-                <w:color w:val="FFFFFF"/>
-                <w:sz w:val="17"/>
-              </w:rPr>
-              <w:t xml:space="preserve">  PART D: Deriving Kinematic Equation 3  </w:t>
-            </w:r>
-          </w:p>
-          <w:p>
-            <w:pPr>
-              <w:spacing w:before="80" w:after="20"/>
-            </w:pPr>
-            <w:r>
-              <w:rPr>
-                <w:rFonts w:ascii="Calibri" w:hAnsi="Calibri"/>
-                <w:b/>
-                <w:i w:val="0"/>
-                <w:color w:val="505050"/>
+                <w:color w:val="555555"/>
                 <w:sz w:val="15"/>
               </w:rPr>
               <w:t xml:space="preserve">Activity: </w:t>
@@ -1260,7 +1172,7 @@
                 <w:rFonts w:ascii="Calibri" w:hAnsi="Calibri"/>
                 <w:b/>
                 <w:i w:val="0"/>
-                <w:color w:val="505050"/>
+                <w:color w:val="555555"/>
                 <w:sz w:val="15"/>
               </w:rPr>
               <w:t xml:space="preserve">Name: </w:t>
@@ -1270,7 +1182,7 @@
                 <w:rFonts w:ascii="Calibri" w:hAnsi="Calibri"/>
                 <w:b w:val="0"/>
                 <w:i w:val="0"/>
-                <w:color w:val="AAAAAA"/>
+                <w:color w:val="A5A5A5"/>
                 <w:sz w:val="15"/>
               </w:rPr>
               <w:t>______________________________________</w:t>
@@ -1278,14 +1190,14 @@
           </w:p>
           <w:p>
             <w:pPr>
-              <w:spacing w:before="20" w:after="60"/>
+              <w:spacing w:before="20" w:after="80"/>
             </w:pPr>
             <w:r>
               <w:rPr>
                 <w:rFonts w:ascii="Calibri" w:hAnsi="Calibri"/>
                 <w:b/>
                 <w:i w:val="0"/>
-                <w:color w:val="505050"/>
+                <w:color w:val="555555"/>
                 <w:sz w:val="15"/>
               </w:rPr>
               <w:t xml:space="preserve">Grade &amp; Section: </w:t>
@@ -1295,17 +1207,17 @@
                 <w:rFonts w:ascii="Calibri" w:hAnsi="Calibri"/>
                 <w:b w:val="0"/>
                 <w:i w:val="0"/>
-                <w:color w:val="AAAAAA"/>
+                <w:color w:val="A5A5A5"/>
                 <w:sz w:val="15"/>
               </w:rPr>
-              <w:t xml:space="preserve">_____________  </w:t>
+              <w:t xml:space="preserve">_____________   </w:t>
             </w:r>
             <w:r>
               <w:rPr>
                 <w:rFonts w:ascii="Calibri" w:hAnsi="Calibri"/>
                 <w:b/>
                 <w:i w:val="0"/>
-                <w:color w:val="505050"/>
+                <w:color w:val="555555"/>
                 <w:sz w:val="15"/>
               </w:rPr>
               <w:t xml:space="preserve">Date: </w:t>
@@ -1315,7 +1227,7 @@
                 <w:rFonts w:ascii="Calibri" w:hAnsi="Calibri"/>
                 <w:b w:val="0"/>
                 <w:i w:val="0"/>
-                <w:color w:val="AAAAAA"/>
+                <w:color w:val="A5A5A5"/>
                 <w:sz w:val="15"/>
               </w:rPr>
               <w:t>___________</w:t>
@@ -1323,45 +1235,46 @@
           </w:p>
           <w:p>
             <w:pPr>
-              <w:spacing w:before="0" w:after="60"/>
-              <w:jc w:val="center"/>
+              <w:spacing w:before="40" w:after="60"/>
+              <w:shd w:val="clear" w:color="auto" w:fill="E7E7E7"/>
+            </w:pPr>
+            <w:r>
+              <w:rPr>
+                <w:rFonts w:ascii="Calibri" w:hAnsi="Calibri"/>
+                <w:b/>
+                <w:i w:val="0"/>
+                <w:color w:val="282828"/>
+                <w:sz w:val="19"/>
+              </w:rPr>
+              <w:t xml:space="preserve"> PART D:  </w:t>
+            </w:r>
+            <w:r>
+              <w:rPr>
+                <w:rFonts w:ascii="Calibri" w:hAnsi="Calibri"/>
+                <w:b/>
+                <w:i w:val="0"/>
+                <w:color w:val="282828"/>
+                <w:sz w:val="19"/>
+              </w:rPr>
+              <w:t xml:space="preserve">Deriving Kinematic Equation 3 </w:t>
+            </w:r>
+          </w:p>
+          <w:p>
+            <w:pPr>
+              <w:spacing w:before="0" w:after="120"/>
+              <w:pBdr>
+                <w:bottom w:val="single" w:sz="4" w:space="2" w:color="CFCFCF"/>
+              </w:pBdr>
             </w:pPr>
             <w:r>
               <w:rPr>
                 <w:rFonts w:ascii="Calibri" w:hAnsi="Calibri"/>
                 <w:b w:val="0"/>
                 <w:i w:val="0"/>
-                <w:color w:val="BEBEBE"/>
-                <w:sz w:val="12"/>
-              </w:rPr>
-              <w:t>──────────────────────────────────────────</w:t>
-            </w:r>
-          </w:p>
-          <w:p>
-            <w:pPr>
-              <w:spacing w:before="20" w:after="80"/>
-              <w:jc w:val="center"/>
-              <w:shd w:val="clear" w:color="auto" w:fill="F0F0F0"/>
-            </w:pPr>
-            <w:r>
-              <w:rPr>
-                <w:rFonts w:ascii="Calibri" w:hAnsi="Calibri"/>
-                <w:b/>
-                <w:i w:val="0"/>
-                <w:color w:val="646464"/>
+                <w:color w:val="555555"/>
                 <w:sz w:val="15"/>
               </w:rPr>
-              <w:t xml:space="preserve"> GOAL:  </w:t>
-            </w:r>
-            <w:r>
-              <w:rPr>
-                <w:rFonts w:ascii="Calibri" w:hAnsi="Calibri"/>
-                <w:b w:val="0"/>
-                <w:i w:val="0"/>
-                <w:color w:val="646464"/>
-                <w:sz w:val="15"/>
-              </w:rPr>
-              <w:t xml:space="preserve">Derive  </w:t>
+              <w:t xml:space="preserve">Goal: Derive  </w:t>
             </w:r>
             <w:r>
               <w:rPr>
@@ -1373,19 +1286,10 @@
               </w:rPr>
               <w:t>v² = v₀² + 2a(x − x₀)</w:t>
             </w:r>
-            <w:r>
-              <w:rPr>
-                <w:rFonts w:ascii="Calibri" w:hAnsi="Calibri"/>
-                <w:b w:val="0"/>
-                <w:i w:val="0"/>
-                <w:sz w:val="15"/>
-              </w:rPr>
-              <w:t xml:space="preserve"> </w:t>
-            </w:r>
           </w:p>
           <w:p>
             <w:pPr>
-              <w:spacing w:before="40" w:after="20"/>
+              <w:spacing w:before="60" w:after="40"/>
             </w:pPr>
             <w:r>
               <w:rPr>
@@ -1395,7 +1299,7 @@
                 <w:color w:val="3C3C3C"/>
                 <w:sz w:val="15"/>
               </w:rPr>
-              <w:t xml:space="preserve">1. </w:t>
+              <w:t xml:space="preserve">1.  </w:t>
             </w:r>
             <w:r>
               <w:rPr>
@@ -1410,20 +1314,20 @@
           </w:p>
           <w:p>
             <w:pPr>
-              <w:spacing w:before="0" w:after="80"/>
+              <w:spacing w:before="0" w:after="885"/>
             </w:pPr>
             <w:r>
               <w:rPr>
                 <w:rFonts w:ascii="Calibri" w:hAnsi="Calibri"/>
                 <w:b w:val="0"/>
                 <w:i w:val="0"/>
-                <w:sz w:val="28"/>
+                <w:sz w:val="2"/>
               </w:rPr>
             </w:r>
           </w:p>
           <w:p>
             <w:pPr>
-              <w:spacing w:before="40" w:after="20"/>
+              <w:spacing w:before="60" w:after="40"/>
             </w:pPr>
             <w:r>
               <w:rPr>
@@ -1433,7 +1337,7 @@
                 <w:color w:val="3C3C3C"/>
                 <w:sz w:val="15"/>
               </w:rPr>
-              <w:t xml:space="preserve">2. </w:t>
+              <w:t xml:space="preserve">2.  </w:t>
             </w:r>
             <w:r>
               <w:rPr>
@@ -1448,20 +1352,20 @@
           </w:p>
           <w:p>
             <w:pPr>
-              <w:spacing w:before="0" w:after="80"/>
+              <w:spacing w:before="0" w:after="885"/>
             </w:pPr>
             <w:r>
               <w:rPr>
                 <w:rFonts w:ascii="Calibri" w:hAnsi="Calibri"/>
                 <w:b w:val="0"/>
                 <w:i w:val="0"/>
-                <w:sz w:val="28"/>
+                <w:sz w:val="2"/>
               </w:rPr>
             </w:r>
           </w:p>
           <w:p>
             <w:pPr>
-              <w:spacing w:before="40" w:after="20"/>
+              <w:spacing w:before="60" w:after="40"/>
             </w:pPr>
             <w:r>
               <w:rPr>
@@ -1471,7 +1375,7 @@
                 <w:color w:val="3C3C3C"/>
                 <w:sz w:val="15"/>
               </w:rPr>
-              <w:t xml:space="preserve">3. </w:t>
+              <w:t xml:space="preserve">3.  </w:t>
             </w:r>
             <w:r>
               <w:rPr>
@@ -1486,20 +1390,20 @@
           </w:p>
           <w:p>
             <w:pPr>
-              <w:spacing w:before="0" w:after="80"/>
+              <w:spacing w:before="0" w:after="885"/>
             </w:pPr>
             <w:r>
               <w:rPr>
                 <w:rFonts w:ascii="Calibri" w:hAnsi="Calibri"/>
                 <w:b w:val="0"/>
                 <w:i w:val="0"/>
-                <w:sz w:val="28"/>
+                <w:sz w:val="2"/>
               </w:rPr>
             </w:r>
           </w:p>
           <w:p>
             <w:pPr>
-              <w:spacing w:before="40" w:after="20"/>
+              <w:spacing w:before="60" w:after="40"/>
             </w:pPr>
             <w:r>
               <w:rPr>
@@ -1509,7 +1413,7 @@
                 <w:color w:val="3C3C3C"/>
                 <w:sz w:val="15"/>
               </w:rPr>
-              <w:t xml:space="preserve">4. </w:t>
+              <w:t xml:space="preserve">4.  </w:t>
             </w:r>
             <w:r>
               <w:rPr>
@@ -1524,20 +1428,20 @@
           </w:p>
           <w:p>
             <w:pPr>
-              <w:spacing w:before="0" w:after="80"/>
+              <w:spacing w:before="0" w:after="885"/>
             </w:pPr>
             <w:r>
               <w:rPr>
                 <w:rFonts w:ascii="Calibri" w:hAnsi="Calibri"/>
                 <w:b w:val="0"/>
                 <w:i w:val="0"/>
-                <w:sz w:val="28"/>
+                <w:sz w:val="2"/>
               </w:rPr>
             </w:r>
           </w:p>
           <w:p>
             <w:pPr>
-              <w:spacing w:before="40" w:after="20"/>
+              <w:spacing w:before="60" w:after="40"/>
             </w:pPr>
             <w:r>
               <w:rPr>
@@ -1547,7 +1451,7 @@
                 <w:color w:val="3C3C3C"/>
                 <w:sz w:val="15"/>
               </w:rPr>
-              <w:t xml:space="preserve">5. </w:t>
+              <w:t xml:space="preserve">5.  </w:t>
             </w:r>
             <w:r>
               <w:rPr>
@@ -1562,20 +1466,20 @@
           </w:p>
           <w:p>
             <w:pPr>
-              <w:spacing w:before="0" w:after="80"/>
+              <w:spacing w:before="0" w:after="885"/>
             </w:pPr>
             <w:r>
               <w:rPr>
                 <w:rFonts w:ascii="Calibri" w:hAnsi="Calibri"/>
                 <w:b w:val="0"/>
                 <w:i w:val="0"/>
-                <w:sz w:val="28"/>
+                <w:sz w:val="2"/>
               </w:rPr>
             </w:r>
           </w:p>
           <w:p>
             <w:pPr>
-              <w:spacing w:before="40" w:after="20"/>
+              <w:spacing w:before="60" w:after="40"/>
             </w:pPr>
             <w:r>
               <w:rPr>
@@ -1585,7 +1489,7 @@
                 <w:color w:val="3C3C3C"/>
                 <w:sz w:val="15"/>
               </w:rPr>
-              <w:t xml:space="preserve">6. </w:t>
+              <w:t xml:space="preserve">6.  </w:t>
             </w:r>
             <w:r>
               <w:rPr>
@@ -1600,20 +1504,20 @@
           </w:p>
           <w:p>
             <w:pPr>
-              <w:spacing w:before="0" w:after="80"/>
+              <w:spacing w:before="0" w:after="885"/>
             </w:pPr>
             <w:r>
               <w:rPr>
                 <w:rFonts w:ascii="Calibri" w:hAnsi="Calibri"/>
                 <w:b w:val="0"/>
                 <w:i w:val="0"/>
-                <w:sz w:val="28"/>
+                <w:sz w:val="2"/>
               </w:rPr>
             </w:r>
           </w:p>
           <w:p>
             <w:pPr>
-              <w:spacing w:before="40" w:after="20"/>
+              <w:spacing w:before="60" w:after="40"/>
             </w:pPr>
             <w:r>
               <w:rPr>
@@ -1623,7 +1527,7 @@
                 <w:color w:val="3C3C3C"/>
                 <w:sz w:val="15"/>
               </w:rPr>
-              <w:t xml:space="preserve">7. </w:t>
+              <w:t xml:space="preserve">7.  </w:t>
             </w:r>
             <w:r>
               <w:rPr>
@@ -1638,14 +1542,14 @@
           </w:p>
           <w:p>
             <w:pPr>
-              <w:spacing w:before="0" w:after="80"/>
+              <w:spacing w:before="0" w:after="885"/>
             </w:pPr>
             <w:r>
               <w:rPr>
                 <w:rFonts w:ascii="Calibri" w:hAnsi="Calibri"/>
                 <w:b w:val="0"/>
                 <w:i w:val="0"/>
-                <w:sz w:val="28"/>
+                <w:sz w:val="2"/>
               </w:rPr>
             </w:r>
           </w:p>
@@ -1667,7 +1571,7 @@
           <w:rFonts w:ascii="Calibri" w:hAnsi="Calibri"/>
           <w:b/>
           <w:i w:val="0"/>
-          <w:color w:val="960000"/>
+          <w:color w:val="BE0000"/>
           <w:sz w:val="20"/>
         </w:rPr>
         <w:t>TEACHER’S ANSWER KEY</w:t>
@@ -1686,6 +1590,7 @@
           <w:insideH w:val="nil"/>
           <w:insideV w:val="nil"/>
         </w:tblBorders>
+        <w:tblLayout w:type="fixed"/>
       </w:tblPr>
       <w:tblGrid>
         <w:gridCol w:w="4464"/>
@@ -1694,47 +1599,33 @@
         <w:gridCol w:w="4464"/>
       </w:tblGrid>
       <w:tr>
+        <w:trPr>
+          <w:trHeight w:val="10872" w:hRule="exact"/>
+        </w:trPr>
         <w:tc>
           <w:tcPr>
             <w:tcW w:type="dxa" w:w="4464"/>
             <w:vAlign w:val="top"/>
             <w:tcMar>
-              <w:top w:w="50" w:type="dxa"/>
-              <w:bottom w:w="30" w:type="dxa"/>
-              <w:left w:w="90" w:type="dxa"/>
-              <w:right w:w="90" w:type="dxa"/>
+              <w:top w:w="45" w:type="dxa"/>
+              <w:bottom w:w="20" w:type="dxa"/>
+              <w:left w:w="75" w:type="dxa"/>
+              <w:right w:w="75" w:type="dxa"/>
             </w:tcMar>
             <w:tcBorders>
-              <w:right w:val="dashed" w:sz="6" w:color="888888" w:space="0"/>
+              <w:right w:val="dashed" w:sz="6" w:color="999999" w:space="0"/>
             </w:tcBorders>
           </w:tcPr>
           <w:p>
             <w:pPr>
               <w:spacing w:before="0" w:after="20"/>
-              <w:jc w:val="center"/>
-              <w:shd w:val="clear" w:color="auto" w:fill="3D3D3D"/>
             </w:pPr>
             <w:r>
               <w:rPr>
                 <w:rFonts w:ascii="Calibri" w:hAnsi="Calibri"/>
                 <w:b/>
                 <w:i w:val="0"/>
-                <w:color w:val="FFFFFF"/>
-                <w:sz w:val="17"/>
-              </w:rPr>
-              <w:t xml:space="preserve">  PART A: Deriving Kinematic Equation 1  </w:t>
-            </w:r>
-          </w:p>
-          <w:p>
-            <w:pPr>
-              <w:spacing w:before="80" w:after="20"/>
-            </w:pPr>
-            <w:r>
-              <w:rPr>
-                <w:rFonts w:ascii="Calibri" w:hAnsi="Calibri"/>
-                <w:b/>
-                <w:i w:val="0"/>
-                <w:color w:val="505050"/>
+                <w:color w:val="555555"/>
                 <w:sz w:val="15"/>
               </w:rPr>
               <w:t xml:space="preserve">Activity: </w:t>
@@ -1759,7 +1650,7 @@
                 <w:rFonts w:ascii="Calibri" w:hAnsi="Calibri"/>
                 <w:b/>
                 <w:i w:val="0"/>
-                <w:color w:val="505050"/>
+                <w:color w:val="555555"/>
                 <w:sz w:val="15"/>
               </w:rPr>
               <w:t xml:space="preserve">Name: </w:t>
@@ -1769,7 +1660,7 @@
                 <w:rFonts w:ascii="Calibri" w:hAnsi="Calibri"/>
                 <w:b w:val="0"/>
                 <w:i w:val="0"/>
-                <w:color w:val="AAAAAA"/>
+                <w:color w:val="A5A5A5"/>
                 <w:sz w:val="15"/>
               </w:rPr>
               <w:t>______________________________________</w:t>
@@ -1777,14 +1668,14 @@
           </w:p>
           <w:p>
             <w:pPr>
-              <w:spacing w:before="20" w:after="60"/>
+              <w:spacing w:before="20" w:after="80"/>
             </w:pPr>
             <w:r>
               <w:rPr>
                 <w:rFonts w:ascii="Calibri" w:hAnsi="Calibri"/>
                 <w:b/>
                 <w:i w:val="0"/>
-                <w:color w:val="505050"/>
+                <w:color w:val="555555"/>
                 <w:sz w:val="15"/>
               </w:rPr>
               <w:t xml:space="preserve">Grade &amp; Section: </w:t>
@@ -1794,17 +1685,17 @@
                 <w:rFonts w:ascii="Calibri" w:hAnsi="Calibri"/>
                 <w:b w:val="0"/>
                 <w:i w:val="0"/>
-                <w:color w:val="AAAAAA"/>
+                <w:color w:val="A5A5A5"/>
                 <w:sz w:val="15"/>
               </w:rPr>
-              <w:t xml:space="preserve">_____________  </w:t>
+              <w:t xml:space="preserve">_____________   </w:t>
             </w:r>
             <w:r>
               <w:rPr>
                 <w:rFonts w:ascii="Calibri" w:hAnsi="Calibri"/>
                 <w:b/>
                 <w:i w:val="0"/>
-                <w:color w:val="505050"/>
+                <w:color w:val="555555"/>
                 <w:sz w:val="15"/>
               </w:rPr>
               <w:t xml:space="preserve">Date: </w:t>
@@ -1814,7 +1705,7 @@
                 <w:rFonts w:ascii="Calibri" w:hAnsi="Calibri"/>
                 <w:b w:val="0"/>
                 <w:i w:val="0"/>
-                <w:color w:val="AAAAAA"/>
+                <w:color w:val="A5A5A5"/>
                 <w:sz w:val="15"/>
               </w:rPr>
               <w:t>___________</w:t>
@@ -1822,45 +1713,46 @@
           </w:p>
           <w:p>
             <w:pPr>
-              <w:spacing w:before="0" w:after="60"/>
-              <w:jc w:val="center"/>
+              <w:spacing w:before="40" w:after="60"/>
+              <w:shd w:val="clear" w:color="auto" w:fill="E7E7E7"/>
+            </w:pPr>
+            <w:r>
+              <w:rPr>
+                <w:rFonts w:ascii="Calibri" w:hAnsi="Calibri"/>
+                <w:b/>
+                <w:i w:val="0"/>
+                <w:color w:val="282828"/>
+                <w:sz w:val="19"/>
+              </w:rPr>
+              <w:t xml:space="preserve"> PART A:  </w:t>
+            </w:r>
+            <w:r>
+              <w:rPr>
+                <w:rFonts w:ascii="Calibri" w:hAnsi="Calibri"/>
+                <w:b/>
+                <w:i w:val="0"/>
+                <w:color w:val="282828"/>
+                <w:sz w:val="19"/>
+              </w:rPr>
+              <w:t xml:space="preserve">Deriving Kinematic Equation 1 </w:t>
+            </w:r>
+          </w:p>
+          <w:p>
+            <w:pPr>
+              <w:spacing w:before="0" w:after="120"/>
+              <w:pBdr>
+                <w:bottom w:val="single" w:sz="4" w:space="2" w:color="CFCFCF"/>
+              </w:pBdr>
             </w:pPr>
             <w:r>
               <w:rPr>
                 <w:rFonts w:ascii="Calibri" w:hAnsi="Calibri"/>
                 <w:b w:val="0"/>
                 <w:i w:val="0"/>
-                <w:color w:val="BEBEBE"/>
-                <w:sz w:val="12"/>
-              </w:rPr>
-              <w:t>──────────────────────────────────────────</w:t>
-            </w:r>
-          </w:p>
-          <w:p>
-            <w:pPr>
-              <w:spacing w:before="20" w:after="80"/>
-              <w:jc w:val="center"/>
-              <w:shd w:val="clear" w:color="auto" w:fill="F0F0F0"/>
-            </w:pPr>
-            <w:r>
-              <w:rPr>
-                <w:rFonts w:ascii="Calibri" w:hAnsi="Calibri"/>
-                <w:b/>
-                <w:i w:val="0"/>
-                <w:color w:val="646464"/>
+                <w:color w:val="555555"/>
                 <w:sz w:val="15"/>
               </w:rPr>
-              <w:t xml:space="preserve"> GOAL:  </w:t>
-            </w:r>
-            <w:r>
-              <w:rPr>
-                <w:rFonts w:ascii="Calibri" w:hAnsi="Calibri"/>
-                <w:b w:val="0"/>
-                <w:i w:val="0"/>
-                <w:color w:val="646464"/>
-                <w:sz w:val="15"/>
-              </w:rPr>
-              <w:t xml:space="preserve">Derive  </w:t>
+              <w:t xml:space="preserve">Goal: Derive  </w:t>
             </w:r>
             <w:r>
               <w:rPr>
@@ -1872,19 +1764,10 @@
               </w:rPr>
               <w:t>v = v₀ + at</w:t>
             </w:r>
-            <w:r>
-              <w:rPr>
-                <w:rFonts w:ascii="Calibri" w:hAnsi="Calibri"/>
-                <w:b w:val="0"/>
-                <w:i w:val="0"/>
-                <w:sz w:val="15"/>
-              </w:rPr>
-              <w:t xml:space="preserve"> </w:t>
-            </w:r>
           </w:p>
           <w:p>
             <w:pPr>
-              <w:spacing w:before="40" w:after="20"/>
+              <w:spacing w:before="60" w:after="40"/>
             </w:pPr>
             <w:r>
               <w:rPr>
@@ -1894,7 +1777,7 @@
                 <w:color w:val="3C3C3C"/>
                 <w:sz w:val="15"/>
               </w:rPr>
-              <w:t xml:space="preserve">1. </w:t>
+              <w:t xml:space="preserve">1.  </w:t>
             </w:r>
             <w:r>
               <w:rPr>
@@ -1909,7 +1792,7 @@
           </w:p>
           <w:p>
             <w:pPr>
-              <w:spacing w:before="20" w:after="40"/>
+              <w:spacing w:before="40" w:after="1513"/>
             </w:pPr>
             <w:r>
               <w:rPr>
@@ -1918,22 +1801,22 @@
                 <w:i w:val="0"/>
                 <w:sz w:val="18"/>
               </w:rPr>
-              <w:t xml:space="preserve">    </w:t>
+              <w:t xml:space="preserve">      </w:t>
             </w:r>
             <w:r>
               <w:rPr>
                 <w:rFonts w:ascii="Calibri" w:hAnsi="Calibri"/>
                 <w:b/>
                 <w:i/>
-                <w:color w:val="C80000"/>
-                <w:sz w:val="17"/>
+                <w:color w:val="BE0000"/>
+                <w:sz w:val="18"/>
               </w:rPr>
               <w:t>a = Δv / Δt</w:t>
             </w:r>
           </w:p>
           <w:p>
             <w:pPr>
-              <w:spacing w:before="40" w:after="20"/>
+              <w:spacing w:before="60" w:after="40"/>
             </w:pPr>
             <w:r>
               <w:rPr>
@@ -1943,7 +1826,7 @@
                 <w:color w:val="3C3C3C"/>
                 <w:sz w:val="15"/>
               </w:rPr>
-              <w:t xml:space="preserve">2. </w:t>
+              <w:t xml:space="preserve">2.  </w:t>
             </w:r>
             <w:r>
               <w:rPr>
@@ -1958,7 +1841,7 @@
           </w:p>
           <w:p>
             <w:pPr>
-              <w:spacing w:before="20" w:after="40"/>
+              <w:spacing w:before="40" w:after="1513"/>
             </w:pPr>
             <w:r>
               <w:rPr>
@@ -1967,22 +1850,22 @@
                 <w:i w:val="0"/>
                 <w:sz w:val="18"/>
               </w:rPr>
-              <w:t xml:space="preserve">    </w:t>
+              <w:t xml:space="preserve">      </w:t>
             </w:r>
             <w:r>
               <w:rPr>
                 <w:rFonts w:ascii="Calibri" w:hAnsi="Calibri"/>
                 <w:b/>
                 <w:i/>
-                <w:color w:val="C80000"/>
-                <w:sz w:val="17"/>
+                <w:color w:val="BE0000"/>
+                <w:sz w:val="18"/>
               </w:rPr>
               <w:t>a = (v − v₀) / t</w:t>
             </w:r>
           </w:p>
           <w:p>
             <w:pPr>
-              <w:spacing w:before="40" w:after="20"/>
+              <w:spacing w:before="60" w:after="40"/>
             </w:pPr>
             <w:r>
               <w:rPr>
@@ -1992,7 +1875,7 @@
                 <w:color w:val="3C3C3C"/>
                 <w:sz w:val="15"/>
               </w:rPr>
-              <w:t xml:space="preserve">3. </w:t>
+              <w:t xml:space="preserve">3.  </w:t>
             </w:r>
             <w:r>
               <w:rPr>
@@ -2007,7 +1890,7 @@
           </w:p>
           <w:p>
             <w:pPr>
-              <w:spacing w:before="20" w:after="40"/>
+              <w:spacing w:before="40" w:after="1513"/>
             </w:pPr>
             <w:r>
               <w:rPr>
@@ -2016,22 +1899,22 @@
                 <w:i w:val="0"/>
                 <w:sz w:val="18"/>
               </w:rPr>
-              <w:t xml:space="preserve">    </w:t>
+              <w:t xml:space="preserve">      </w:t>
             </w:r>
             <w:r>
               <w:rPr>
                 <w:rFonts w:ascii="Calibri" w:hAnsi="Calibri"/>
                 <w:b/>
                 <w:i/>
-                <w:color w:val="C80000"/>
-                <w:sz w:val="17"/>
+                <w:color w:val="BE0000"/>
+                <w:sz w:val="18"/>
               </w:rPr>
               <w:t>at = v − v₀</w:t>
             </w:r>
           </w:p>
           <w:p>
             <w:pPr>
-              <w:spacing w:before="40" w:after="20"/>
+              <w:spacing w:before="60" w:after="40"/>
             </w:pPr>
             <w:r>
               <w:rPr>
@@ -2041,7 +1924,7 @@
                 <w:color w:val="3C3C3C"/>
                 <w:sz w:val="15"/>
               </w:rPr>
-              <w:t xml:space="preserve">4. </w:t>
+              <w:t xml:space="preserve">4.  </w:t>
             </w:r>
             <w:r>
               <w:rPr>
@@ -2056,7 +1939,7 @@
           </w:p>
           <w:p>
             <w:pPr>
-              <w:spacing w:before="20" w:after="40"/>
+              <w:spacing w:before="40" w:after="1513"/>
             </w:pPr>
             <w:r>
               <w:rPr>
@@ -2065,15 +1948,15 @@
                 <w:i w:val="0"/>
                 <w:sz w:val="18"/>
               </w:rPr>
-              <w:t xml:space="preserve">    </w:t>
+              <w:t xml:space="preserve">      </w:t>
             </w:r>
             <w:r>
               <w:rPr>
                 <w:rFonts w:ascii="Calibri" w:hAnsi="Calibri"/>
                 <w:b/>
                 <w:i/>
-                <w:color w:val="C80000"/>
-                <w:sz w:val="17"/>
+                <w:color w:val="BE0000"/>
+                <w:sz w:val="18"/>
               </w:rPr>
               <w:t>v = v₀ + at</w:t>
             </w:r>
@@ -2084,42 +1967,25 @@
             <w:tcW w:type="dxa" w:w="4464"/>
             <w:vAlign w:val="top"/>
             <w:tcMar>
-              <w:top w:w="50" w:type="dxa"/>
-              <w:bottom w:w="30" w:type="dxa"/>
-              <w:left w:w="90" w:type="dxa"/>
-              <w:right w:w="90" w:type="dxa"/>
+              <w:top w:w="45" w:type="dxa"/>
+              <w:bottom w:w="20" w:type="dxa"/>
+              <w:left w:w="75" w:type="dxa"/>
+              <w:right w:w="75" w:type="dxa"/>
             </w:tcMar>
             <w:tcBorders>
-              <w:right w:val="dashed" w:sz="6" w:color="888888" w:space="0"/>
+              <w:right w:val="dashed" w:sz="6" w:color="999999" w:space="0"/>
             </w:tcBorders>
           </w:tcPr>
           <w:p>
             <w:pPr>
               <w:spacing w:before="0" w:after="20"/>
-              <w:jc w:val="center"/>
-              <w:shd w:val="clear" w:color="auto" w:fill="3D3D3D"/>
             </w:pPr>
             <w:r>
               <w:rPr>
                 <w:rFonts w:ascii="Calibri" w:hAnsi="Calibri"/>
                 <w:b/>
                 <w:i w:val="0"/>
-                <w:color w:val="FFFFFF"/>
-                <w:sz w:val="17"/>
-              </w:rPr>
-              <w:t xml:space="preserve">  PART B: Deriving Kinematic Equation 4  </w:t>
-            </w:r>
-          </w:p>
-          <w:p>
-            <w:pPr>
-              <w:spacing w:before="80" w:after="20"/>
-            </w:pPr>
-            <w:r>
-              <w:rPr>
-                <w:rFonts w:ascii="Calibri" w:hAnsi="Calibri"/>
-                <w:b/>
-                <w:i w:val="0"/>
-                <w:color w:val="505050"/>
+                <w:color w:val="555555"/>
                 <w:sz w:val="15"/>
               </w:rPr>
               <w:t xml:space="preserve">Activity: </w:t>
@@ -2144,7 +2010,7 @@
                 <w:rFonts w:ascii="Calibri" w:hAnsi="Calibri"/>
                 <w:b/>
                 <w:i w:val="0"/>
-                <w:color w:val="505050"/>
+                <w:color w:val="555555"/>
                 <w:sz w:val="15"/>
               </w:rPr>
               <w:t xml:space="preserve">Name: </w:t>
@@ -2154,7 +2020,7 @@
                 <w:rFonts w:ascii="Calibri" w:hAnsi="Calibri"/>
                 <w:b w:val="0"/>
                 <w:i w:val="0"/>
-                <w:color w:val="AAAAAA"/>
+                <w:color w:val="A5A5A5"/>
                 <w:sz w:val="15"/>
               </w:rPr>
               <w:t>______________________________________</w:t>
@@ -2162,14 +2028,14 @@
           </w:p>
           <w:p>
             <w:pPr>
-              <w:spacing w:before="20" w:after="60"/>
+              <w:spacing w:before="20" w:after="80"/>
             </w:pPr>
             <w:r>
               <w:rPr>
                 <w:rFonts w:ascii="Calibri" w:hAnsi="Calibri"/>
                 <w:b/>
                 <w:i w:val="0"/>
-                <w:color w:val="505050"/>
+                <w:color w:val="555555"/>
                 <w:sz w:val="15"/>
               </w:rPr>
               <w:t xml:space="preserve">Grade &amp; Section: </w:t>
@@ -2179,17 +2045,17 @@
                 <w:rFonts w:ascii="Calibri" w:hAnsi="Calibri"/>
                 <w:b w:val="0"/>
                 <w:i w:val="0"/>
-                <w:color w:val="AAAAAA"/>
+                <w:color w:val="A5A5A5"/>
                 <w:sz w:val="15"/>
               </w:rPr>
-              <w:t xml:space="preserve">_____________  </w:t>
+              <w:t xml:space="preserve">_____________   </w:t>
             </w:r>
             <w:r>
               <w:rPr>
                 <w:rFonts w:ascii="Calibri" w:hAnsi="Calibri"/>
                 <w:b/>
                 <w:i w:val="0"/>
-                <w:color w:val="505050"/>
+                <w:color w:val="555555"/>
                 <w:sz w:val="15"/>
               </w:rPr>
               <w:t xml:space="preserve">Date: </w:t>
@@ -2199,7 +2065,7 @@
                 <w:rFonts w:ascii="Calibri" w:hAnsi="Calibri"/>
                 <w:b w:val="0"/>
                 <w:i w:val="0"/>
-                <w:color w:val="AAAAAA"/>
+                <w:color w:val="A5A5A5"/>
                 <w:sz w:val="15"/>
               </w:rPr>
               <w:t>___________</w:t>
@@ -2207,45 +2073,46 @@
           </w:p>
           <w:p>
             <w:pPr>
-              <w:spacing w:before="0" w:after="60"/>
-              <w:jc w:val="center"/>
+              <w:spacing w:before="40" w:after="60"/>
+              <w:shd w:val="clear" w:color="auto" w:fill="E7E7E7"/>
+            </w:pPr>
+            <w:r>
+              <w:rPr>
+                <w:rFonts w:ascii="Calibri" w:hAnsi="Calibri"/>
+                <w:b/>
+                <w:i w:val="0"/>
+                <w:color w:val="282828"/>
+                <w:sz w:val="19"/>
+              </w:rPr>
+              <w:t xml:space="preserve"> PART B:  </w:t>
+            </w:r>
+            <w:r>
+              <w:rPr>
+                <w:rFonts w:ascii="Calibri" w:hAnsi="Calibri"/>
+                <w:b/>
+                <w:i w:val="0"/>
+                <w:color w:val="282828"/>
+                <w:sz w:val="19"/>
+              </w:rPr>
+              <w:t xml:space="preserve">Deriving Kinematic Equation 4 </w:t>
+            </w:r>
+          </w:p>
+          <w:p>
+            <w:pPr>
+              <w:spacing w:before="0" w:after="120"/>
+              <w:pBdr>
+                <w:bottom w:val="single" w:sz="4" w:space="2" w:color="CFCFCF"/>
+              </w:pBdr>
             </w:pPr>
             <w:r>
               <w:rPr>
                 <w:rFonts w:ascii="Calibri" w:hAnsi="Calibri"/>
                 <w:b w:val="0"/>
                 <w:i w:val="0"/>
-                <w:color w:val="BEBEBE"/>
-                <w:sz w:val="12"/>
-              </w:rPr>
-              <w:t>──────────────────────────────────────────</w:t>
-            </w:r>
-          </w:p>
-          <w:p>
-            <w:pPr>
-              <w:spacing w:before="20" w:after="80"/>
-              <w:jc w:val="center"/>
-              <w:shd w:val="clear" w:color="auto" w:fill="F0F0F0"/>
-            </w:pPr>
-            <w:r>
-              <w:rPr>
-                <w:rFonts w:ascii="Calibri" w:hAnsi="Calibri"/>
-                <w:b/>
-                <w:i w:val="0"/>
-                <w:color w:val="646464"/>
+                <w:color w:val="555555"/>
                 <w:sz w:val="15"/>
               </w:rPr>
-              <w:t xml:space="preserve"> GOAL:  </w:t>
-            </w:r>
-            <w:r>
-              <w:rPr>
-                <w:rFonts w:ascii="Calibri" w:hAnsi="Calibri"/>
-                <w:b w:val="0"/>
-                <w:i w:val="0"/>
-                <w:color w:val="646464"/>
-                <w:sz w:val="15"/>
-              </w:rPr>
-              <w:t xml:space="preserve">Derive  </w:t>
+              <w:t xml:space="preserve">Goal: Derive  </w:t>
             </w:r>
             <w:r>
               <w:rPr>
@@ -2257,19 +2124,10 @@
               </w:rPr>
               <w:t>x = x₀ + ½(v₀ + v)t</w:t>
             </w:r>
-            <w:r>
-              <w:rPr>
-                <w:rFonts w:ascii="Calibri" w:hAnsi="Calibri"/>
-                <w:b w:val="0"/>
-                <w:i w:val="0"/>
-                <w:sz w:val="15"/>
-              </w:rPr>
-              <w:t xml:space="preserve"> </w:t>
-            </w:r>
           </w:p>
           <w:p>
             <w:pPr>
-              <w:spacing w:before="40" w:after="20"/>
+              <w:spacing w:before="60" w:after="40"/>
             </w:pPr>
             <w:r>
               <w:rPr>
@@ -2279,7 +2137,7 @@
                 <w:color w:val="3C3C3C"/>
                 <w:sz w:val="15"/>
               </w:rPr>
-              <w:t xml:space="preserve">1. </w:t>
+              <w:t xml:space="preserve">1.  </w:t>
             </w:r>
             <w:r>
               <w:rPr>
@@ -2294,7 +2152,7 @@
           </w:p>
           <w:p>
             <w:pPr>
-              <w:spacing w:before="20" w:after="40"/>
+              <w:spacing w:before="40" w:after="705"/>
             </w:pPr>
             <w:r>
               <w:rPr>
@@ -2303,22 +2161,22 @@
                 <w:i w:val="0"/>
                 <w:sz w:val="18"/>
               </w:rPr>
-              <w:t xml:space="preserve">    </w:t>
+              <w:t xml:space="preserve">      </w:t>
             </w:r>
             <w:r>
               <w:rPr>
                 <w:rFonts w:ascii="Calibri" w:hAnsi="Calibri"/>
                 <w:b/>
                 <w:i/>
-                <w:color w:val="C80000"/>
-                <w:sz w:val="17"/>
+                <w:color w:val="BE0000"/>
+                <w:sz w:val="18"/>
               </w:rPr>
               <w:t>v̄ = Δx / Δt</w:t>
             </w:r>
           </w:p>
           <w:p>
             <w:pPr>
-              <w:spacing w:before="40" w:after="20"/>
+              <w:spacing w:before="60" w:after="40"/>
             </w:pPr>
             <w:r>
               <w:rPr>
@@ -2328,7 +2186,7 @@
                 <w:color w:val="3C3C3C"/>
                 <w:sz w:val="15"/>
               </w:rPr>
-              <w:t xml:space="preserve">2. </w:t>
+              <w:t xml:space="preserve">2.  </w:t>
             </w:r>
             <w:r>
               <w:rPr>
@@ -2343,7 +2201,7 @@
           </w:p>
           <w:p>
             <w:pPr>
-              <w:spacing w:before="20" w:after="40"/>
+              <w:spacing w:before="40" w:after="705"/>
             </w:pPr>
             <w:r>
               <w:rPr>
@@ -2352,22 +2210,22 @@
                 <w:i w:val="0"/>
                 <w:sz w:val="18"/>
               </w:rPr>
-              <w:t xml:space="preserve">    </w:t>
+              <w:t xml:space="preserve">      </w:t>
             </w:r>
             <w:r>
               <w:rPr>
                 <w:rFonts w:ascii="Calibri" w:hAnsi="Calibri"/>
                 <w:b/>
                 <w:i/>
-                <w:color w:val="C80000"/>
-                <w:sz w:val="17"/>
+                <w:color w:val="BE0000"/>
+                <w:sz w:val="18"/>
               </w:rPr>
               <w:t>v̄ = (x − x₀) / t</w:t>
             </w:r>
           </w:p>
           <w:p>
             <w:pPr>
-              <w:spacing w:before="40" w:after="20"/>
+              <w:spacing w:before="60" w:after="40"/>
             </w:pPr>
             <w:r>
               <w:rPr>
@@ -2377,7 +2235,7 @@
                 <w:color w:val="3C3C3C"/>
                 <w:sz w:val="15"/>
               </w:rPr>
-              <w:t xml:space="preserve">3. </w:t>
+              <w:t xml:space="preserve">3.  </w:t>
             </w:r>
             <w:r>
               <w:rPr>
@@ -2392,7 +2250,7 @@
           </w:p>
           <w:p>
             <w:pPr>
-              <w:spacing w:before="20" w:after="40"/>
+              <w:spacing w:before="40" w:after="705"/>
             </w:pPr>
             <w:r>
               <w:rPr>
@@ -2401,22 +2259,22 @@
                 <w:i w:val="0"/>
                 <w:sz w:val="18"/>
               </w:rPr>
-              <w:t xml:space="preserve">    </w:t>
+              <w:t xml:space="preserve">      </w:t>
             </w:r>
             <w:r>
               <w:rPr>
                 <w:rFonts w:ascii="Calibri" w:hAnsi="Calibri"/>
                 <w:b/>
                 <w:i/>
-                <w:color w:val="C80000"/>
-                <w:sz w:val="17"/>
+                <w:color w:val="BE0000"/>
+                <w:sz w:val="18"/>
               </w:rPr>
               <w:t>v̄ · t = x − x₀</w:t>
             </w:r>
           </w:p>
           <w:p>
             <w:pPr>
-              <w:spacing w:before="40" w:after="20"/>
+              <w:spacing w:before="60" w:after="40"/>
             </w:pPr>
             <w:r>
               <w:rPr>
@@ -2426,7 +2284,7 @@
                 <w:color w:val="3C3C3C"/>
                 <w:sz w:val="15"/>
               </w:rPr>
-              <w:t xml:space="preserve">4. </w:t>
+              <w:t xml:space="preserve">4.  </w:t>
             </w:r>
             <w:r>
               <w:rPr>
@@ -2441,7 +2299,7 @@
           </w:p>
           <w:p>
             <w:pPr>
-              <w:spacing w:before="20" w:after="40"/>
+              <w:spacing w:before="40" w:after="705"/>
             </w:pPr>
             <w:r>
               <w:rPr>
@@ -2450,22 +2308,22 @@
                 <w:i w:val="0"/>
                 <w:sz w:val="18"/>
               </w:rPr>
-              <w:t xml:space="preserve">    </w:t>
+              <w:t xml:space="preserve">      </w:t>
             </w:r>
             <w:r>
               <w:rPr>
                 <w:rFonts w:ascii="Calibri" w:hAnsi="Calibri"/>
                 <w:b/>
                 <w:i/>
-                <w:color w:val="C80000"/>
-                <w:sz w:val="17"/>
+                <w:color w:val="BE0000"/>
+                <w:sz w:val="18"/>
               </w:rPr>
               <w:t>x = x₀ + v̄ · t</w:t>
             </w:r>
           </w:p>
           <w:p>
             <w:pPr>
-              <w:spacing w:before="40" w:after="20"/>
+              <w:spacing w:before="60" w:after="40"/>
             </w:pPr>
             <w:r>
               <w:rPr>
@@ -2475,7 +2333,7 @@
                 <w:color w:val="3C3C3C"/>
                 <w:sz w:val="15"/>
               </w:rPr>
-              <w:t xml:space="preserve">5. </w:t>
+              <w:t xml:space="preserve">5.  </w:t>
             </w:r>
             <w:r>
               <w:rPr>
@@ -2490,7 +2348,7 @@
           </w:p>
           <w:p>
             <w:pPr>
-              <w:spacing w:before="20" w:after="40"/>
+              <w:spacing w:before="40" w:after="705"/>
             </w:pPr>
             <w:r>
               <w:rPr>
@@ -2499,22 +2357,22 @@
                 <w:i w:val="0"/>
                 <w:sz w:val="18"/>
               </w:rPr>
-              <w:t xml:space="preserve">    </w:t>
+              <w:t xml:space="preserve">      </w:t>
             </w:r>
             <w:r>
               <w:rPr>
                 <w:rFonts w:ascii="Calibri" w:hAnsi="Calibri"/>
                 <w:b/>
                 <w:i/>
-                <w:color w:val="C80000"/>
-                <w:sz w:val="17"/>
+                <w:color w:val="BE0000"/>
+                <w:sz w:val="18"/>
               </w:rPr>
               <w:t>v̄ = (v₀ + v) / 2</w:t>
             </w:r>
           </w:p>
           <w:p>
             <w:pPr>
-              <w:spacing w:before="40" w:after="20"/>
+              <w:spacing w:before="60" w:after="40"/>
             </w:pPr>
             <w:r>
               <w:rPr>
@@ -2524,7 +2382,7 @@
                 <w:color w:val="3C3C3C"/>
                 <w:sz w:val="15"/>
               </w:rPr>
-              <w:t xml:space="preserve">6. </w:t>
+              <w:t xml:space="preserve">6.  </w:t>
             </w:r>
             <w:r>
               <w:rPr>
@@ -2539,7 +2397,7 @@
           </w:p>
           <w:p>
             <w:pPr>
-              <w:spacing w:before="20" w:after="40"/>
+              <w:spacing w:before="40" w:after="705"/>
             </w:pPr>
             <w:r>
               <w:rPr>
@@ -2548,15 +2406,15 @@
                 <w:i w:val="0"/>
                 <w:sz w:val="18"/>
               </w:rPr>
-              <w:t xml:space="preserve">    </w:t>
+              <w:t xml:space="preserve">      </w:t>
             </w:r>
             <w:r>
               <w:rPr>
                 <w:rFonts w:ascii="Calibri" w:hAnsi="Calibri"/>
                 <w:b/>
                 <w:i/>
-                <w:color w:val="C80000"/>
-                <w:sz w:val="17"/>
+                <w:color w:val="BE0000"/>
+                <w:sz w:val="18"/>
               </w:rPr>
               <w:t>x = x₀ + ½(v₀ + v)t</w:t>
             </w:r>
@@ -2567,42 +2425,25 @@
             <w:tcW w:type="dxa" w:w="4464"/>
             <w:vAlign w:val="top"/>
             <w:tcMar>
-              <w:top w:w="50" w:type="dxa"/>
-              <w:bottom w:w="30" w:type="dxa"/>
-              <w:left w:w="90" w:type="dxa"/>
-              <w:right w:w="90" w:type="dxa"/>
+              <w:top w:w="45" w:type="dxa"/>
+              <w:bottom w:w="20" w:type="dxa"/>
+              <w:left w:w="75" w:type="dxa"/>
+              <w:right w:w="75" w:type="dxa"/>
             </w:tcMar>
             <w:tcBorders>
-              <w:right w:val="dashed" w:sz="6" w:color="888888" w:space="0"/>
+              <w:right w:val="dashed" w:sz="6" w:color="999999" w:space="0"/>
             </w:tcBorders>
           </w:tcPr>
           <w:p>
             <w:pPr>
               <w:spacing w:before="0" w:after="20"/>
-              <w:jc w:val="center"/>
-              <w:shd w:val="clear" w:color="auto" w:fill="3D3D3D"/>
             </w:pPr>
             <w:r>
               <w:rPr>
                 <w:rFonts w:ascii="Calibri" w:hAnsi="Calibri"/>
                 <w:b/>
                 <w:i w:val="0"/>
-                <w:color w:val="FFFFFF"/>
-                <w:sz w:val="17"/>
-              </w:rPr>
-              <w:t xml:space="preserve">  PART C: Deriving Kinematic Equation 2  </w:t>
-            </w:r>
-          </w:p>
-          <w:p>
-            <w:pPr>
-              <w:spacing w:before="80" w:after="20"/>
-            </w:pPr>
-            <w:r>
-              <w:rPr>
-                <w:rFonts w:ascii="Calibri" w:hAnsi="Calibri"/>
-                <w:b/>
-                <w:i w:val="0"/>
-                <w:color w:val="505050"/>
+                <w:color w:val="555555"/>
                 <w:sz w:val="15"/>
               </w:rPr>
               <w:t xml:space="preserve">Activity: </w:t>
@@ -2627,7 +2468,7 @@
                 <w:rFonts w:ascii="Calibri" w:hAnsi="Calibri"/>
                 <w:b/>
                 <w:i w:val="0"/>
-                <w:color w:val="505050"/>
+                <w:color w:val="555555"/>
                 <w:sz w:val="15"/>
               </w:rPr>
               <w:t xml:space="preserve">Name: </w:t>
@@ -2637,7 +2478,7 @@
                 <w:rFonts w:ascii="Calibri" w:hAnsi="Calibri"/>
                 <w:b w:val="0"/>
                 <w:i w:val="0"/>
-                <w:color w:val="AAAAAA"/>
+                <w:color w:val="A5A5A5"/>
                 <w:sz w:val="15"/>
               </w:rPr>
               <w:t>______________________________________</w:t>
@@ -2645,14 +2486,14 @@
           </w:p>
           <w:p>
             <w:pPr>
-              <w:spacing w:before="20" w:after="60"/>
+              <w:spacing w:before="20" w:after="80"/>
             </w:pPr>
             <w:r>
               <w:rPr>
                 <w:rFonts w:ascii="Calibri" w:hAnsi="Calibri"/>
                 <w:b/>
                 <w:i w:val="0"/>
-                <w:color w:val="505050"/>
+                <w:color w:val="555555"/>
                 <w:sz w:val="15"/>
               </w:rPr>
               <w:t xml:space="preserve">Grade &amp; Section: </w:t>
@@ -2662,17 +2503,17 @@
                 <w:rFonts w:ascii="Calibri" w:hAnsi="Calibri"/>
                 <w:b w:val="0"/>
                 <w:i w:val="0"/>
-                <w:color w:val="AAAAAA"/>
+                <w:color w:val="A5A5A5"/>
                 <w:sz w:val="15"/>
               </w:rPr>
-              <w:t xml:space="preserve">_____________  </w:t>
+              <w:t xml:space="preserve">_____________   </w:t>
             </w:r>
             <w:r>
               <w:rPr>
                 <w:rFonts w:ascii="Calibri" w:hAnsi="Calibri"/>
                 <w:b/>
                 <w:i w:val="0"/>
-                <w:color w:val="505050"/>
+                <w:color w:val="555555"/>
                 <w:sz w:val="15"/>
               </w:rPr>
               <w:t xml:space="preserve">Date: </w:t>
@@ -2682,7 +2523,7 @@
                 <w:rFonts w:ascii="Calibri" w:hAnsi="Calibri"/>
                 <w:b w:val="0"/>
                 <w:i w:val="0"/>
-                <w:color w:val="AAAAAA"/>
+                <w:color w:val="A5A5A5"/>
                 <w:sz w:val="15"/>
               </w:rPr>
               <w:t>___________</w:t>
@@ -2690,45 +2531,46 @@
           </w:p>
           <w:p>
             <w:pPr>
-              <w:spacing w:before="0" w:after="60"/>
-              <w:jc w:val="center"/>
+              <w:spacing w:before="40" w:after="60"/>
+              <w:shd w:val="clear" w:color="auto" w:fill="E7E7E7"/>
+            </w:pPr>
+            <w:r>
+              <w:rPr>
+                <w:rFonts w:ascii="Calibri" w:hAnsi="Calibri"/>
+                <w:b/>
+                <w:i w:val="0"/>
+                <w:color w:val="282828"/>
+                <w:sz w:val="19"/>
+              </w:rPr>
+              <w:t xml:space="preserve"> PART C:  </w:t>
+            </w:r>
+            <w:r>
+              <w:rPr>
+                <w:rFonts w:ascii="Calibri" w:hAnsi="Calibri"/>
+                <w:b/>
+                <w:i w:val="0"/>
+                <w:color w:val="282828"/>
+                <w:sz w:val="19"/>
+              </w:rPr>
+              <w:t xml:space="preserve">Deriving Kinematic Equation 2 </w:t>
+            </w:r>
+          </w:p>
+          <w:p>
+            <w:pPr>
+              <w:spacing w:before="0" w:after="120"/>
+              <w:pBdr>
+                <w:bottom w:val="single" w:sz="4" w:space="2" w:color="CFCFCF"/>
+              </w:pBdr>
             </w:pPr>
             <w:r>
               <w:rPr>
                 <w:rFonts w:ascii="Calibri" w:hAnsi="Calibri"/>
                 <w:b w:val="0"/>
                 <w:i w:val="0"/>
-                <w:color w:val="BEBEBE"/>
-                <w:sz w:val="12"/>
-              </w:rPr>
-              <w:t>──────────────────────────────────────────</w:t>
-            </w:r>
-          </w:p>
-          <w:p>
-            <w:pPr>
-              <w:spacing w:before="20" w:after="80"/>
-              <w:jc w:val="center"/>
-              <w:shd w:val="clear" w:color="auto" w:fill="F0F0F0"/>
-            </w:pPr>
-            <w:r>
-              <w:rPr>
-                <w:rFonts w:ascii="Calibri" w:hAnsi="Calibri"/>
-                <w:b/>
-                <w:i w:val="0"/>
-                <w:color w:val="646464"/>
+                <w:color w:val="555555"/>
                 <w:sz w:val="15"/>
               </w:rPr>
-              <w:t xml:space="preserve"> GOAL:  </w:t>
-            </w:r>
-            <w:r>
-              <w:rPr>
-                <w:rFonts w:ascii="Calibri" w:hAnsi="Calibri"/>
-                <w:b w:val="0"/>
-                <w:i w:val="0"/>
-                <w:color w:val="646464"/>
-                <w:sz w:val="15"/>
-              </w:rPr>
-              <w:t xml:space="preserve">Derive  </w:t>
+              <w:t xml:space="preserve">Goal: Derive  </w:t>
             </w:r>
             <w:r>
               <w:rPr>
@@ -2740,19 +2582,10 @@
               </w:rPr>
               <w:t>x = x₀ + v₀t + ½at²</w:t>
             </w:r>
-            <w:r>
-              <w:rPr>
-                <w:rFonts w:ascii="Calibri" w:hAnsi="Calibri"/>
-                <w:b w:val="0"/>
-                <w:i w:val="0"/>
-                <w:sz w:val="15"/>
-              </w:rPr>
-              <w:t xml:space="preserve"> </w:t>
-            </w:r>
           </w:p>
           <w:p>
             <w:pPr>
-              <w:spacing w:before="40" w:after="20"/>
+              <w:spacing w:before="60" w:after="40"/>
             </w:pPr>
             <w:r>
               <w:rPr>
@@ -2762,7 +2595,7 @@
                 <w:color w:val="3C3C3C"/>
                 <w:sz w:val="15"/>
               </w:rPr>
-              <w:t xml:space="preserve">1. </w:t>
+              <w:t xml:space="preserve">1.  </w:t>
             </w:r>
             <w:r>
               <w:rPr>
@@ -2777,7 +2610,7 @@
           </w:p>
           <w:p>
             <w:pPr>
-              <w:spacing w:before="20" w:after="40"/>
+              <w:spacing w:before="40" w:after="864"/>
             </w:pPr>
             <w:r>
               <w:rPr>
@@ -2786,22 +2619,22 @@
                 <w:i w:val="0"/>
                 <w:sz w:val="18"/>
               </w:rPr>
-              <w:t xml:space="preserve">    </w:t>
+              <w:t xml:space="preserve">      </w:t>
             </w:r>
             <w:r>
               <w:rPr>
                 <w:rFonts w:ascii="Calibri" w:hAnsi="Calibri"/>
                 <w:b/>
                 <w:i/>
-                <w:color w:val="C80000"/>
-                <w:sz w:val="17"/>
+                <w:color w:val="BE0000"/>
+                <w:sz w:val="18"/>
               </w:rPr>
               <w:t>v = v₀ + at</w:t>
             </w:r>
           </w:p>
           <w:p>
             <w:pPr>
-              <w:spacing w:before="40" w:after="20"/>
+              <w:spacing w:before="60" w:after="40"/>
             </w:pPr>
             <w:r>
               <w:rPr>
@@ -2811,7 +2644,7 @@
                 <w:color w:val="3C3C3C"/>
                 <w:sz w:val="15"/>
               </w:rPr>
-              <w:t xml:space="preserve">2. </w:t>
+              <w:t xml:space="preserve">2.  </w:t>
             </w:r>
             <w:r>
               <w:rPr>
@@ -2826,7 +2659,7 @@
           </w:p>
           <w:p>
             <w:pPr>
-              <w:spacing w:before="20" w:after="40"/>
+              <w:spacing w:before="40" w:after="864"/>
             </w:pPr>
             <w:r>
               <w:rPr>
@@ -2835,22 +2668,22 @@
                 <w:i w:val="0"/>
                 <w:sz w:val="18"/>
               </w:rPr>
-              <w:t xml:space="preserve">    </w:t>
+              <w:t xml:space="preserve">      </w:t>
             </w:r>
             <w:r>
               <w:rPr>
                 <w:rFonts w:ascii="Calibri" w:hAnsi="Calibri"/>
                 <w:b/>
                 <w:i/>
-                <w:color w:val="C80000"/>
-                <w:sz w:val="17"/>
+                <w:color w:val="BE0000"/>
+                <w:sz w:val="18"/>
               </w:rPr>
               <w:t>x = x₀ + ½(v₀ + v)t</w:t>
             </w:r>
           </w:p>
           <w:p>
             <w:pPr>
-              <w:spacing w:before="40" w:after="20"/>
+              <w:spacing w:before="60" w:after="40"/>
             </w:pPr>
             <w:r>
               <w:rPr>
@@ -2860,7 +2693,7 @@
                 <w:color w:val="3C3C3C"/>
                 <w:sz w:val="15"/>
               </w:rPr>
-              <w:t xml:space="preserve">3. </w:t>
+              <w:t xml:space="preserve">3.  </w:t>
             </w:r>
             <w:r>
               <w:rPr>
@@ -2875,7 +2708,7 @@
           </w:p>
           <w:p>
             <w:pPr>
-              <w:spacing w:before="20" w:after="40"/>
+              <w:spacing w:before="40" w:after="864"/>
             </w:pPr>
             <w:r>
               <w:rPr>
@@ -2884,22 +2717,22 @@
                 <w:i w:val="0"/>
                 <w:sz w:val="18"/>
               </w:rPr>
-              <w:t xml:space="preserve">    </w:t>
+              <w:t xml:space="preserve">      </w:t>
             </w:r>
             <w:r>
               <w:rPr>
                 <w:rFonts w:ascii="Calibri" w:hAnsi="Calibri"/>
                 <w:b/>
                 <w:i/>
-                <w:color w:val="C80000"/>
-                <w:sz w:val="17"/>
+                <w:color w:val="BE0000"/>
+                <w:sz w:val="18"/>
               </w:rPr>
               <w:t>x = x₀ + ½(v₀ + v₀ + at)·t</w:t>
             </w:r>
           </w:p>
           <w:p>
             <w:pPr>
-              <w:spacing w:before="40" w:after="20"/>
+              <w:spacing w:before="60" w:after="40"/>
             </w:pPr>
             <w:r>
               <w:rPr>
@@ -2909,7 +2742,7 @@
                 <w:color w:val="3C3C3C"/>
                 <w:sz w:val="15"/>
               </w:rPr>
-              <w:t xml:space="preserve">4. </w:t>
+              <w:t xml:space="preserve">4.  </w:t>
             </w:r>
             <w:r>
               <w:rPr>
@@ -2924,7 +2757,7 @@
           </w:p>
           <w:p>
             <w:pPr>
-              <w:spacing w:before="20" w:after="40"/>
+              <w:spacing w:before="40" w:after="864"/>
             </w:pPr>
             <w:r>
               <w:rPr>
@@ -2933,22 +2766,22 @@
                 <w:i w:val="0"/>
                 <w:sz w:val="18"/>
               </w:rPr>
-              <w:t xml:space="preserve">    </w:t>
+              <w:t xml:space="preserve">      </w:t>
             </w:r>
             <w:r>
               <w:rPr>
                 <w:rFonts w:ascii="Calibri" w:hAnsi="Calibri"/>
                 <w:b/>
                 <w:i/>
-                <w:color w:val="C80000"/>
-                <w:sz w:val="17"/>
+                <w:color w:val="BE0000"/>
+                <w:sz w:val="18"/>
               </w:rPr>
               <w:t>x = x₀ + ½(2v₀ + at)·t</w:t>
             </w:r>
           </w:p>
           <w:p>
             <w:pPr>
-              <w:spacing w:before="40" w:after="20"/>
+              <w:spacing w:before="60" w:after="40"/>
             </w:pPr>
             <w:r>
               <w:rPr>
@@ -2958,7 +2791,7 @@
                 <w:color w:val="3C3C3C"/>
                 <w:sz w:val="15"/>
               </w:rPr>
-              <w:t xml:space="preserve">5. </w:t>
+              <w:t xml:space="preserve">5.  </w:t>
             </w:r>
             <w:r>
               <w:rPr>
@@ -2973,7 +2806,7 @@
           </w:p>
           <w:p>
             <w:pPr>
-              <w:spacing w:before="20" w:after="40"/>
+              <w:spacing w:before="40" w:after="864"/>
             </w:pPr>
             <w:r>
               <w:rPr>
@@ -2982,22 +2815,22 @@
                 <w:i w:val="0"/>
                 <w:sz w:val="18"/>
               </w:rPr>
-              <w:t xml:space="preserve">    </w:t>
+              <w:t xml:space="preserve">      </w:t>
             </w:r>
             <w:r>
               <w:rPr>
                 <w:rFonts w:ascii="Calibri" w:hAnsi="Calibri"/>
                 <w:b/>
                 <w:i/>
-                <w:color w:val="C80000"/>
-                <w:sz w:val="17"/>
+                <w:color w:val="BE0000"/>
+                <w:sz w:val="18"/>
               </w:rPr>
               <w:t>x = x₀ + ½(2v₀t + at²)</w:t>
             </w:r>
           </w:p>
           <w:p>
             <w:pPr>
-              <w:spacing w:before="40" w:after="20"/>
+              <w:spacing w:before="60" w:after="40"/>
             </w:pPr>
             <w:r>
               <w:rPr>
@@ -3007,7 +2840,7 @@
                 <w:color w:val="3C3C3C"/>
                 <w:sz w:val="15"/>
               </w:rPr>
-              <w:t xml:space="preserve">6. </w:t>
+              <w:t xml:space="preserve">6.  </w:t>
             </w:r>
             <w:r>
               <w:rPr>
@@ -3022,7 +2855,7 @@
           </w:p>
           <w:p>
             <w:pPr>
-              <w:spacing w:before="20" w:after="40"/>
+              <w:spacing w:before="40" w:after="864"/>
             </w:pPr>
             <w:r>
               <w:rPr>
@@ -3031,15 +2864,15 @@
                 <w:i w:val="0"/>
                 <w:sz w:val="18"/>
               </w:rPr>
-              <w:t xml:space="preserve">    </w:t>
+              <w:t xml:space="preserve">      </w:t>
             </w:r>
             <w:r>
               <w:rPr>
                 <w:rFonts w:ascii="Calibri" w:hAnsi="Calibri"/>
                 <w:b/>
                 <w:i/>
-                <w:color w:val="C80000"/>
-                <w:sz w:val="17"/>
+                <w:color w:val="BE0000"/>
+                <w:sz w:val="18"/>
               </w:rPr>
               <w:t>x = x₀ + v₀t + ½at²</w:t>
             </w:r>
@@ -3050,39 +2883,22 @@
             <w:tcW w:type="dxa" w:w="4464"/>
             <w:vAlign w:val="top"/>
             <w:tcMar>
-              <w:top w:w="50" w:type="dxa"/>
-              <w:bottom w:w="30" w:type="dxa"/>
-              <w:left w:w="90" w:type="dxa"/>
-              <w:right w:w="90" w:type="dxa"/>
+              <w:top w:w="45" w:type="dxa"/>
+              <w:bottom w:w="20" w:type="dxa"/>
+              <w:left w:w="75" w:type="dxa"/>
+              <w:right w:w="75" w:type="dxa"/>
             </w:tcMar>
           </w:tcPr>
           <w:p>
             <w:pPr>
               <w:spacing w:before="0" w:after="20"/>
-              <w:jc w:val="center"/>
-              <w:shd w:val="clear" w:color="auto" w:fill="3D3D3D"/>
             </w:pPr>
             <w:r>
               <w:rPr>
                 <w:rFonts w:ascii="Calibri" w:hAnsi="Calibri"/>
                 <w:b/>
                 <w:i w:val="0"/>
-                <w:color w:val="FFFFFF"/>
-                <w:sz w:val="17"/>
-              </w:rPr>
-              <w:t xml:space="preserve">  PART D: Deriving Kinematic Equation 3  </w:t>
-            </w:r>
-          </w:p>
-          <w:p>
-            <w:pPr>
-              <w:spacing w:before="80" w:after="20"/>
-            </w:pPr>
-            <w:r>
-              <w:rPr>
-                <w:rFonts w:ascii="Calibri" w:hAnsi="Calibri"/>
-                <w:b/>
-                <w:i w:val="0"/>
-                <w:color w:val="505050"/>
+                <w:color w:val="555555"/>
                 <w:sz w:val="15"/>
               </w:rPr>
               <w:t xml:space="preserve">Activity: </w:t>
@@ -3107,7 +2923,7 @@
                 <w:rFonts w:ascii="Calibri" w:hAnsi="Calibri"/>
                 <w:b/>
                 <w:i w:val="0"/>
-                <w:color w:val="505050"/>
+                <w:color w:val="555555"/>
                 <w:sz w:val="15"/>
               </w:rPr>
               <w:t xml:space="preserve">Name: </w:t>
@@ -3117,7 +2933,7 @@
                 <w:rFonts w:ascii="Calibri" w:hAnsi="Calibri"/>
                 <w:b w:val="0"/>
                 <w:i w:val="0"/>
-                <w:color w:val="AAAAAA"/>
+                <w:color w:val="A5A5A5"/>
                 <w:sz w:val="15"/>
               </w:rPr>
               <w:t>______________________________________</w:t>
@@ -3125,14 +2941,14 @@
           </w:p>
           <w:p>
             <w:pPr>
-              <w:spacing w:before="20" w:after="60"/>
+              <w:spacing w:before="20" w:after="80"/>
             </w:pPr>
             <w:r>
               <w:rPr>
                 <w:rFonts w:ascii="Calibri" w:hAnsi="Calibri"/>
                 <w:b/>
                 <w:i w:val="0"/>
-                <w:color w:val="505050"/>
+                <w:color w:val="555555"/>
                 <w:sz w:val="15"/>
               </w:rPr>
               <w:t xml:space="preserve">Grade &amp; Section: </w:t>
@@ -3142,17 +2958,17 @@
                 <w:rFonts w:ascii="Calibri" w:hAnsi="Calibri"/>
                 <w:b w:val="0"/>
                 <w:i w:val="0"/>
-                <w:color w:val="AAAAAA"/>
+                <w:color w:val="A5A5A5"/>
                 <w:sz w:val="15"/>
               </w:rPr>
-              <w:t xml:space="preserve">_____________  </w:t>
+              <w:t xml:space="preserve">_____________   </w:t>
             </w:r>
             <w:r>
               <w:rPr>
                 <w:rFonts w:ascii="Calibri" w:hAnsi="Calibri"/>
                 <w:b/>
                 <w:i w:val="0"/>
-                <w:color w:val="505050"/>
+                <w:color w:val="555555"/>
                 <w:sz w:val="15"/>
               </w:rPr>
               <w:t xml:space="preserve">Date: </w:t>
@@ -3162,7 +2978,7 @@
                 <w:rFonts w:ascii="Calibri" w:hAnsi="Calibri"/>
                 <w:b w:val="0"/>
                 <w:i w:val="0"/>
-                <w:color w:val="AAAAAA"/>
+                <w:color w:val="A5A5A5"/>
                 <w:sz w:val="15"/>
               </w:rPr>
               <w:t>___________</w:t>
@@ -3170,45 +2986,46 @@
           </w:p>
           <w:p>
             <w:pPr>
-              <w:spacing w:before="0" w:after="60"/>
-              <w:jc w:val="center"/>
+              <w:spacing w:before="40" w:after="60"/>
+              <w:shd w:val="clear" w:color="auto" w:fill="E7E7E7"/>
+            </w:pPr>
+            <w:r>
+              <w:rPr>
+                <w:rFonts w:ascii="Calibri" w:hAnsi="Calibri"/>
+                <w:b/>
+                <w:i w:val="0"/>
+                <w:color w:val="282828"/>
+                <w:sz w:val="19"/>
+              </w:rPr>
+              <w:t xml:space="preserve"> PART D:  </w:t>
+            </w:r>
+            <w:r>
+              <w:rPr>
+                <w:rFonts w:ascii="Calibri" w:hAnsi="Calibri"/>
+                <w:b/>
+                <w:i w:val="0"/>
+                <w:color w:val="282828"/>
+                <w:sz w:val="19"/>
+              </w:rPr>
+              <w:t xml:space="preserve">Deriving Kinematic Equation 3 </w:t>
+            </w:r>
+          </w:p>
+          <w:p>
+            <w:pPr>
+              <w:spacing w:before="0" w:after="120"/>
+              <w:pBdr>
+                <w:bottom w:val="single" w:sz="4" w:space="2" w:color="CFCFCF"/>
+              </w:pBdr>
             </w:pPr>
             <w:r>
               <w:rPr>
                 <w:rFonts w:ascii="Calibri" w:hAnsi="Calibri"/>
                 <w:b w:val="0"/>
                 <w:i w:val="0"/>
-                <w:color w:val="BEBEBE"/>
-                <w:sz w:val="12"/>
-              </w:rPr>
-              <w:t>──────────────────────────────────────────</w:t>
-            </w:r>
-          </w:p>
-          <w:p>
-            <w:pPr>
-              <w:spacing w:before="20" w:after="80"/>
-              <w:jc w:val="center"/>
-              <w:shd w:val="clear" w:color="auto" w:fill="F0F0F0"/>
-            </w:pPr>
-            <w:r>
-              <w:rPr>
-                <w:rFonts w:ascii="Calibri" w:hAnsi="Calibri"/>
-                <w:b/>
-                <w:i w:val="0"/>
-                <w:color w:val="646464"/>
+                <w:color w:val="555555"/>
                 <w:sz w:val="15"/>
               </w:rPr>
-              <w:t xml:space="preserve"> GOAL:  </w:t>
-            </w:r>
-            <w:r>
-              <w:rPr>
-                <w:rFonts w:ascii="Calibri" w:hAnsi="Calibri"/>
-                <w:b w:val="0"/>
-                <w:i w:val="0"/>
-                <w:color w:val="646464"/>
-                <w:sz w:val="15"/>
-              </w:rPr>
-              <w:t xml:space="preserve">Derive  </w:t>
+              <w:t xml:space="preserve">Goal: Derive  </w:t>
             </w:r>
             <w:r>
               <w:rPr>
@@ -3220,19 +3037,10 @@
               </w:rPr>
               <w:t>v² = v₀² + 2a(x − x₀)</w:t>
             </w:r>
-            <w:r>
-              <w:rPr>
-                <w:rFonts w:ascii="Calibri" w:hAnsi="Calibri"/>
-                <w:b w:val="0"/>
-                <w:i w:val="0"/>
-                <w:sz w:val="15"/>
-              </w:rPr>
-              <w:t xml:space="preserve"> </w:t>
-            </w:r>
           </w:p>
           <w:p>
             <w:pPr>
-              <w:spacing w:before="40" w:after="20"/>
+              <w:spacing w:before="60" w:after="40"/>
             </w:pPr>
             <w:r>
               <w:rPr>
@@ -3242,7 +3050,7 @@
                 <w:color w:val="3C3C3C"/>
                 <w:sz w:val="15"/>
               </w:rPr>
-              <w:t xml:space="preserve">1. </w:t>
+              <w:t xml:space="preserve">1.  </w:t>
             </w:r>
             <w:r>
               <w:rPr>
@@ -3257,7 +3065,7 @@
           </w:p>
           <w:p>
             <w:pPr>
-              <w:spacing w:before="20" w:after="40"/>
+              <w:spacing w:before="40" w:after="583"/>
             </w:pPr>
             <w:r>
               <w:rPr>
@@ -3266,22 +3074,22 @@
                 <w:i w:val="0"/>
                 <w:sz w:val="18"/>
               </w:rPr>
-              <w:t xml:space="preserve">    </w:t>
+              <w:t xml:space="preserve">      </w:t>
             </w:r>
             <w:r>
               <w:rPr>
                 <w:rFonts w:ascii="Calibri" w:hAnsi="Calibri"/>
                 <w:b/>
                 <w:i/>
-                <w:color w:val="C80000"/>
-                <w:sz w:val="17"/>
+                <w:color w:val="BE0000"/>
+                <w:sz w:val="18"/>
               </w:rPr>
               <w:t>v − v₀ = at</w:t>
             </w:r>
           </w:p>
           <w:p>
             <w:pPr>
-              <w:spacing w:before="40" w:after="20"/>
+              <w:spacing w:before="60" w:after="40"/>
             </w:pPr>
             <w:r>
               <w:rPr>
@@ -3291,7 +3099,7 @@
                 <w:color w:val="3C3C3C"/>
                 <w:sz w:val="15"/>
               </w:rPr>
-              <w:t xml:space="preserve">2. </w:t>
+              <w:t xml:space="preserve">2.  </w:t>
             </w:r>
             <w:r>
               <w:rPr>
@@ -3306,7 +3114,7 @@
           </w:p>
           <w:p>
             <w:pPr>
-              <w:spacing w:before="20" w:after="40"/>
+              <w:spacing w:before="40" w:after="583"/>
             </w:pPr>
             <w:r>
               <w:rPr>
@@ -3315,22 +3123,22 @@
                 <w:i w:val="0"/>
                 <w:sz w:val="18"/>
               </w:rPr>
-              <w:t xml:space="preserve">    </w:t>
+              <w:t xml:space="preserve">      </w:t>
             </w:r>
             <w:r>
               <w:rPr>
                 <w:rFonts w:ascii="Calibri" w:hAnsi="Calibri"/>
                 <w:b/>
                 <w:i/>
-                <w:color w:val="C80000"/>
-                <w:sz w:val="17"/>
+                <w:color w:val="BE0000"/>
+                <w:sz w:val="18"/>
               </w:rPr>
               <w:t>t = (v − v₀) / a</w:t>
             </w:r>
           </w:p>
           <w:p>
             <w:pPr>
-              <w:spacing w:before="40" w:after="20"/>
+              <w:spacing w:before="60" w:after="40"/>
             </w:pPr>
             <w:r>
               <w:rPr>
@@ -3340,7 +3148,7 @@
                 <w:color w:val="3C3C3C"/>
                 <w:sz w:val="15"/>
               </w:rPr>
-              <w:t xml:space="preserve">3. </w:t>
+              <w:t xml:space="preserve">3.  </w:t>
             </w:r>
             <w:r>
               <w:rPr>
@@ -3355,7 +3163,7 @@
           </w:p>
           <w:p>
             <w:pPr>
-              <w:spacing w:before="20" w:after="40"/>
+              <w:spacing w:before="40" w:after="583"/>
             </w:pPr>
             <w:r>
               <w:rPr>
@@ -3364,22 +3172,22 @@
                 <w:i w:val="0"/>
                 <w:sz w:val="18"/>
               </w:rPr>
-              <w:t xml:space="preserve">    </w:t>
+              <w:t xml:space="preserve">      </w:t>
             </w:r>
             <w:r>
               <w:rPr>
                 <w:rFonts w:ascii="Calibri" w:hAnsi="Calibri"/>
                 <w:b/>
                 <w:i/>
-                <w:color w:val="C80000"/>
-                <w:sz w:val="17"/>
+                <w:color w:val="BE0000"/>
+                <w:sz w:val="18"/>
               </w:rPr>
               <w:t>x − x₀ = ½(v₀ + v)·t</w:t>
             </w:r>
           </w:p>
           <w:p>
             <w:pPr>
-              <w:spacing w:before="40" w:after="20"/>
+              <w:spacing w:before="60" w:after="40"/>
             </w:pPr>
             <w:r>
               <w:rPr>
@@ -3389,7 +3197,7 @@
                 <w:color w:val="3C3C3C"/>
                 <w:sz w:val="15"/>
               </w:rPr>
-              <w:t xml:space="preserve">4. </w:t>
+              <w:t xml:space="preserve">4.  </w:t>
             </w:r>
             <w:r>
               <w:rPr>
@@ -3404,7 +3212,7 @@
           </w:p>
           <w:p>
             <w:pPr>
-              <w:spacing w:before="20" w:after="40"/>
+              <w:spacing w:before="40" w:after="583"/>
             </w:pPr>
             <w:r>
               <w:rPr>
@@ -3413,22 +3221,22 @@
                 <w:i w:val="0"/>
                 <w:sz w:val="18"/>
               </w:rPr>
-              <w:t xml:space="preserve">    </w:t>
+              <w:t xml:space="preserve">      </w:t>
             </w:r>
             <w:r>
               <w:rPr>
                 <w:rFonts w:ascii="Calibri" w:hAnsi="Calibri"/>
                 <w:b/>
                 <w:i/>
-                <w:color w:val="C80000"/>
-                <w:sz w:val="17"/>
+                <w:color w:val="BE0000"/>
+                <w:sz w:val="18"/>
               </w:rPr>
               <w:t>x − x₀ = ½(v₀ + v)(v − v₀) / a</w:t>
             </w:r>
           </w:p>
           <w:p>
             <w:pPr>
-              <w:spacing w:before="40" w:after="20"/>
+              <w:spacing w:before="60" w:after="40"/>
             </w:pPr>
             <w:r>
               <w:rPr>
@@ -3438,7 +3246,7 @@
                 <w:color w:val="3C3C3C"/>
                 <w:sz w:val="15"/>
               </w:rPr>
-              <w:t xml:space="preserve">5. </w:t>
+              <w:t xml:space="preserve">5.  </w:t>
             </w:r>
             <w:r>
               <w:rPr>
@@ -3453,7 +3261,7 @@
           </w:p>
           <w:p>
             <w:pPr>
-              <w:spacing w:before="20" w:after="40"/>
+              <w:spacing w:before="40" w:after="583"/>
             </w:pPr>
             <w:r>
               <w:rPr>
@@ -3462,22 +3270,22 @@
                 <w:i w:val="0"/>
                 <w:sz w:val="18"/>
               </w:rPr>
-              <w:t xml:space="preserve">    </w:t>
+              <w:t xml:space="preserve">      </w:t>
             </w:r>
             <w:r>
               <w:rPr>
                 <w:rFonts w:ascii="Calibri" w:hAnsi="Calibri"/>
                 <w:b/>
                 <w:i/>
-                <w:color w:val="C80000"/>
-                <w:sz w:val="17"/>
+                <w:color w:val="BE0000"/>
+                <w:sz w:val="18"/>
               </w:rPr>
               <w:t>x − x₀ = (v² − v₀²) / 2a</w:t>
             </w:r>
           </w:p>
           <w:p>
             <w:pPr>
-              <w:spacing w:before="40" w:after="20"/>
+              <w:spacing w:before="60" w:after="40"/>
             </w:pPr>
             <w:r>
               <w:rPr>
@@ -3487,7 +3295,7 @@
                 <w:color w:val="3C3C3C"/>
                 <w:sz w:val="15"/>
               </w:rPr>
-              <w:t xml:space="preserve">6. </w:t>
+              <w:t xml:space="preserve">6.  </w:t>
             </w:r>
             <w:r>
               <w:rPr>
@@ -3502,7 +3310,7 @@
           </w:p>
           <w:p>
             <w:pPr>
-              <w:spacing w:before="20" w:after="40"/>
+              <w:spacing w:before="40" w:after="583"/>
             </w:pPr>
             <w:r>
               <w:rPr>
@@ -3511,22 +3319,22 @@
                 <w:i w:val="0"/>
                 <w:sz w:val="18"/>
               </w:rPr>
-              <w:t xml:space="preserve">    </w:t>
+              <w:t xml:space="preserve">      </w:t>
             </w:r>
             <w:r>
               <w:rPr>
                 <w:rFonts w:ascii="Calibri" w:hAnsi="Calibri"/>
                 <w:b/>
                 <w:i/>
-                <w:color w:val="C80000"/>
-                <w:sz w:val="17"/>
+                <w:color w:val="BE0000"/>
+                <w:sz w:val="18"/>
               </w:rPr>
               <w:t>2a(x − x₀) = v² − v₀²</w:t>
             </w:r>
           </w:p>
           <w:p>
             <w:pPr>
-              <w:spacing w:before="40" w:after="20"/>
+              <w:spacing w:before="60" w:after="40"/>
             </w:pPr>
             <w:r>
               <w:rPr>
@@ -3536,7 +3344,7 @@
                 <w:color w:val="3C3C3C"/>
                 <w:sz w:val="15"/>
               </w:rPr>
-              <w:t xml:space="preserve">7. </w:t>
+              <w:t xml:space="preserve">7.  </w:t>
             </w:r>
             <w:r>
               <w:rPr>
@@ -3551,7 +3359,7 @@
           </w:p>
           <w:p>
             <w:pPr>
-              <w:spacing w:before="20" w:after="40"/>
+              <w:spacing w:before="40" w:after="583"/>
             </w:pPr>
             <w:r>
               <w:rPr>
@@ -3560,15 +3368,15 @@
                 <w:i w:val="0"/>
                 <w:sz w:val="18"/>
               </w:rPr>
-              <w:t xml:space="preserve">    </w:t>
+              <w:t xml:space="preserve">      </w:t>
             </w:r>
             <w:r>
               <w:rPr>
                 <w:rFonts w:ascii="Calibri" w:hAnsi="Calibri"/>
                 <w:b/>
                 <w:i/>
-                <w:color w:val="C80000"/>
-                <w:sz w:val="17"/>
+                <w:color w:val="BE0000"/>
+                <w:sz w:val="18"/>
               </w:rPr>
               <w:t>v² = v₀² + 2a(x − x₀)</w:t>
             </w:r>

</xml_diff>